<commit_message>
Integrazione indice ed aggiunta punti relazione
</commit_message>
<xml_diff>
--- a/Documenti/Relazione Finale/relazione finale (nuova).docx
+++ b/Documenti/Relazione Finale/relazione finale (nuova).docx
@@ -9,113 +9,800 @@
           <w:szCs w:val="36"/>
         </w:rPr>
       </w:pPr>
-      <w:proofErr w:type="spellStart"/>
       <w:r>
         <w:rPr>
           <w:sz w:val="36"/>
           <w:szCs w:val="36"/>
         </w:rPr>
-        <w:t>Crikle</w:t>
-      </w:r>
-      <w:proofErr w:type="spellEnd"/>
-      <w:r>
+        <w:t>RELAZIONE CRIKLE</w:t>
+      </w:r>
+    </w:p>
+    <w:p>
+      <w:pPr>
+        <w:jc w:val="both"/>
         <w:rPr>
           <w:sz w:val="36"/>
           <w:szCs w:val="36"/>
         </w:rPr>
-        <w:t xml:space="preserve"> (o </w:t>
-      </w:r>
-      <w:proofErr w:type="spellStart"/>
+      </w:pPr>
       <w:r>
         <w:rPr>
           <w:sz w:val="36"/>
           <w:szCs w:val="36"/>
         </w:rPr>
-        <w:t>Apppet</w:t>
+        <w:t>Introduzione</w:t>
+      </w:r>
+    </w:p>
+    <w:p>
+      <w:pPr>
+        <w:rPr>
+          <w:sz w:val="28"/>
+          <w:szCs w:val="28"/>
+        </w:rPr>
+      </w:pPr>
+      <w:r>
+        <w:rPr>
+          <w:sz w:val="28"/>
+          <w:szCs w:val="28"/>
+        </w:rPr>
+        <w:t xml:space="preserve">Durante il corso IFTS </w:t>
+      </w:r>
+      <w:r>
+        <w:rPr>
+          <w:sz w:val="28"/>
+          <w:szCs w:val="28"/>
+        </w:rPr>
+        <w:t>developer abbiamo imparato ad utilizzare</w:t>
+      </w:r>
+      <w:r>
+        <w:rPr>
+          <w:sz w:val="28"/>
+          <w:szCs w:val="28"/>
+        </w:rPr>
+        <w:t xml:space="preserve"> vari linguaggi di programmazione con funzioni e obiettivi</w:t>
+      </w:r>
+      <w:r>
+        <w:rPr>
+          <w:sz w:val="28"/>
+          <w:szCs w:val="28"/>
+        </w:rPr>
+        <w:t xml:space="preserve"> differenti. Partendo dal modulo di Database (utilizzo di MySQL e architettura del programma) abbiamo imparato i fondamentali delle strutture dei Database moderni con utilizzo di comandi d’esecuzione di query </w:t>
+      </w:r>
+      <w:r>
+        <w:rPr>
+          <w:sz w:val="28"/>
+          <w:szCs w:val="28"/>
+        </w:rPr>
+        <w:t xml:space="preserve">e rispettiva </w:t>
+      </w:r>
+      <w:r>
+        <w:rPr>
+          <w:sz w:val="28"/>
+          <w:szCs w:val="28"/>
+        </w:rPr>
+        <w:t>generazione/modifica</w:t>
+      </w:r>
+      <w:r>
+        <w:rPr>
+          <w:sz w:val="28"/>
+          <w:szCs w:val="28"/>
+        </w:rPr>
+        <w:t xml:space="preserve"> di </w:t>
+      </w:r>
+      <w:r>
+        <w:rPr>
+          <w:sz w:val="28"/>
+          <w:szCs w:val="28"/>
+        </w:rPr>
+        <w:t>ta</w:t>
+      </w:r>
+      <w:r>
+        <w:rPr>
+          <w:sz w:val="28"/>
+          <w:szCs w:val="28"/>
+        </w:rPr>
+        <w:t>belle. Inoltre, l’utilizzo di attributi come Foreign Key ed ID ha facilitato la parte di comunicazione tra applicazione e Database.</w:t>
+      </w:r>
+    </w:p>
+    <w:p>
+      <w:pPr>
+        <w:rPr>
+          <w:sz w:val="28"/>
+          <w:szCs w:val="28"/>
+        </w:rPr>
+      </w:pPr>
+      <w:r>
+        <w:rPr>
+          <w:sz w:val="28"/>
+          <w:szCs w:val="28"/>
+        </w:rPr>
+        <w:t xml:space="preserve">Il modulo di Java è stato altrettanto fondamentale per la definizione dei concetti come programmazione OOP (Object </w:t>
+      </w:r>
+      <w:proofErr w:type="spellStart"/>
+      <w:r>
+        <w:rPr>
+          <w:sz w:val="28"/>
+          <w:szCs w:val="28"/>
+        </w:rPr>
+        <w:t>Oriented</w:t>
       </w:r>
       <w:proofErr w:type="spellEnd"/>
       <w:r>
+        <w:rPr>
+          <w:sz w:val="28"/>
+          <w:szCs w:val="28"/>
+        </w:rPr>
+        <w:t xml:space="preserve"> Programming), differenti tecniche ed algoritmi di ordinamento</w:t>
+      </w:r>
+      <w:r>
+        <w:rPr>
+          <w:sz w:val="28"/>
+          <w:szCs w:val="28"/>
+        </w:rPr>
+        <w:t xml:space="preserve"> </w:t>
+      </w:r>
+      <w:r>
+        <w:rPr>
+          <w:sz w:val="28"/>
+          <w:szCs w:val="28"/>
+        </w:rPr>
+        <w:t>e</w:t>
+      </w:r>
+      <w:r>
+        <w:rPr>
+          <w:sz w:val="28"/>
+          <w:szCs w:val="28"/>
+        </w:rPr>
+        <w:t xml:space="preserve"> conseguente </w:t>
+      </w:r>
+      <w:r>
+        <w:rPr>
+          <w:sz w:val="28"/>
+          <w:szCs w:val="28"/>
+        </w:rPr>
+        <w:t>relazion</w:t>
+      </w:r>
+      <w:r>
+        <w:rPr>
+          <w:sz w:val="28"/>
+          <w:szCs w:val="28"/>
+        </w:rPr>
+        <w:t xml:space="preserve">i </w:t>
+      </w:r>
+      <w:r>
+        <w:rPr>
+          <w:sz w:val="28"/>
+          <w:szCs w:val="28"/>
+        </w:rPr>
+        <w:t>tra i vari oggetti.</w:t>
+      </w:r>
+    </w:p>
+    <w:p>
+      <w:pPr>
+        <w:rPr>
+          <w:sz w:val="28"/>
+          <w:szCs w:val="28"/>
+        </w:rPr>
+      </w:pPr>
+      <w:r>
+        <w:rPr>
+          <w:sz w:val="28"/>
+          <w:szCs w:val="28"/>
+        </w:rPr>
+        <w:t xml:space="preserve">Attraverso il modulo di Android abbiamo esplorato le architetture del sistema e le logiche all’interno dello sviluppo di </w:t>
+      </w:r>
+      <w:proofErr w:type="gramStart"/>
+      <w:r>
+        <w:rPr>
+          <w:sz w:val="28"/>
+          <w:szCs w:val="28"/>
+        </w:rPr>
+        <w:t>un app</w:t>
+      </w:r>
+      <w:proofErr w:type="gramEnd"/>
+      <w:r>
+        <w:rPr>
+          <w:sz w:val="28"/>
+          <w:szCs w:val="28"/>
+        </w:rPr>
+        <w:t>, creazione dei componenti di layout (parte grafica) ed utilizzo di Java per creare le varie classi modello con i rispettivi attributi</w:t>
+      </w:r>
+      <w:r>
+        <w:rPr>
+          <w:sz w:val="28"/>
+          <w:szCs w:val="28"/>
+        </w:rPr>
+        <w:t xml:space="preserve"> ed interazioni.</w:t>
+      </w:r>
+    </w:p>
+    <w:p>
+      <w:pPr>
+        <w:rPr>
+          <w:sz w:val="28"/>
+          <w:szCs w:val="28"/>
+        </w:rPr>
+      </w:pPr>
+      <w:r>
+        <w:rPr>
+          <w:sz w:val="28"/>
+          <w:szCs w:val="28"/>
+        </w:rPr>
+        <w:t xml:space="preserve">Il modulo di Backend (utilizzo di Flask e strumenti come </w:t>
+      </w:r>
+      <w:r>
+        <w:rPr>
+          <w:sz w:val="28"/>
+          <w:szCs w:val="28"/>
+        </w:rPr>
+        <w:t>Retrofit ed</w:t>
+      </w:r>
+      <w:r>
+        <w:rPr>
+          <w:sz w:val="28"/>
+          <w:szCs w:val="28"/>
+        </w:rPr>
+        <w:t xml:space="preserve"> API REST) ha dettato gli standard di gestione del flusso di dati e la comunicazione tra Server e Client</w:t>
+      </w:r>
+      <w:r>
+        <w:rPr>
+          <w:sz w:val="28"/>
+          <w:szCs w:val="28"/>
+        </w:rPr>
+        <w:t>.</w:t>
+      </w:r>
+    </w:p>
+    <w:p>
+      <w:pPr>
+        <w:rPr>
+          <w:sz w:val="28"/>
+          <w:szCs w:val="28"/>
+        </w:rPr>
+      </w:pPr>
+      <w:r>
+        <w:rPr>
+          <w:sz w:val="28"/>
+          <w:szCs w:val="28"/>
+        </w:rPr>
+        <w:t>L</w:t>
+      </w:r>
+      <w:r>
+        <w:rPr>
+          <w:sz w:val="28"/>
+          <w:szCs w:val="28"/>
+        </w:rPr>
+        <w:t>a classe è stata</w:t>
+      </w:r>
+      <w:r>
+        <w:rPr>
+          <w:sz w:val="28"/>
+          <w:szCs w:val="28"/>
+        </w:rPr>
+        <w:t xml:space="preserve"> successivamente</w:t>
+      </w:r>
+      <w:r>
+        <w:rPr>
+          <w:sz w:val="28"/>
+          <w:szCs w:val="28"/>
+        </w:rPr>
+        <w:t xml:space="preserve"> divisa in gruppi per poter </w:t>
+      </w:r>
+      <w:r>
+        <w:rPr>
+          <w:sz w:val="28"/>
+          <w:szCs w:val="28"/>
+        </w:rPr>
+        <w:t>sfruttare</w:t>
+      </w:r>
+      <w:r>
+        <w:rPr>
+          <w:sz w:val="28"/>
+          <w:szCs w:val="28"/>
+        </w:rPr>
+        <w:t xml:space="preserve"> le conoscenze acquisite </w:t>
+      </w:r>
+      <w:r>
+        <w:rPr>
+          <w:sz w:val="28"/>
+          <w:szCs w:val="28"/>
+        </w:rPr>
+        <w:t>con il fine di</w:t>
+      </w:r>
+      <w:r>
+        <w:rPr>
+          <w:sz w:val="28"/>
+          <w:szCs w:val="28"/>
+        </w:rPr>
+        <w:t xml:space="preserve"> creare </w:t>
+      </w:r>
+      <w:r>
+        <w:rPr>
+          <w:sz w:val="28"/>
+          <w:szCs w:val="28"/>
+        </w:rPr>
+        <w:t xml:space="preserve">un’applicazione collegata </w:t>
+      </w:r>
+      <w:r>
+        <w:rPr>
+          <w:sz w:val="28"/>
+          <w:szCs w:val="28"/>
+        </w:rPr>
+        <w:t>a</w:t>
+      </w:r>
+      <w:r>
+        <w:rPr>
+          <w:sz w:val="28"/>
+          <w:szCs w:val="28"/>
+        </w:rPr>
+        <w:t>d</w:t>
+      </w:r>
+      <w:r>
+        <w:rPr>
+          <w:sz w:val="28"/>
+          <w:szCs w:val="28"/>
+        </w:rPr>
+        <w:t xml:space="preserve"> un database</w:t>
+      </w:r>
+      <w:r>
+        <w:rPr>
+          <w:sz w:val="28"/>
+          <w:szCs w:val="28"/>
+        </w:rPr>
+        <w:t xml:space="preserve"> con rispettivi servizi web</w:t>
+      </w:r>
+      <w:r>
+        <w:rPr>
+          <w:sz w:val="28"/>
+          <w:szCs w:val="28"/>
+        </w:rPr>
+        <w:t xml:space="preserve">. Il gruppo che ha creato l’applicazione </w:t>
+      </w:r>
+      <w:r>
+        <w:rPr>
+          <w:color w:val="FF0000"/>
+          <w:sz w:val="28"/>
+          <w:szCs w:val="28"/>
+        </w:rPr>
+        <w:t xml:space="preserve">Crikle </w:t>
+      </w:r>
+      <w:r>
+        <w:rPr>
+          <w:sz w:val="28"/>
+          <w:szCs w:val="28"/>
+        </w:rPr>
+        <w:t>è formato da G</w:t>
+      </w:r>
+      <w:r>
+        <w:rPr>
+          <w:sz w:val="28"/>
+          <w:szCs w:val="28"/>
+        </w:rPr>
+        <w:t>abriele</w:t>
+      </w:r>
+      <w:r>
+        <w:rPr>
+          <w:sz w:val="28"/>
+          <w:szCs w:val="28"/>
+        </w:rPr>
+        <w:t xml:space="preserve"> Tomasso, F</w:t>
+      </w:r>
+      <w:r>
+        <w:rPr>
+          <w:sz w:val="28"/>
+          <w:szCs w:val="28"/>
+        </w:rPr>
+        <w:t>ederica</w:t>
+      </w:r>
+      <w:r>
+        <w:rPr>
+          <w:sz w:val="28"/>
+          <w:szCs w:val="28"/>
+        </w:rPr>
+        <w:t xml:space="preserve"> Panceri, L</w:t>
+      </w:r>
+      <w:r>
+        <w:rPr>
+          <w:sz w:val="28"/>
+          <w:szCs w:val="28"/>
+        </w:rPr>
+        <w:t>uca</w:t>
+      </w:r>
+      <w:r>
+        <w:rPr>
+          <w:sz w:val="28"/>
+          <w:szCs w:val="28"/>
+        </w:rPr>
+        <w:t xml:space="preserve"> Albertario e L</w:t>
+      </w:r>
+      <w:r>
+        <w:rPr>
+          <w:sz w:val="28"/>
+          <w:szCs w:val="28"/>
+        </w:rPr>
+        <w:t>uca</w:t>
+      </w:r>
+      <w:r>
+        <w:rPr>
+          <w:sz w:val="28"/>
+          <w:szCs w:val="28"/>
+        </w:rPr>
+        <w:t xml:space="preserve"> Gabello.</w:t>
+      </w:r>
+    </w:p>
+    <w:p>
+      <w:pPr>
+        <w:jc w:val="both"/>
+      </w:pPr>
+    </w:p>
+    <w:p>
+      <w:pPr>
+        <w:jc w:val="both"/>
+      </w:pPr>
+    </w:p>
+    <w:p>
+      <w:pPr>
+        <w:jc w:val="both"/>
         <w:rPr>
           <w:sz w:val="36"/>
           <w:szCs w:val="36"/>
         </w:rPr>
-        <w:t>)</w:t>
-      </w:r>
-    </w:p>
-    <w:p>
-      <w:pPr>
-        <w:jc w:val="both"/>
+      </w:pPr>
+      <w:r>
         <w:rPr>
           <w:sz w:val="36"/>
           <w:szCs w:val="36"/>
         </w:rPr>
-      </w:pPr>
+        <w:t>S</w:t>
+      </w:r>
       <w:r>
         <w:rPr>
           <w:sz w:val="36"/>
           <w:szCs w:val="36"/>
         </w:rPr>
-        <w:t>Introduzione</w:t>
+        <w:t>copo e motivazioni</w:t>
       </w:r>
     </w:p>
     <w:p>
       <w:pPr>
         <w:jc w:val="both"/>
-      </w:pPr>
-      <w:r>
-        <w:t>Durante il corso IFTS developer ci sono stati insegnati vari linguaggi di programmazione con varie funzioni e obiettivi</w:t>
-      </w:r>
-      <w:r>
-        <w:t xml:space="preserve">, la classe è stata poi divisa in gruppi per poter usare le conoscenze acquisite per creare </w:t>
+        <w:rPr>
+          <w:sz w:val="28"/>
+          <w:szCs w:val="28"/>
+        </w:rPr>
+      </w:pPr>
+      <w:r>
+        <w:rPr>
+          <w:sz w:val="28"/>
+          <w:szCs w:val="28"/>
+        </w:rPr>
+        <w:t xml:space="preserve">La principale richiesta </w:t>
+      </w:r>
+      <w:r>
+        <w:rPr>
+          <w:sz w:val="28"/>
+          <w:szCs w:val="28"/>
+        </w:rPr>
+        <w:t xml:space="preserve">per il modulo di Project Work </w:t>
+      </w:r>
+      <w:r>
+        <w:rPr>
+          <w:sz w:val="28"/>
+          <w:szCs w:val="28"/>
+        </w:rPr>
+        <w:t xml:space="preserve">è stata di pensare all’idea di </w:t>
       </w:r>
       <w:proofErr w:type="gramStart"/>
       <w:r>
-        <w:t>un’ app</w:t>
+        <w:rPr>
+          <w:sz w:val="28"/>
+          <w:szCs w:val="28"/>
+        </w:rPr>
+        <w:t>un app</w:t>
       </w:r>
       <w:proofErr w:type="gramEnd"/>
       <w:r>
-        <w:t xml:space="preserve"> e un sito collegati a un database. Il gruppo che ha creato l’applicazione </w:t>
-      </w:r>
-      <w:proofErr w:type="spellStart"/>
-      <w:r>
+        <w:rPr>
+          <w:sz w:val="28"/>
+          <w:szCs w:val="28"/>
+        </w:rPr>
+        <w:t xml:space="preserve"> </w:t>
+      </w:r>
+      <w:r>
+        <w:rPr>
+          <w:sz w:val="28"/>
+          <w:szCs w:val="28"/>
+        </w:rPr>
+        <w:t>(e</w:t>
+      </w:r>
+      <w:r>
+        <w:rPr>
+          <w:sz w:val="28"/>
+          <w:szCs w:val="28"/>
+        </w:rPr>
+        <w:t xml:space="preserve"> della conseguente tematica) </w:t>
+      </w:r>
+      <w:r>
+        <w:rPr>
+          <w:sz w:val="28"/>
+          <w:szCs w:val="28"/>
+        </w:rPr>
+        <w:t>come possibile progetto su cui lavorare in diversi gruppi tra colleghi per prepara</w:t>
+      </w:r>
+      <w:r>
+        <w:rPr>
+          <w:sz w:val="28"/>
+          <w:szCs w:val="28"/>
+        </w:rPr>
+        <w:t>rsi</w:t>
+      </w:r>
+      <w:r>
+        <w:rPr>
+          <w:sz w:val="28"/>
+          <w:szCs w:val="28"/>
+        </w:rPr>
+        <w:t xml:space="preserve"> al</w:t>
+      </w:r>
+      <w:r>
+        <w:rPr>
+          <w:sz w:val="28"/>
+          <w:szCs w:val="28"/>
+        </w:rPr>
+        <w:t xml:space="preserve"> progetto formativo</w:t>
+      </w:r>
+      <w:r>
+        <w:rPr>
+          <w:sz w:val="28"/>
+          <w:szCs w:val="28"/>
+        </w:rPr>
+        <w:t xml:space="preserve"> in stage ed avere </w:t>
+      </w:r>
+      <w:r>
+        <w:rPr>
+          <w:sz w:val="28"/>
+          <w:szCs w:val="28"/>
+        </w:rPr>
+        <w:lastRenderedPageBreak/>
+        <w:t>modo di “sondare terreno” nel</w:t>
+      </w:r>
+      <w:r>
+        <w:rPr>
+          <w:sz w:val="28"/>
+          <w:szCs w:val="28"/>
+        </w:rPr>
+        <w:t xml:space="preserve"> vasto campo della programmazione di applicazioni Android. </w:t>
+      </w:r>
+    </w:p>
+    <w:p>
+      <w:pPr>
+        <w:jc w:val="both"/>
+        <w:rPr>
+          <w:sz w:val="28"/>
+          <w:szCs w:val="28"/>
+        </w:rPr>
+      </w:pPr>
+      <w:r>
+        <w:rPr>
+          <w:sz w:val="28"/>
+          <w:szCs w:val="28"/>
+        </w:rPr>
+        <w:t>La versione utilizzata è Android 6.0 (Marshmallow) con API level 23</w:t>
+      </w:r>
+      <w:r>
+        <w:rPr>
+          <w:sz w:val="28"/>
+          <w:szCs w:val="28"/>
+        </w:rPr>
+        <w:t>.</w:t>
+      </w:r>
+    </w:p>
+    <w:p>
+      <w:pPr>
+        <w:jc w:val="both"/>
+        <w:rPr>
+          <w:sz w:val="28"/>
+          <w:szCs w:val="28"/>
+        </w:rPr>
+      </w:pPr>
+      <w:r>
+        <w:rPr>
+          <w:sz w:val="28"/>
+          <w:szCs w:val="28"/>
+        </w:rPr>
+        <w:t>Nel nostro caso, abbiamo avuto modo di lavorare su un’applicazione riguardante gli animali, la gestione degli animali dell’utente e le varie interazioni anche a livello commerciale per creare un potenziale fattore economico dietro all’idea.</w:t>
+      </w:r>
+    </w:p>
+    <w:p>
+      <w:pPr>
+        <w:jc w:val="both"/>
+        <w:rPr>
+          <w:sz w:val="28"/>
+          <w:szCs w:val="28"/>
+        </w:rPr>
+      </w:pPr>
+      <w:r>
+        <w:rPr>
+          <w:sz w:val="28"/>
+          <w:szCs w:val="28"/>
+        </w:rPr>
+        <w:t>Brevemente, l’applicazione avrebbe come obiettivo la possibilità da parte dell’utente di gestire la registrazione di vari animali domestici e delle loro conseguenti caratteristiche (dati come nome, peso, altezza e condizioni cliniche).</w:t>
+      </w:r>
+    </w:p>
+    <w:p>
+      <w:pPr>
+        <w:jc w:val="both"/>
+        <w:rPr>
+          <w:sz w:val="28"/>
+          <w:szCs w:val="28"/>
+        </w:rPr>
+      </w:pPr>
+      <w:r>
+        <w:rPr>
+          <w:sz w:val="28"/>
+          <w:szCs w:val="28"/>
+        </w:rPr>
+        <w:t xml:space="preserve">Inoltre, sarà facilitato anche nella registrazione delle varie attività che l’utente permette all’animale di intraprendere. Le attività in questione saranno i servizi di Toilettatura, addestramento, veterinario e petsitting. </w:t>
+      </w:r>
+    </w:p>
+    <w:p>
+      <w:pPr>
+        <w:jc w:val="both"/>
         <w:rPr>
           <w:color w:val="FF0000"/>
-        </w:rPr>
-        <w:t>Crikle</w:t>
-      </w:r>
-      <w:proofErr w:type="spellEnd"/>
+          <w:sz w:val="28"/>
+          <w:szCs w:val="28"/>
+        </w:rPr>
+      </w:pPr>
+      <w:r>
+        <w:rPr>
+          <w:sz w:val="28"/>
+          <w:szCs w:val="28"/>
+        </w:rPr>
+        <w:t xml:space="preserve">La nostra applicazione mette a disposizione un </w:t>
+      </w:r>
+      <w:r>
+        <w:rPr>
+          <w:sz w:val="28"/>
+          <w:szCs w:val="28"/>
+        </w:rPr>
+        <w:t>“</w:t>
+      </w:r>
+      <w:r>
+        <w:rPr>
+          <w:sz w:val="28"/>
+          <w:szCs w:val="28"/>
+        </w:rPr>
+        <w:t>portale</w:t>
+      </w:r>
+      <w:r>
+        <w:rPr>
+          <w:sz w:val="28"/>
+          <w:szCs w:val="28"/>
+        </w:rPr>
+        <w:t>”</w:t>
+      </w:r>
+      <w:r>
+        <w:rPr>
+          <w:sz w:val="28"/>
+          <w:szCs w:val="28"/>
+        </w:rPr>
+        <w:t xml:space="preserve"> per memorizzare i dati dei propri animali domestici</w:t>
+      </w:r>
+      <w:r>
+        <w:rPr>
+          <w:sz w:val="28"/>
+          <w:szCs w:val="28"/>
+        </w:rPr>
+        <w:t>, i loro bisogni e</w:t>
+      </w:r>
+      <w:r>
+        <w:rPr>
+          <w:sz w:val="28"/>
+          <w:szCs w:val="28"/>
+        </w:rPr>
+        <w:t>d</w:t>
+      </w:r>
+      <w:r>
+        <w:rPr>
+          <w:sz w:val="28"/>
+          <w:szCs w:val="28"/>
+        </w:rPr>
+        <w:t xml:space="preserve"> appuntamenti.</w:t>
+      </w:r>
+      <w:r>
+        <w:rPr>
+          <w:sz w:val="28"/>
+          <w:szCs w:val="28"/>
+        </w:rPr>
+        <w:t xml:space="preserve"> </w:t>
+      </w:r>
+      <w:r>
+        <w:rPr>
+          <w:sz w:val="28"/>
+          <w:szCs w:val="28"/>
+        </w:rPr>
+        <w:t>È inoltre possibile cercare attività</w:t>
+      </w:r>
+      <w:r>
+        <w:rPr>
+          <w:sz w:val="28"/>
+          <w:szCs w:val="28"/>
+        </w:rPr>
+        <w:t xml:space="preserve"> </w:t>
+      </w:r>
+      <w:proofErr w:type="gramStart"/>
+      <w:r>
+        <w:rPr>
+          <w:sz w:val="28"/>
+          <w:szCs w:val="28"/>
+        </w:rPr>
+        <w:t>commerciali</w:t>
+      </w:r>
+      <w:r>
+        <w:rPr>
+          <w:sz w:val="28"/>
+          <w:szCs w:val="28"/>
+        </w:rPr>
+        <w:t xml:space="preserve">  legat</w:t>
+      </w:r>
+      <w:r>
+        <w:rPr>
+          <w:sz w:val="28"/>
+          <w:szCs w:val="28"/>
+        </w:rPr>
+        <w:t>e</w:t>
+      </w:r>
+      <w:proofErr w:type="gramEnd"/>
+      <w:r>
+        <w:rPr>
+          <w:sz w:val="28"/>
+          <w:szCs w:val="28"/>
+        </w:rPr>
+        <w:t xml:space="preserve"> </w:t>
+      </w:r>
+      <w:r>
+        <w:rPr>
+          <w:sz w:val="28"/>
+          <w:szCs w:val="28"/>
+        </w:rPr>
+        <w:t>agli animali da compagnia, consultarne orari, recensioni e fissare appuntamenti.</w:t>
+      </w:r>
+      <w:r>
+        <w:rPr>
+          <w:sz w:val="28"/>
+          <w:szCs w:val="28"/>
+        </w:rPr>
+        <w:t xml:space="preserve"> </w:t>
+      </w:r>
       <w:r>
         <w:rPr>
           <w:color w:val="FF0000"/>
-        </w:rPr>
-        <w:t xml:space="preserve"> o </w:t>
-      </w:r>
-      <w:proofErr w:type="spellStart"/>
+          <w:sz w:val="28"/>
+          <w:szCs w:val="28"/>
+        </w:rPr>
+        <w:t xml:space="preserve">Le funzionalità </w:t>
+      </w:r>
       <w:r>
         <w:rPr>
           <w:color w:val="FF0000"/>
-        </w:rPr>
-        <w:t>apppet</w:t>
-      </w:r>
-      <w:proofErr w:type="spellEnd"/>
+          <w:sz w:val="28"/>
+          <w:szCs w:val="28"/>
+        </w:rPr>
+        <w:t>dell’app</w:t>
+      </w:r>
       <w:r>
         <w:rPr>
           <w:color w:val="FF0000"/>
-        </w:rPr>
-        <w:t xml:space="preserve"> </w:t>
-      </w:r>
-      <w:r>
-        <w:t>è formato da G. Tomasso, F. Panceri, L. Albertario e L. Gabello.</w:t>
+          <w:sz w:val="28"/>
+          <w:szCs w:val="28"/>
+        </w:rPr>
+        <w:t xml:space="preserve"> sono state pensate in base a cosa potrebbe servire a una persona con animali domestici e a come semplificare la loro organizzazione, dato che per primi i membri del gruppo hanno appunto più animali a carico.</w:t>
       </w:r>
     </w:p>
     <w:p>
       <w:pPr>
         <w:jc w:val="both"/>
-      </w:pPr>
-    </w:p>
-    <w:p>
-      <w:pPr>
-        <w:jc w:val="both"/>
+        <w:rPr>
+          <w:color w:val="FF0000"/>
+        </w:rPr>
       </w:pPr>
     </w:p>
     <w:p>
@@ -131,243 +818,185 @@
           <w:sz w:val="36"/>
           <w:szCs w:val="36"/>
         </w:rPr>
-        <w:t>scopo e motivazioni</w:t>
-      </w:r>
-    </w:p>
-    <w:p>
-      <w:pPr>
-        <w:jc w:val="both"/>
-        <w:rPr>
-          <w:color w:val="FF0000"/>
-        </w:rPr>
-      </w:pPr>
-      <w:r>
-        <w:t xml:space="preserve">La nostra applicazione </w:t>
-      </w:r>
-      <w:r>
-        <w:t>ha come</w:t>
-      </w:r>
-      <w:r>
-        <w:t xml:space="preserve"> obiettivo mettere a disposizione un portale per memorizzare i dati dei propri animali domestici</w:t>
-      </w:r>
-      <w:r>
-        <w:t>, i loro bisogni e appuntamenti.</w:t>
-      </w:r>
-      <w:r>
-        <w:t xml:space="preserve"> </w:t>
-      </w:r>
-      <w:r>
-        <w:t>È inoltre possibile cercare attività e servizi legati agli animali da compagnia, consultarne orari, recensioni e fissare appuntamenti.</w:t>
-      </w:r>
-      <w:r>
-        <w:t xml:space="preserve"> </w:t>
-      </w:r>
-      <w:r>
-        <w:rPr>
-          <w:color w:val="FF0000"/>
-        </w:rPr>
-        <w:t xml:space="preserve">Le funzionalità </w:t>
-      </w:r>
-      <w:proofErr w:type="gramStart"/>
-      <w:r>
-        <w:rPr>
-          <w:color w:val="FF0000"/>
-        </w:rPr>
-        <w:t>dell’ app</w:t>
-      </w:r>
-      <w:proofErr w:type="gramEnd"/>
-      <w:r>
-        <w:rPr>
-          <w:color w:val="FF0000"/>
-        </w:rPr>
-        <w:t xml:space="preserve"> sono state pensate in base a cosa potrebbe servire a una persona con animali domestici e a come semplificare la loro organizzazione, dato che per primi i membri del gruppo hanno appunto più animali a carico.</w:t>
-      </w:r>
-    </w:p>
-    <w:p>
-      <w:pPr>
-        <w:jc w:val="both"/>
-        <w:rPr>
-          <w:color w:val="FF0000"/>
-        </w:rPr>
-      </w:pPr>
-    </w:p>
-    <w:p>
-      <w:pPr>
-        <w:jc w:val="both"/>
+        <w:t>Architettura sistema</w:t>
+      </w:r>
+      <w:r>
         <w:rPr>
           <w:sz w:val="36"/>
           <w:szCs w:val="36"/>
         </w:rPr>
-      </w:pPr>
-      <w:r>
+        <w:t xml:space="preserve"> e materiali utilizzati</w:t>
+      </w:r>
+    </w:p>
+    <w:p>
+      <w:pPr>
+        <w:jc w:val="both"/>
+        <w:rPr>
+          <w:color w:val="000000" w:themeColor="text1"/>
+          <w:sz w:val="28"/>
+          <w:szCs w:val="28"/>
+        </w:rPr>
+      </w:pPr>
+      <w:r>
+        <w:rPr>
+          <w:color w:val="000000" w:themeColor="text1"/>
+          <w:sz w:val="28"/>
+          <w:szCs w:val="28"/>
+        </w:rPr>
+        <w:t xml:space="preserve">Nella parte user cliente in app si può avere una lista dei nostri animali, possiamo aggiungere le loro caratteristiche e catalogare il loro stato d’animo </w:t>
+      </w:r>
+      <w:proofErr w:type="gramStart"/>
+      <w:r>
+        <w:rPr>
+          <w:color w:val="000000" w:themeColor="text1"/>
+          <w:sz w:val="28"/>
+          <w:szCs w:val="28"/>
+        </w:rPr>
+        <w:t>e</w:t>
+      </w:r>
+      <w:proofErr w:type="gramEnd"/>
+      <w:r>
+        <w:rPr>
+          <w:color w:val="000000" w:themeColor="text1"/>
+          <w:sz w:val="28"/>
+          <w:szCs w:val="28"/>
+        </w:rPr>
+        <w:t xml:space="preserve"> </w:t>
+      </w:r>
+      <w:r>
+        <w:rPr>
+          <w:color w:val="000000" w:themeColor="text1"/>
+          <w:sz w:val="28"/>
+          <w:szCs w:val="28"/>
+        </w:rPr>
+        <w:t>eventuali</w:t>
+      </w:r>
+      <w:r>
+        <w:rPr>
+          <w:color w:val="000000" w:themeColor="text1"/>
+          <w:sz w:val="28"/>
+          <w:szCs w:val="28"/>
+        </w:rPr>
+        <w:t xml:space="preserve"> cartell</w:t>
+      </w:r>
+      <w:r>
+        <w:rPr>
+          <w:color w:val="000000" w:themeColor="text1"/>
+          <w:sz w:val="28"/>
+          <w:szCs w:val="28"/>
+        </w:rPr>
+        <w:t>e</w:t>
+      </w:r>
+      <w:r>
+        <w:rPr>
+          <w:color w:val="000000" w:themeColor="text1"/>
+          <w:sz w:val="28"/>
+          <w:szCs w:val="28"/>
+        </w:rPr>
+        <w:t xml:space="preserve"> clinic</w:t>
+      </w:r>
+      <w:r>
+        <w:rPr>
+          <w:color w:val="000000" w:themeColor="text1"/>
+          <w:sz w:val="28"/>
+          <w:szCs w:val="28"/>
+        </w:rPr>
+        <w:t>he</w:t>
+      </w:r>
+      <w:r>
+        <w:rPr>
+          <w:color w:val="000000" w:themeColor="text1"/>
+          <w:sz w:val="28"/>
+          <w:szCs w:val="28"/>
+        </w:rPr>
+        <w:t>. Ogni utente ha un calendario dove si possono segnare gli appuntamenti dei propri animali e prenotarne di nuovi, si potranno lasciare recensioni ai servizi usufruiti.</w:t>
+      </w:r>
+    </w:p>
+    <w:p>
+      <w:pPr>
+        <w:jc w:val="both"/>
+        <w:rPr>
+          <w:color w:val="000000" w:themeColor="text1"/>
+          <w:sz w:val="28"/>
+          <w:szCs w:val="28"/>
+        </w:rPr>
+      </w:pPr>
+      <w:r>
+        <w:rPr>
+          <w:color w:val="000000" w:themeColor="text1"/>
+          <w:sz w:val="28"/>
+          <w:szCs w:val="28"/>
+        </w:rPr>
+        <w:t>Da lato web desktop un esercente di servizi creerà un suo profilo e gestirà le proprie attività, inserendo orari, indirizzo, foto e descrizioni. Potranno essere visualizzate le recensioni di ogni attività e si disporrà di un calendario per poter accettare o rifiutare le richieste di appuntamento dei clienti.</w:t>
+      </w:r>
+    </w:p>
+    <w:p>
+      <w:pPr>
+        <w:jc w:val="both"/>
+        <w:rPr>
+          <w:sz w:val="28"/>
+          <w:szCs w:val="28"/>
+        </w:rPr>
+      </w:pPr>
+      <w:r>
+        <w:rPr>
+          <w:sz w:val="28"/>
+          <w:szCs w:val="28"/>
+        </w:rPr>
+        <w:lastRenderedPageBreak/>
+        <w:t>Durante il lavoro a</w:t>
+      </w:r>
+      <w:r>
+        <w:rPr>
+          <w:sz w:val="28"/>
+          <w:szCs w:val="28"/>
+        </w:rPr>
+        <w:t>bbiamo usato “Fork”, un sistema collegato a GitHub per scambiarci file</w:t>
+      </w:r>
+      <w:r>
+        <w:rPr>
+          <w:sz w:val="28"/>
+          <w:szCs w:val="28"/>
+        </w:rPr>
+        <w:t xml:space="preserve"> in una cartella condivisa accessibile a tutti i membri del gruppo.</w:t>
+      </w:r>
+    </w:p>
+    <w:p>
+      <w:pPr>
+        <w:rPr>
+          <w:sz w:val="28"/>
+          <w:szCs w:val="28"/>
+        </w:rPr>
+      </w:pPr>
+    </w:p>
+    <w:p>
+      <w:pPr>
+        <w:rPr>
+          <w:sz w:val="28"/>
+          <w:szCs w:val="28"/>
+        </w:rPr>
+      </w:pPr>
+    </w:p>
+    <w:p>
+      <w:pPr>
         <w:rPr>
           <w:sz w:val="36"/>
           <w:szCs w:val="36"/>
         </w:rPr>
-        <w:t>Architettura sistema</w:t>
-      </w:r>
-      <w:r>
+      </w:pPr>
+    </w:p>
+    <w:p>
+      <w:pPr>
         <w:rPr>
           <w:sz w:val="36"/>
           <w:szCs w:val="36"/>
         </w:rPr>
-        <w:t xml:space="preserve"> e materiali utilizzati</w:t>
-      </w:r>
-    </w:p>
-    <w:p>
-      <w:pPr>
-        <w:jc w:val="both"/>
-        <w:rPr>
-          <w:color w:val="000000" w:themeColor="text1"/>
-        </w:rPr>
-      </w:pPr>
-      <w:r>
-        <w:rPr>
-          <w:color w:val="FF0000"/>
-        </w:rPr>
-        <w:t xml:space="preserve"> </w:t>
-      </w:r>
-      <w:r>
-        <w:rPr>
-          <w:color w:val="000000" w:themeColor="text1"/>
-        </w:rPr>
-        <w:t xml:space="preserve">Nella parte user cliente in app si può avere una lista dei nostri animali, possiamo aggiungere le loro caratteristiche e catalogare il loro stato d’animo </w:t>
-      </w:r>
-      <w:proofErr w:type="gramStart"/>
-      <w:r>
-        <w:rPr>
-          <w:color w:val="000000" w:themeColor="text1"/>
-        </w:rPr>
-        <w:t>e</w:t>
-      </w:r>
-      <w:proofErr w:type="gramEnd"/>
-      <w:r>
-        <w:rPr>
-          <w:color w:val="000000" w:themeColor="text1"/>
-        </w:rPr>
-        <w:t xml:space="preserve"> </w:t>
-      </w:r>
-      <w:r>
-        <w:rPr>
-          <w:color w:val="000000" w:themeColor="text1"/>
-        </w:rPr>
-        <w:t>eventuali</w:t>
-      </w:r>
-      <w:r>
-        <w:rPr>
-          <w:color w:val="000000" w:themeColor="text1"/>
-        </w:rPr>
-        <w:t xml:space="preserve"> cartell</w:t>
-      </w:r>
-      <w:r>
-        <w:rPr>
-          <w:color w:val="000000" w:themeColor="text1"/>
-        </w:rPr>
-        <w:t>e</w:t>
-      </w:r>
-      <w:r>
-        <w:rPr>
-          <w:color w:val="000000" w:themeColor="text1"/>
-        </w:rPr>
-        <w:t xml:space="preserve"> clinic</w:t>
-      </w:r>
-      <w:r>
-        <w:rPr>
-          <w:color w:val="000000" w:themeColor="text1"/>
-        </w:rPr>
-        <w:t>he</w:t>
-      </w:r>
-      <w:r>
-        <w:rPr>
-          <w:color w:val="000000" w:themeColor="text1"/>
-        </w:rPr>
-        <w:t>. Ogni utente ha un calendario dove si possono segnare gli appuntamenti dei propri animali e prenotarne di nuovi, si potranno lasciare recensioni ai servizi usufruiti.</w:t>
-      </w:r>
-    </w:p>
-    <w:p>
-      <w:pPr>
-        <w:jc w:val="both"/>
-        <w:rPr>
-          <w:color w:val="000000" w:themeColor="text1"/>
-        </w:rPr>
-      </w:pPr>
-      <w:r>
-        <w:rPr>
-          <w:color w:val="000000" w:themeColor="text1"/>
-        </w:rPr>
-        <w:t xml:space="preserve">Da lato web </w:t>
-      </w:r>
-      <w:r>
-        <w:rPr>
-          <w:color w:val="000000" w:themeColor="text1"/>
-        </w:rPr>
-        <w:t xml:space="preserve">desktop </w:t>
-      </w:r>
-      <w:r>
-        <w:rPr>
-          <w:color w:val="000000" w:themeColor="text1"/>
-        </w:rPr>
-        <w:t>un esercente di servizi creerà un suo profilo e gestirà le proprie attività, inserendo orari, indirizzo, foto e descrizioni. Potranno essere visualizzate le recensioni di ogni attività e si disporrà di un calendario per poter accettare o rifiutare le richieste di appuntamento dei clienti.</w:t>
-      </w:r>
-    </w:p>
-    <w:p>
-      <w:pPr>
-        <w:jc w:val="both"/>
-      </w:pPr>
-      <w:r>
-        <w:t>Durante il lavoro a</w:t>
-      </w:r>
-      <w:r>
-        <w:t>bbiamo usato “</w:t>
-      </w:r>
-      <w:proofErr w:type="spellStart"/>
-      <w:r>
-        <w:t>Fork</w:t>
-      </w:r>
-      <w:proofErr w:type="spellEnd"/>
-      <w:r>
-        <w:t>”, un sistema collegato a GitHub per scambiarci file</w:t>
-      </w:r>
-      <w:r>
-        <w:t xml:space="preserve"> in una cartella condivisa accessibile a tutti i membri del gruppo.</w:t>
-      </w:r>
-    </w:p>
-    <w:p>
-      <w:pPr>
+      </w:pPr>
+      <w:r>
         <w:rPr>
           <w:sz w:val="36"/>
           <w:szCs w:val="36"/>
         </w:rPr>
-      </w:pPr>
-    </w:p>
-    <w:p>
-      <w:pPr>
-        <w:rPr>
-          <w:sz w:val="36"/>
-          <w:szCs w:val="36"/>
-        </w:rPr>
-      </w:pPr>
-    </w:p>
-    <w:p>
-      <w:pPr>
-        <w:rPr>
-          <w:sz w:val="36"/>
-          <w:szCs w:val="36"/>
-        </w:rPr>
-      </w:pPr>
-    </w:p>
-    <w:p>
-      <w:pPr>
-        <w:rPr>
-          <w:sz w:val="36"/>
-          <w:szCs w:val="36"/>
-        </w:rPr>
-      </w:pPr>
-      <w:r>
-        <w:rPr>
-          <w:sz w:val="36"/>
-          <w:szCs w:val="36"/>
-        </w:rPr>
         <w:t xml:space="preserve">Struttura dei dati e modello ER: </w:t>
       </w:r>
     </w:p>
@@ -375,18 +1004,23 @@
       <w:pPr>
         <w:rPr>
           <w:color w:val="000000" w:themeColor="text1"/>
+          <w:sz w:val="28"/>
+          <w:szCs w:val="28"/>
         </w:rPr>
       </w:pPr>
       <w:r>
         <w:rPr>
           <w:color w:val="000000" w:themeColor="text1"/>
-        </w:rPr>
-        <w:lastRenderedPageBreak/>
+          <w:sz w:val="28"/>
+          <w:szCs w:val="28"/>
+        </w:rPr>
         <w:t xml:space="preserve">le relazioni tra le entità che abbiamo </w:t>
       </w:r>
       <w:r>
         <w:rPr>
           <w:color w:val="000000" w:themeColor="text1"/>
+          <w:sz w:val="28"/>
+          <w:szCs w:val="28"/>
         </w:rPr>
         <w:t>rilevato sono queste:</w:t>
       </w:r>
@@ -506,6 +1140,7 @@
         <w:rPr>
           <w:noProof/>
         </w:rPr>
+        <w:lastRenderedPageBreak/>
         <w:drawing>
           <wp:inline distT="0" distB="0" distL="0" distR="0" wp14:anchorId="36CA88B4" wp14:editId="0131526D">
             <wp:extent cx="6083300" cy="2292350"/>
@@ -548,7 +1183,6 @@
         <w:rPr>
           <w:noProof/>
         </w:rPr>
-        <w:lastRenderedPageBreak/>
         <w:drawing>
           <wp:inline distT="0" distB="0" distL="0" distR="0" wp14:anchorId="5522FF3C" wp14:editId="15CB6184">
             <wp:extent cx="6153150" cy="2749550"/>
@@ -590,6 +1224,7 @@
     <w:p/>
     <w:p>
       <w:r>
+        <w:lastRenderedPageBreak/>
         <w:t>Unendo poi i due schemi otteniamo questi collegamenti:</w:t>
       </w:r>
       <w:r>
@@ -660,60 +1295,83 @@
     <w:p>
       <w:pPr>
         <w:rPr>
-          <w:sz w:val="36"/>
-          <w:szCs w:val="36"/>
-        </w:rPr>
-      </w:pPr>
-      <w:r>
-        <w:rPr>
-          <w:sz w:val="36"/>
-          <w:szCs w:val="36"/>
-        </w:rPr>
-        <w:lastRenderedPageBreak/>
+          <w:sz w:val="28"/>
+          <w:szCs w:val="28"/>
+        </w:rPr>
+      </w:pPr>
+      <w:r>
+        <w:rPr>
+          <w:sz w:val="28"/>
+          <w:szCs w:val="28"/>
+        </w:rPr>
         <w:t>L’app</w:t>
       </w:r>
     </w:p>
     <w:p>
-      <w:r>
+      <w:pPr>
+        <w:rPr>
+          <w:sz w:val="28"/>
+          <w:szCs w:val="28"/>
+        </w:rPr>
+      </w:pPr>
+      <w:r>
+        <w:rPr>
+          <w:sz w:val="28"/>
+          <w:szCs w:val="28"/>
+        </w:rPr>
         <w:t>L’app è stata creata attraverso Android Studio con file xml per la parte grafica e file java per la logica. La versione Android che abbiamo usato è la versione 23 “Marshmallow”.</w:t>
       </w:r>
       <w:r>
+        <w:rPr>
+          <w:sz w:val="28"/>
+          <w:szCs w:val="28"/>
+        </w:rPr>
         <w:t xml:space="preserve"> </w:t>
       </w:r>
       <w:r>
         <w:rPr>
           <w:color w:val="FF0000"/>
+          <w:sz w:val="28"/>
+          <w:szCs w:val="28"/>
         </w:rPr>
         <w:t xml:space="preserve">È composta da 12 activity </w:t>
       </w:r>
       <w:r>
         <w:rPr>
           <w:color w:val="FF0000"/>
-        </w:rPr>
-        <w:t>totali</w:t>
+          <w:sz w:val="28"/>
+          <w:szCs w:val="28"/>
+        </w:rPr>
+        <w:t>totali (o</w:t>
       </w:r>
       <w:r>
         <w:rPr>
           <w:color w:val="FF0000"/>
-        </w:rPr>
-        <w:t xml:space="preserve"> (o</w:t>
+          <w:sz w:val="28"/>
+          <w:szCs w:val="28"/>
+        </w:rPr>
+        <w:t xml:space="preserve"> schermate)</w:t>
       </w:r>
       <w:r>
         <w:rPr>
           <w:color w:val="FF0000"/>
-        </w:rPr>
-        <w:t xml:space="preserve"> schermate)</w:t>
-      </w:r>
-      <w:r>
-        <w:rPr>
-          <w:color w:val="FF0000"/>
+          <w:sz w:val="28"/>
+          <w:szCs w:val="28"/>
         </w:rPr>
         <w:t xml:space="preserve"> </w:t>
       </w:r>
       <w:r>
+        <w:rPr>
+          <w:sz w:val="28"/>
+          <w:szCs w:val="28"/>
+        </w:rPr>
         <w:t>ed è stato usato Retrofit per sfruttare i collegamenti con gli endpoint di Flask</w:t>
       </w:r>
       <w:r>
+        <w:rPr>
+          <w:sz w:val="28"/>
+          <w:szCs w:val="28"/>
+        </w:rPr>
         <w:t xml:space="preserve"> (vedi capitolo successivo) le pagine gestite con java rispettano per la maggior parte quest’ ordine:</w:t>
       </w:r>
     </w:p>
@@ -724,8 +1382,16 @@
           <w:ilvl w:val="0"/>
           <w:numId w:val="2"/>
         </w:numPr>
-      </w:pPr>
-      <w:r>
+        <w:rPr>
+          <w:sz w:val="28"/>
+          <w:szCs w:val="28"/>
+        </w:rPr>
+      </w:pPr>
+      <w:r>
+        <w:rPr>
+          <w:sz w:val="28"/>
+          <w:szCs w:val="28"/>
+        </w:rPr>
         <w:t>collegamento tra la parte Java e gli elementi interattivi della pagina XML dedicata alla grafica (bottoni, caselle di testo…)</w:t>
       </w:r>
     </w:p>
@@ -736,33 +1402,53 @@
           <w:ilvl w:val="0"/>
           <w:numId w:val="2"/>
         </w:numPr>
-      </w:pPr>
-      <w:r>
+        <w:rPr>
+          <w:sz w:val="28"/>
+          <w:szCs w:val="28"/>
+        </w:rPr>
+      </w:pPr>
+      <w:r>
+        <w:rPr>
+          <w:sz w:val="28"/>
+          <w:szCs w:val="28"/>
+        </w:rPr>
         <w:t>logiche di controllo dei dati inseriti dell’utente (</w:t>
       </w:r>
       <w:r>
+        <w:rPr>
+          <w:sz w:val="28"/>
+          <w:szCs w:val="28"/>
+        </w:rPr>
         <w:t>come, ad esempio,</w:t>
       </w:r>
       <w:r>
-        <w:t xml:space="preserve"> aver inserito password </w:t>
+        <w:rPr>
+          <w:sz w:val="28"/>
+          <w:szCs w:val="28"/>
+        </w:rPr>
+        <w:t xml:space="preserve"> aver inserito password e </w:t>
       </w:r>
       <w:proofErr w:type="gramStart"/>
       <w:r>
-        <w:t>e</w:t>
+        <w:rPr>
+          <w:sz w:val="28"/>
+          <w:szCs w:val="28"/>
+        </w:rPr>
+        <w:t>email</w:t>
       </w:r>
       <w:proofErr w:type="gramEnd"/>
       <w:r>
-        <w:t xml:space="preserve"> </w:t>
-      </w:r>
-      <w:proofErr w:type="gramStart"/>
-      <w:r>
-        <w:t>email</w:t>
-      </w:r>
-      <w:proofErr w:type="gramEnd"/>
-      <w:r>
+        <w:rPr>
+          <w:sz w:val="28"/>
+          <w:szCs w:val="28"/>
+        </w:rPr>
         <w:t xml:space="preserve"> corrette) e rilevamento degli eventi della pagina (come la pressione di un determinato bottone)</w:t>
       </w:r>
       <w:r>
+        <w:rPr>
+          <w:sz w:val="28"/>
+          <w:szCs w:val="28"/>
+        </w:rPr>
         <w:t>. I controlli dei dati possono essere sia in locale che in collegamento col server</w:t>
       </w:r>
     </w:p>
@@ -773,30 +1459,63 @@
           <w:ilvl w:val="0"/>
           <w:numId w:val="2"/>
         </w:numPr>
-      </w:pPr>
-      <w:r>
+        <w:rPr>
+          <w:sz w:val="28"/>
+          <w:szCs w:val="28"/>
+        </w:rPr>
+      </w:pPr>
+      <w:r>
+        <w:rPr>
+          <w:sz w:val="28"/>
+          <w:szCs w:val="28"/>
+        </w:rPr>
+        <w:lastRenderedPageBreak/>
         <w:t xml:space="preserve">possibilità di passare a un'altra schermata attraverso </w:t>
       </w:r>
       <w:proofErr w:type="spellStart"/>
       <w:r>
+        <w:rPr>
+          <w:sz w:val="28"/>
+          <w:szCs w:val="28"/>
+        </w:rPr>
         <w:t>Intent</w:t>
       </w:r>
       <w:proofErr w:type="spellEnd"/>
       <w:r>
+        <w:rPr>
+          <w:sz w:val="28"/>
+          <w:szCs w:val="28"/>
+        </w:rPr>
         <w:t>, cioè una richiesta da parte dell’utente al sistema di poter vedere informazioni diverse a schermo. L’</w:t>
       </w:r>
       <w:proofErr w:type="spellStart"/>
       <w:r>
+        <w:rPr>
+          <w:sz w:val="28"/>
+          <w:szCs w:val="28"/>
+        </w:rPr>
         <w:t>intent</w:t>
       </w:r>
       <w:proofErr w:type="spellEnd"/>
       <w:r>
+        <w:rPr>
+          <w:sz w:val="28"/>
+          <w:szCs w:val="28"/>
+        </w:rPr>
         <w:t xml:space="preserve"> ci dà anche la possibilità di passare dati tra una schermata a </w:t>
       </w:r>
       <w:r>
+        <w:rPr>
+          <w:sz w:val="28"/>
+          <w:szCs w:val="28"/>
+        </w:rPr>
         <w:t>un’altra</w:t>
       </w:r>
       <w:r>
+        <w:rPr>
+          <w:sz w:val="28"/>
+          <w:szCs w:val="28"/>
+        </w:rPr>
         <w:t>.</w:t>
       </w:r>
     </w:p>
@@ -816,23 +1535,53 @@
       </w:r>
     </w:p>
     <w:p>
-      <w:r>
+      <w:pPr>
+        <w:rPr>
+          <w:sz w:val="28"/>
+          <w:szCs w:val="28"/>
+        </w:rPr>
+      </w:pPr>
+      <w:r>
+        <w:rPr>
+          <w:sz w:val="28"/>
+          <w:szCs w:val="28"/>
+        </w:rPr>
         <w:t>Le</w:t>
       </w:r>
       <w:r>
+        <w:rPr>
+          <w:sz w:val="28"/>
+          <w:szCs w:val="28"/>
+        </w:rPr>
         <w:t xml:space="preserve"> schermate </w:t>
       </w:r>
       <w:r>
+        <w:rPr>
+          <w:sz w:val="28"/>
+          <w:szCs w:val="28"/>
+        </w:rPr>
         <w:t xml:space="preserve">principali </w:t>
       </w:r>
       <w:r>
+        <w:rPr>
+          <w:sz w:val="28"/>
+          <w:szCs w:val="28"/>
+        </w:rPr>
         <w:t>dell’app in breve:</w:t>
       </w:r>
     </w:p>
     <w:p>
+      <w:pPr>
+        <w:rPr>
+          <w:sz w:val="28"/>
+          <w:szCs w:val="28"/>
+        </w:rPr>
+      </w:pPr>
       <w:r>
         <w:rPr>
           <w:noProof/>
+          <w:sz w:val="28"/>
+          <w:szCs w:val="28"/>
         </w:rPr>
         <w:drawing>
           <wp:anchor distT="0" distB="0" distL="114300" distR="114300" simplePos="0" relativeHeight="251658240" behindDoc="0" locked="0" layoutInCell="1" allowOverlap="1" wp14:anchorId="07D39E5C" wp14:editId="625AC0FB">
@@ -891,26 +1640,70 @@
         </w:drawing>
       </w:r>
       <w:r>
+        <w:rPr>
+          <w:sz w:val="28"/>
+          <w:szCs w:val="28"/>
+        </w:rPr>
         <w:t>Schermata home:</w:t>
       </w:r>
     </w:p>
     <w:p>
-      <w:r>
+      <w:pPr>
+        <w:rPr>
+          <w:sz w:val="28"/>
+          <w:szCs w:val="28"/>
+        </w:rPr>
+      </w:pPr>
+      <w:r>
+        <w:rPr>
+          <w:sz w:val="28"/>
+          <w:szCs w:val="28"/>
+        </w:rPr>
         <w:t>lista con tutti i nostri animali</w:t>
       </w:r>
     </w:p>
     <w:p>
-      <w:r>
+      <w:pPr>
+        <w:rPr>
+          <w:sz w:val="28"/>
+          <w:szCs w:val="28"/>
+        </w:rPr>
+      </w:pPr>
+      <w:r>
+        <w:rPr>
+          <w:sz w:val="28"/>
+          <w:szCs w:val="28"/>
+        </w:rPr>
         <w:t>possibilità di registrarne di nuovi</w:t>
       </w:r>
     </w:p>
     <w:p>
-      <w:r>
+      <w:pPr>
+        <w:rPr>
+          <w:sz w:val="28"/>
+          <w:szCs w:val="28"/>
+        </w:rPr>
+      </w:pPr>
+      <w:r>
+        <w:rPr>
+          <w:sz w:val="28"/>
+          <w:szCs w:val="28"/>
+        </w:rPr>
         <w:t xml:space="preserve">lista di attività registrate di oggi </w:t>
       </w:r>
     </w:p>
     <w:p>
-      <w:r>
+      <w:pPr>
+        <w:rPr>
+          <w:sz w:val="28"/>
+          <w:szCs w:val="28"/>
+        </w:rPr>
+      </w:pPr>
+      <w:r>
+        <w:rPr>
+          <w:sz w:val="28"/>
+          <w:szCs w:val="28"/>
+        </w:rPr>
         <w:t>bottone per cercare servizi nell’area</w:t>
       </w:r>
     </w:p>
@@ -924,10 +1717,16 @@
     <w:p>
       <w:pPr>
         <w:jc w:val="right"/>
+        <w:rPr>
+          <w:sz w:val="28"/>
+          <w:szCs w:val="28"/>
+        </w:rPr>
       </w:pPr>
       <w:r>
         <w:rPr>
           <w:noProof/>
+          <w:sz w:val="28"/>
+          <w:szCs w:val="28"/>
         </w:rPr>
         <w:drawing>
           <wp:anchor distT="0" distB="0" distL="114300" distR="114300" simplePos="0" relativeHeight="251659264" behindDoc="1" locked="0" layoutInCell="1" allowOverlap="1" wp14:anchorId="226A6EC3" wp14:editId="352C5783">
@@ -994,39 +1793,79 @@
         </w:drawing>
       </w:r>
       <w:r>
+        <w:rPr>
+          <w:sz w:val="28"/>
+          <w:szCs w:val="28"/>
+        </w:rPr>
         <w:t>s</w:t>
       </w:r>
       <w:r>
+        <w:rPr>
+          <w:sz w:val="28"/>
+          <w:szCs w:val="28"/>
+        </w:rPr>
         <w:t>chermata p</w:t>
       </w:r>
       <w:r>
+        <w:rPr>
+          <w:sz w:val="28"/>
+          <w:szCs w:val="28"/>
+        </w:rPr>
         <w:t>ro</w:t>
       </w:r>
       <w:r>
+        <w:rPr>
+          <w:sz w:val="28"/>
+          <w:szCs w:val="28"/>
+        </w:rPr>
         <w:t>filo animale:</w:t>
       </w:r>
     </w:p>
     <w:p>
       <w:pPr>
         <w:jc w:val="right"/>
-      </w:pPr>
-      <w:r>
+        <w:rPr>
+          <w:sz w:val="28"/>
+          <w:szCs w:val="28"/>
+        </w:rPr>
+      </w:pPr>
+      <w:r>
+        <w:rPr>
+          <w:sz w:val="28"/>
+          <w:szCs w:val="28"/>
+        </w:rPr>
         <w:t>informazioni più dettagliate su uno dei nostri animali</w:t>
       </w:r>
     </w:p>
     <w:p>
       <w:pPr>
         <w:jc w:val="right"/>
-      </w:pPr>
-      <w:r>
+        <w:rPr>
+          <w:sz w:val="28"/>
+          <w:szCs w:val="28"/>
+        </w:rPr>
+      </w:pPr>
+      <w:r>
+        <w:rPr>
+          <w:sz w:val="28"/>
+          <w:szCs w:val="28"/>
+        </w:rPr>
         <w:t>possibilità di modifica</w:t>
       </w:r>
     </w:p>
     <w:p>
       <w:pPr>
         <w:jc w:val="right"/>
-      </w:pPr>
-      <w:r>
+        <w:rPr>
+          <w:sz w:val="28"/>
+          <w:szCs w:val="28"/>
+        </w:rPr>
+      </w:pPr>
+      <w:r>
+        <w:rPr>
+          <w:sz w:val="28"/>
+          <w:szCs w:val="28"/>
+        </w:rPr>
         <w:t>accesso alla cartella clinica</w:t>
       </w:r>
     </w:p>
@@ -1055,8 +1894,9 @@
         <w:rPr>
           <w:noProof/>
         </w:rPr>
+        <w:lastRenderedPageBreak/>
         <w:drawing>
-          <wp:anchor distT="0" distB="0" distL="114300" distR="114300" simplePos="0" relativeHeight="251660288" behindDoc="0" locked="0" layoutInCell="1" allowOverlap="1" wp14:anchorId="54F62B64" wp14:editId="64B64581">
+          <wp:anchor distT="0" distB="0" distL="114300" distR="114300" simplePos="0" relativeHeight="251660288" behindDoc="0" locked="0" layoutInCell="1" allowOverlap="1" wp14:anchorId="54F62B64" wp14:editId="53CA8941">
             <wp:simplePos x="0" y="0"/>
             <wp:positionH relativeFrom="margin">
               <wp:align>left</wp:align>
@@ -1113,14 +1953,32 @@
       </w:r>
     </w:p>
     <w:p>
-      <w:r>
+      <w:pPr>
+        <w:rPr>
+          <w:sz w:val="28"/>
+          <w:szCs w:val="28"/>
+        </w:rPr>
+      </w:pPr>
+      <w:r>
+        <w:rPr>
+          <w:sz w:val="28"/>
+          <w:szCs w:val="28"/>
+        </w:rPr>
         <w:t>schermata cartella clinica:</w:t>
       </w:r>
     </w:p>
     <w:p>
+      <w:pPr>
+        <w:rPr>
+          <w:sz w:val="28"/>
+          <w:szCs w:val="28"/>
+        </w:rPr>
+      </w:pPr>
       <w:r>
         <w:rPr>
           <w:noProof/>
+          <w:sz w:val="28"/>
+          <w:szCs w:val="28"/>
         </w:rPr>
         <w:drawing>
           <wp:anchor distT="0" distB="0" distL="114300" distR="114300" simplePos="0" relativeHeight="251661312" behindDoc="0" locked="0" layoutInCell="1" allowOverlap="1" wp14:anchorId="52862408" wp14:editId="40D97945">
@@ -1179,30 +2037,88 @@
         </w:drawing>
       </w:r>
       <w:r>
+        <w:rPr>
+          <w:sz w:val="28"/>
+          <w:szCs w:val="28"/>
+        </w:rPr>
         <w:t>lista dei Log delle cartelle cliniche</w:t>
       </w:r>
     </w:p>
     <w:p>
-      <w:r>
+      <w:pPr>
+        <w:rPr>
+          <w:sz w:val="28"/>
+          <w:szCs w:val="28"/>
+        </w:rPr>
+      </w:pPr>
+      <w:r>
+        <w:rPr>
+          <w:sz w:val="28"/>
+          <w:szCs w:val="28"/>
+        </w:rPr>
         <w:t>per aggiungere un log</w:t>
       </w:r>
     </w:p>
     <w:p>
-      <w:r>
+      <w:pPr>
+        <w:rPr>
+          <w:sz w:val="28"/>
+          <w:szCs w:val="28"/>
+        </w:rPr>
+      </w:pPr>
+      <w:r>
+        <w:rPr>
+          <w:sz w:val="28"/>
+          <w:szCs w:val="28"/>
+        </w:rPr>
         <w:t>compare una finestra di dialogo:</w:t>
       </w:r>
     </w:p>
-    <w:p/>
-    <w:p/>
-    <w:p/>
-    <w:p/>
+    <w:p>
+      <w:pPr>
+        <w:rPr>
+          <w:sz w:val="28"/>
+          <w:szCs w:val="28"/>
+        </w:rPr>
+      </w:pPr>
+    </w:p>
+    <w:p>
+      <w:pPr>
+        <w:rPr>
+          <w:sz w:val="28"/>
+          <w:szCs w:val="28"/>
+        </w:rPr>
+      </w:pPr>
+    </w:p>
+    <w:p>
+      <w:pPr>
+        <w:rPr>
+          <w:sz w:val="28"/>
+          <w:szCs w:val="28"/>
+        </w:rPr>
+      </w:pPr>
+    </w:p>
+    <w:p>
+      <w:pPr>
+        <w:rPr>
+          <w:sz w:val="28"/>
+          <w:szCs w:val="28"/>
+        </w:rPr>
+      </w:pPr>
+    </w:p>
     <w:p>
       <w:pPr>
         <w:jc w:val="right"/>
+        <w:rPr>
+          <w:sz w:val="28"/>
+          <w:szCs w:val="28"/>
+        </w:rPr>
       </w:pPr>
       <w:r>
         <w:rPr>
           <w:noProof/>
+          <w:sz w:val="28"/>
+          <w:szCs w:val="28"/>
         </w:rPr>
         <w:drawing>
           <wp:anchor distT="0" distB="0" distL="114300" distR="114300" simplePos="0" relativeHeight="251662336" behindDoc="0" locked="0" layoutInCell="1" allowOverlap="1" wp14:anchorId="0C107D98" wp14:editId="1D064A90">
@@ -1264,33 +2180,69 @@
     <w:p>
       <w:pPr>
         <w:jc w:val="right"/>
-      </w:pPr>
-      <w:r>
+        <w:rPr>
+          <w:sz w:val="28"/>
+          <w:szCs w:val="28"/>
+        </w:rPr>
+      </w:pPr>
+      <w:r>
+        <w:rPr>
+          <w:sz w:val="28"/>
+          <w:szCs w:val="28"/>
+        </w:rPr>
         <w:t>schermata ricerca servizi</w:t>
       </w:r>
       <w:r>
+        <w:rPr>
+          <w:sz w:val="28"/>
+          <w:szCs w:val="28"/>
+        </w:rPr>
         <w:t>:</w:t>
       </w:r>
     </w:p>
     <w:p>
       <w:pPr>
         <w:jc w:val="right"/>
-      </w:pPr>
-      <w:r>
+        <w:rPr>
+          <w:sz w:val="28"/>
+          <w:szCs w:val="28"/>
+        </w:rPr>
+      </w:pPr>
+      <w:r>
+        <w:rPr>
+          <w:sz w:val="28"/>
+          <w:szCs w:val="28"/>
+        </w:rPr>
         <w:t>in base alla zona che viene scelta ci verranno proposte attività vicine</w:t>
       </w:r>
     </w:p>
     <w:p>
       <w:pPr>
         <w:jc w:val="right"/>
-      </w:pPr>
-      <w:r>
+        <w:rPr>
+          <w:sz w:val="28"/>
+          <w:szCs w:val="28"/>
+        </w:rPr>
+      </w:pPr>
+      <w:r>
+        <w:rPr>
+          <w:sz w:val="28"/>
+          <w:szCs w:val="28"/>
+        </w:rPr>
         <w:t>cliccando su un’</w:t>
       </w:r>
       <w:r>
+        <w:rPr>
+          <w:sz w:val="28"/>
+          <w:szCs w:val="28"/>
+        </w:rPr>
         <w:t>a</w:t>
       </w:r>
       <w:r>
+        <w:rPr>
+          <w:sz w:val="28"/>
+          <w:szCs w:val="28"/>
+        </w:rPr>
         <w:t>ttività in particolare avremo più dettagli</w:t>
       </w:r>
     </w:p>
@@ -1333,12 +2285,32 @@
       </w:r>
     </w:p>
     <w:p>
-      <w:r>
+      <w:pPr>
+        <w:rPr>
+          <w:sz w:val="28"/>
+          <w:szCs w:val="28"/>
+        </w:rPr>
+      </w:pPr>
+      <w:r>
+        <w:rPr>
+          <w:sz w:val="28"/>
+          <w:szCs w:val="28"/>
+        </w:rPr>
         <w:t>Il sito desktop mette a disposizione strumenti di gestione per coloro che offrono servizi (privati o aziende).</w:t>
       </w:r>
     </w:p>
     <w:p>
-      <w:r>
+      <w:pPr>
+        <w:rPr>
+          <w:sz w:val="28"/>
+          <w:szCs w:val="28"/>
+        </w:rPr>
+      </w:pPr>
+      <w:r>
+        <w:rPr>
+          <w:sz w:val="28"/>
+          <w:szCs w:val="28"/>
+        </w:rPr>
         <w:t>La parte web, difatti, ha lo scopo di far comunicare il cliente con i fornitori in prima persona.</w:t>
       </w:r>
     </w:p>
@@ -1360,6 +2332,7 @@
     </w:p>
     <w:p>
       <w:r>
+        <w:lastRenderedPageBreak/>
         <w:t>Flask è un framework</w:t>
       </w:r>
       <w:r>
@@ -1377,7 +2350,6 @@
     </w:p>
     <w:p>
       <w:r>
-        <w:lastRenderedPageBreak/>
         <w:t xml:space="preserve">Le API sono protocolli che permettono lo scambio di informazioni in rete, REST invece è la specifica API che comunica in protocollo http/https e manda dati in formato JSON. Le istruzioni che il client può inviare al server sono di </w:t>
       </w:r>
       <w:proofErr w:type="gramStart"/>
@@ -1667,10 +2639,16 @@
           <w:ilvl w:val="0"/>
           <w:numId w:val="4"/>
         </w:numPr>
+        <w:rPr>
+          <w:sz w:val="28"/>
+          <w:szCs w:val="28"/>
+        </w:rPr>
       </w:pPr>
       <w:r>
         <w:rPr>
           <w:noProof/>
+          <w:sz w:val="28"/>
+          <w:szCs w:val="28"/>
         </w:rPr>
         <w:drawing>
           <wp:anchor distT="0" distB="0" distL="114300" distR="114300" simplePos="0" relativeHeight="251665408" behindDoc="0" locked="0" layoutInCell="1" allowOverlap="1" wp14:anchorId="2F7FFE93" wp14:editId="6488D29F">
@@ -1729,24 +2707,48 @@
         </w:drawing>
       </w:r>
       <w:r>
+        <w:rPr>
+          <w:sz w:val="28"/>
+          <w:szCs w:val="28"/>
+        </w:rPr>
         <w:t>l’endpoint di Flask prende i</w:t>
       </w:r>
       <w:r>
+        <w:rPr>
+          <w:sz w:val="28"/>
+          <w:szCs w:val="28"/>
+        </w:rPr>
         <w:t xml:space="preserve"> </w:t>
       </w:r>
       <w:r>
+        <w:rPr>
+          <w:sz w:val="28"/>
+          <w:szCs w:val="28"/>
+        </w:rPr>
         <w:t>dati e con essi genera una richiesta</w:t>
       </w:r>
       <w:r>
+        <w:rPr>
+          <w:sz w:val="28"/>
+          <w:szCs w:val="28"/>
+        </w:rPr>
         <w:t>(query)</w:t>
       </w:r>
       <w:r>
+        <w:rPr>
+          <w:sz w:val="28"/>
+          <w:szCs w:val="28"/>
+        </w:rPr>
         <w:t xml:space="preserve"> al server. Se un utente corrisponde alle credenziali, l’esito della richiesta sarà positivo.</w:t>
       </w:r>
     </w:p>
     <w:p>
       <w:pPr>
         <w:pStyle w:val="Paragrafoelenco"/>
+        <w:rPr>
+          <w:sz w:val="28"/>
+          <w:szCs w:val="28"/>
+        </w:rPr>
       </w:pPr>
     </w:p>
     <w:p>
@@ -1756,10 +2758,16 @@
           <w:ilvl w:val="0"/>
           <w:numId w:val="4"/>
         </w:numPr>
+        <w:rPr>
+          <w:sz w:val="28"/>
+          <w:szCs w:val="28"/>
+        </w:rPr>
       </w:pPr>
       <w:r>
         <w:rPr>
           <w:noProof/>
+          <w:sz w:val="28"/>
+          <w:szCs w:val="28"/>
         </w:rPr>
         <w:drawing>
           <wp:anchor distT="0" distB="0" distL="114300" distR="114300" simplePos="0" relativeHeight="251666432" behindDoc="0" locked="0" layoutInCell="1" allowOverlap="1" wp14:anchorId="528A2BE9" wp14:editId="0D095B51">
@@ -1812,15 +2820,35 @@
         </w:drawing>
       </w:r>
       <w:r>
-        <w:t>Sul database precedentemente creato viene controllata la presenza dell’utent</w:t>
-      </w:r>
-      <w:r>
+        <w:rPr>
+          <w:sz w:val="28"/>
+          <w:szCs w:val="28"/>
+        </w:rPr>
+        <w:t xml:space="preserve">Sul database precedentemente </w:t>
+      </w:r>
+      <w:r>
+        <w:rPr>
+          <w:sz w:val="28"/>
+          <w:szCs w:val="28"/>
+        </w:rPr>
+        <w:lastRenderedPageBreak/>
+        <w:t>creato viene controllata la presenza dell’utent</w:t>
+      </w:r>
+      <w:r>
+        <w:rPr>
+          <w:sz w:val="28"/>
+          <w:szCs w:val="28"/>
+        </w:rPr>
         <w:t>e.</w:t>
       </w:r>
     </w:p>
     <w:p>
       <w:pPr>
         <w:pStyle w:val="Paragrafoelenco"/>
+        <w:rPr>
+          <w:sz w:val="28"/>
+          <w:szCs w:val="28"/>
+        </w:rPr>
       </w:pPr>
     </w:p>
     <w:p>
@@ -1830,17 +2858,25 @@
           <w:ilvl w:val="0"/>
           <w:numId w:val="4"/>
         </w:numPr>
-      </w:pPr>
-      <w:r>
-        <w:lastRenderedPageBreak/>
+        <w:rPr>
+          <w:sz w:val="28"/>
+          <w:szCs w:val="28"/>
+        </w:rPr>
+      </w:pPr>
+      <w:r>
+        <w:rPr>
+          <w:noProof/>
+          <w:sz w:val="28"/>
+          <w:szCs w:val="28"/>
+        </w:rPr>
         <w:drawing>
-          <wp:anchor distT="0" distB="0" distL="114300" distR="114300" simplePos="0" relativeHeight="251667456" behindDoc="0" locked="0" layoutInCell="1" allowOverlap="1" wp14:anchorId="6DD05B02" wp14:editId="36AAB614">
+          <wp:anchor distT="0" distB="0" distL="114300" distR="114300" simplePos="0" relativeHeight="251667456" behindDoc="0" locked="0" layoutInCell="1" allowOverlap="1" wp14:anchorId="6DD05B02" wp14:editId="0C86C798">
             <wp:simplePos x="0" y="0"/>
             <wp:positionH relativeFrom="margin">
-              <wp:align>right</wp:align>
+              <wp:posOffset>160020</wp:posOffset>
             </wp:positionH>
             <wp:positionV relativeFrom="paragraph">
-              <wp:posOffset>678815</wp:posOffset>
+              <wp:posOffset>1143635</wp:posOffset>
             </wp:positionV>
             <wp:extent cx="6120130" cy="738505"/>
             <wp:effectExtent l="0" t="0" r="0" b="4445"/>
@@ -1884,38 +2920,83 @@
         </w:drawing>
       </w:r>
       <w:r>
+        <w:rPr>
+          <w:sz w:val="28"/>
+          <w:szCs w:val="28"/>
+        </w:rPr>
         <w:t>le due possibili risposte sono inviate in JSON all’app, in particolare viene passato l’identificativo dell’utente che ha appena fatto il login, in modo che successivamente le altre richieste al server possano essere semplificate.</w:t>
       </w:r>
     </w:p>
     <w:p/>
     <w:p>
-      <w:r>
+      <w:pPr>
+        <w:rPr>
+          <w:sz w:val="28"/>
+          <w:szCs w:val="28"/>
+        </w:rPr>
+      </w:pPr>
+      <w:r>
+        <w:rPr>
+          <w:sz w:val="28"/>
+          <w:szCs w:val="28"/>
+        </w:rPr>
         <w:t xml:space="preserve">Riassumendo, </w:t>
       </w:r>
       <w:r>
+        <w:rPr>
+          <w:sz w:val="28"/>
+          <w:szCs w:val="28"/>
+        </w:rPr>
         <w:t>le informazioni partono da</w:t>
       </w:r>
       <w:r>
+        <w:rPr>
+          <w:sz w:val="28"/>
+          <w:szCs w:val="28"/>
+        </w:rPr>
         <w:t>ll’app, passano attraverso Flask che fa da tramite per il server, dove sono contenute le informazioni in un database</w:t>
       </w:r>
       <w:r>
+        <w:rPr>
+          <w:sz w:val="28"/>
+          <w:szCs w:val="28"/>
+        </w:rPr>
         <w:t xml:space="preserve">, Flask poi gestisce la risposta da ritornare all’utente. Nello stesso modo viene gestito il sito, il quale, però non richiede di usare </w:t>
       </w:r>
       <w:proofErr w:type="spellStart"/>
       <w:r>
+        <w:rPr>
+          <w:sz w:val="28"/>
+          <w:szCs w:val="28"/>
+        </w:rPr>
         <w:t>APIService</w:t>
       </w:r>
       <w:proofErr w:type="spellEnd"/>
       <w:r>
+        <w:rPr>
+          <w:sz w:val="28"/>
+          <w:szCs w:val="28"/>
+        </w:rPr>
         <w:t xml:space="preserve"> ma si connette direttamente agli URL di </w:t>
       </w:r>
       <w:proofErr w:type="spellStart"/>
       <w:r>
+        <w:rPr>
+          <w:sz w:val="28"/>
+          <w:szCs w:val="28"/>
+        </w:rPr>
         <w:t>flask</w:t>
       </w:r>
       <w:proofErr w:type="spellEnd"/>
     </w:p>
-    <w:p/>
+    <w:p>
+      <w:pPr>
+        <w:rPr>
+          <w:sz w:val="28"/>
+          <w:szCs w:val="28"/>
+        </w:rPr>
+      </w:pPr>
+    </w:p>
     <w:sectPr>
       <w:footerReference w:type="default" r:id="rId23"/>
       <w:pgSz w:w="11906" w:h="16838" w:code="9"/>

</xml_diff>

<commit_message>
Altre modifiche relazione e PP
inserimento nuove parti
</commit_message>
<xml_diff>
--- a/Documenti/Relazione Finale/relazione finale (nuova).docx
+++ b/Documenti/Relazione Finale/relazione finale (nuova).docx
@@ -56,7 +56,13 @@
         <w:rPr>
           <w:rFonts w:ascii="Amasis MT Pro" w:hAnsi="Amasis MT Pro"/>
         </w:rPr>
-        <w:t>- INTRODUZIONE………………………………………………………………………(n° pag)</w:t>
+        <w:t>- INTRODUZIONE………………………………………………………………………</w:t>
+      </w:r>
+      <w:r>
+        <w:rPr>
+          <w:rFonts w:ascii="Amasis MT Pro" w:hAnsi="Amasis MT Pro"/>
+        </w:rPr>
+        <w:t>....................</w:t>
       </w:r>
     </w:p>
     <w:p>
@@ -75,7 +81,6 @@
       <w:r>
         <w:rPr>
           <w:rFonts w:ascii="Amasis MT Pro" w:hAnsi="Amasis MT Pro"/>
-          <w:u w:val="single"/>
         </w:rPr>
         <w:t>MOTIVAZIONI</w:t>
       </w:r>
@@ -83,7 +88,13 @@
         <w:rPr>
           <w:rFonts w:ascii="Amasis MT Pro" w:hAnsi="Amasis MT Pro"/>
         </w:rPr>
-        <w:t>………………………………………………………………(n° pag)</w:t>
+        <w:t>………………………………………………………………</w:t>
+      </w:r>
+      <w:r>
+        <w:rPr>
+          <w:rFonts w:ascii="Amasis MT Pro" w:hAnsi="Amasis MT Pro"/>
+        </w:rPr>
+        <w:t>..................</w:t>
       </w:r>
     </w:p>
     <w:p>
@@ -97,7 +108,13 @@
         <w:rPr>
           <w:rFonts w:ascii="Amasis MT Pro" w:hAnsi="Amasis MT Pro"/>
         </w:rPr>
-        <w:t>- ARCHITETTURA DEL SISTEMA………………………………………………………(n° pag)</w:t>
+        <w:t>- ARCHITETTURA DEL SISTEMA………………………………………………………</w:t>
+      </w:r>
+      <w:r>
+        <w:rPr>
+          <w:rFonts w:ascii="Amasis MT Pro" w:hAnsi="Amasis MT Pro"/>
+        </w:rPr>
+        <w:t>.................</w:t>
       </w:r>
     </w:p>
     <w:p>
@@ -111,7 +128,13 @@
         <w:rPr>
           <w:rFonts w:ascii="Amasis MT Pro" w:hAnsi="Amasis MT Pro"/>
         </w:rPr>
-        <w:t>- MATERIALE UTILIZZATO………………………………………………………………(n° pag)</w:t>
+        <w:t>- MATERIALE UTILIZZATO………………………………………………………………</w:t>
+      </w:r>
+      <w:r>
+        <w:rPr>
+          <w:rFonts w:ascii="Amasis MT Pro" w:hAnsi="Amasis MT Pro"/>
+        </w:rPr>
+        <w:t>................</w:t>
       </w:r>
     </w:p>
     <w:p>
@@ -125,7 +148,13 @@
         <w:rPr>
           <w:rFonts w:ascii="Amasis MT Pro" w:hAnsi="Amasis MT Pro"/>
         </w:rPr>
-        <w:t>- STRUTTURA DEI DATI: ER E MODELLO DATI………………………………………(n° pag)</w:t>
+        <w:t>- STRUTTURA DEI DATI: ER E MODELLO DATI………………………………………</w:t>
+      </w:r>
+      <w:r>
+        <w:rPr>
+          <w:rFonts w:ascii="Amasis MT Pro" w:hAnsi="Amasis MT Pro"/>
+        </w:rPr>
+        <w:t>................</w:t>
       </w:r>
     </w:p>
     <w:p>
@@ -139,7 +168,13 @@
         <w:rPr>
           <w:rFonts w:ascii="Amasis MT Pro" w:hAnsi="Amasis MT Pro"/>
         </w:rPr>
-        <w:t>- WIREFRAME, STORYBOARD CON NAVIGAZIONE…………………………………(n° pag)</w:t>
+        <w:t>- WIREFRAME, STORYBOARD CON NAVIGAZIONE…………………………………</w:t>
+      </w:r>
+      <w:r>
+        <w:rPr>
+          <w:rFonts w:ascii="Amasis MT Pro" w:hAnsi="Amasis MT Pro"/>
+        </w:rPr>
+        <w:t>.................</w:t>
       </w:r>
     </w:p>
     <w:p>
@@ -153,7 +188,13 @@
         <w:rPr>
           <w:rFonts w:ascii="Amasis MT Pro" w:hAnsi="Amasis MT Pro"/>
         </w:rPr>
-        <w:t>- LINGUAGGIO E TECNOLOGIE UTILIZZATI…………………………………………(n° pag)</w:t>
+        <w:t>- LINGUAGGIO E TECNOLOGIE UTILIZZATI…………………………………………</w:t>
+      </w:r>
+      <w:r>
+        <w:rPr>
+          <w:rFonts w:ascii="Amasis MT Pro" w:hAnsi="Amasis MT Pro"/>
+        </w:rPr>
+        <w:t>.................</w:t>
       </w:r>
     </w:p>
     <w:p>
@@ -179,7 +220,13 @@
         <w:rPr>
           <w:rFonts w:ascii="Amasis MT Pro" w:hAnsi="Amasis MT Pro"/>
         </w:rPr>
-        <w:t>IMPLEMENTATIVA) ……………………………………………………………………    (n° pag)</w:t>
+        <w:t>IMPLEMENTATIVA) ……………………………………………………………………</w:t>
+      </w:r>
+      <w:r>
+        <w:rPr>
+          <w:rFonts w:ascii="Amasis MT Pro" w:hAnsi="Amasis MT Pro"/>
+        </w:rPr>
+        <w:t>....................</w:t>
       </w:r>
     </w:p>
     <w:p>
@@ -193,7 +240,13 @@
         <w:rPr>
           <w:rFonts w:ascii="Amasis MT Pro" w:hAnsi="Amasis MT Pro"/>
         </w:rPr>
-        <w:t>- ESEMPIO USO DEL SISTEMA………………………………………………………     (n° pag)</w:t>
+        <w:t>- ESEMPIO USO DEL SISTEMA………………………………………………………</w:t>
+      </w:r>
+      <w:r>
+        <w:rPr>
+          <w:rFonts w:ascii="Amasis MT Pro" w:hAnsi="Amasis MT Pro"/>
+        </w:rPr>
+        <w:t>......................</w:t>
       </w:r>
     </w:p>
     <w:p>
@@ -207,7 +260,13 @@
         <w:rPr>
           <w:rFonts w:ascii="Amasis MT Pro" w:hAnsi="Amasis MT Pro"/>
         </w:rPr>
-        <w:t>- RISULTATI OTTENUTI……………………………………………………………....  (n° pag)</w:t>
+        <w:t>- RISULTATI OTTENUTI……………………………………………………………...</w:t>
+      </w:r>
+      <w:r>
+        <w:rPr>
+          <w:rFonts w:ascii="Amasis MT Pro" w:hAnsi="Amasis MT Pro"/>
+        </w:rPr>
+        <w:t>.......................</w:t>
       </w:r>
     </w:p>
     <w:p>
@@ -221,7 +280,13 @@
         <w:rPr>
           <w:rFonts w:ascii="Amasis MT Pro" w:hAnsi="Amasis MT Pro"/>
         </w:rPr>
-        <w:t>- CONCLUSIONI………………………………………………………………………........(n° pag)</w:t>
+        <w:t>- CONCLUSIONI………………………………………………………………………........</w:t>
+      </w:r>
+      <w:r>
+        <w:rPr>
+          <w:rFonts w:ascii="Amasis MT Pro" w:hAnsi="Amasis MT Pro"/>
+        </w:rPr>
+        <w:t>................</w:t>
       </w:r>
     </w:p>
     <w:p>
@@ -235,7 +300,13 @@
         <w:rPr>
           <w:rFonts w:ascii="Amasis MT Pro" w:hAnsi="Amasis MT Pro"/>
         </w:rPr>
-        <w:t>- SVILUPPI FUTURI………………………………………………………………………...(n° pag)</w:t>
+        <w:t>- SVILUPPI FUTURI………………………………………………………………………...</w:t>
+      </w:r>
+      <w:r>
+        <w:rPr>
+          <w:rFonts w:ascii="Amasis MT Pro" w:hAnsi="Amasis MT Pro"/>
+        </w:rPr>
+        <w:t>...............</w:t>
       </w:r>
     </w:p>
     <w:p>
@@ -466,7 +537,27 @@
           <w:sz w:val="28"/>
           <w:szCs w:val="28"/>
         </w:rPr>
-        <w:t>Object Oriented Programming</w:t>
+        <w:t xml:space="preserve">Object </w:t>
+      </w:r>
+      <w:proofErr w:type="spellStart"/>
+      <w:r>
+        <w:rPr>
+          <w:rFonts w:ascii="Amasis MT Pro" w:hAnsi="Amasis MT Pro"/>
+          <w:color w:val="FF0000"/>
+          <w:sz w:val="28"/>
+          <w:szCs w:val="28"/>
+        </w:rPr>
+        <w:t>Oriented</w:t>
+      </w:r>
+      <w:proofErr w:type="spellEnd"/>
+      <w:r>
+        <w:rPr>
+          <w:rFonts w:ascii="Amasis MT Pro" w:hAnsi="Amasis MT Pro"/>
+          <w:color w:val="FF0000"/>
+          <w:sz w:val="28"/>
+          <w:szCs w:val="28"/>
+        </w:rPr>
+        <w:t xml:space="preserve"> Programming</w:t>
       </w:r>
       <w:r>
         <w:rPr>
@@ -583,6 +674,7 @@
         </w:rPr>
         <w:t xml:space="preserve">Il modulo di </w:t>
       </w:r>
+      <w:proofErr w:type="spellStart"/>
       <w:r>
         <w:rPr>
           <w:rFonts w:ascii="Amasis MT Pro" w:hAnsi="Amasis MT Pro"/>
@@ -592,13 +684,32 @@
         </w:rPr>
         <w:t>Backend</w:t>
       </w:r>
-      <w:r>
-        <w:rPr>
-          <w:rFonts w:ascii="Amasis MT Pro" w:hAnsi="Amasis MT Pro"/>
-          <w:sz w:val="28"/>
-          <w:szCs w:val="28"/>
-        </w:rPr>
-        <w:t xml:space="preserve"> (utilizzo di Flask e strumenti come </w:t>
+      <w:proofErr w:type="spellEnd"/>
+      <w:r>
+        <w:rPr>
+          <w:rFonts w:ascii="Amasis MT Pro" w:hAnsi="Amasis MT Pro"/>
+          <w:sz w:val="28"/>
+          <w:szCs w:val="28"/>
+        </w:rPr>
+        <w:t xml:space="preserve"> (utilizzo di </w:t>
+      </w:r>
+      <w:proofErr w:type="spellStart"/>
+      <w:r>
+        <w:rPr>
+          <w:rFonts w:ascii="Amasis MT Pro" w:hAnsi="Amasis MT Pro"/>
+          <w:sz w:val="28"/>
+          <w:szCs w:val="28"/>
+        </w:rPr>
+        <w:t>Flask</w:t>
+      </w:r>
+      <w:proofErr w:type="spellEnd"/>
+      <w:r>
+        <w:rPr>
+          <w:rFonts w:ascii="Amasis MT Pro" w:hAnsi="Amasis MT Pro"/>
+          <w:sz w:val="28"/>
+          <w:szCs w:val="28"/>
+        </w:rPr>
+        <w:t xml:space="preserve"> e strumenti come </w:t>
       </w:r>
       <w:r>
         <w:rPr>
@@ -815,6 +926,7 @@
         </w:rPr>
         <w:t xml:space="preserve">. Il gruppo che ha creato l’applicazione </w:t>
       </w:r>
+      <w:proofErr w:type="spellStart"/>
       <w:r>
         <w:rPr>
           <w:rFonts w:ascii="Amasis MT Pro" w:hAnsi="Amasis MT Pro"/>
@@ -823,7 +935,18 @@
           <w:szCs w:val="28"/>
           <w:u w:val="single"/>
         </w:rPr>
-        <w:t xml:space="preserve">Crikle </w:t>
+        <w:t>Crikle</w:t>
+      </w:r>
+      <w:proofErr w:type="spellEnd"/>
+      <w:r>
+        <w:rPr>
+          <w:rFonts w:ascii="Amasis MT Pro" w:hAnsi="Amasis MT Pro"/>
+          <w:color w:val="FF0000"/>
+          <w:sz w:val="28"/>
+          <w:szCs w:val="28"/>
+          <w:u w:val="single"/>
+        </w:rPr>
+        <w:t xml:space="preserve"> </w:t>
       </w:r>
       <w:r>
         <w:rPr>
@@ -907,15 +1030,13 @@
     </w:p>
     <w:p>
       <w:pPr>
-        <w:jc w:val="center"/>
-        <w:rPr>
-          <w:rFonts w:ascii="Amasis MT Pro" w:hAnsi="Amasis MT Pro"/>
-        </w:rPr>
-      </w:pPr>
-    </w:p>
-    <w:p>
-      <w:pPr>
-        <w:jc w:val="center"/>
+        <w:rPr>
+          <w:rFonts w:ascii="Amasis MT Pro" w:hAnsi="Amasis MT Pro"/>
+        </w:rPr>
+      </w:pPr>
+    </w:p>
+    <w:p>
+      <w:pPr>
         <w:rPr>
           <w:rFonts w:ascii="Amasis MT Pro" w:hAnsi="Amasis MT Pro"/>
           <w:sz w:val="36"/>
@@ -1210,7 +1331,25 @@
           <w:sz w:val="28"/>
           <w:szCs w:val="28"/>
         </w:rPr>
-        <w:t xml:space="preserve"> che si creasse Crikle </w:t>
+        <w:t xml:space="preserve"> che si creasse </w:t>
+      </w:r>
+      <w:proofErr w:type="spellStart"/>
+      <w:r>
+        <w:rPr>
+          <w:rFonts w:ascii="Amasis MT Pro" w:hAnsi="Amasis MT Pro"/>
+          <w:sz w:val="28"/>
+          <w:szCs w:val="28"/>
+        </w:rPr>
+        <w:t>Crikle</w:t>
+      </w:r>
+      <w:proofErr w:type="spellEnd"/>
+      <w:r>
+        <w:rPr>
+          <w:rFonts w:ascii="Amasis MT Pro" w:hAnsi="Amasis MT Pro"/>
+          <w:sz w:val="28"/>
+          <w:szCs w:val="28"/>
+        </w:rPr>
+        <w:t xml:space="preserve"> </w:t>
       </w:r>
       <w:r>
         <w:rPr>
@@ -1348,7 +1487,25 @@
           <w:sz w:val="28"/>
           <w:szCs w:val="28"/>
         </w:rPr>
-        <w:t xml:space="preserve">servizi di Toilettatura, addestramento, veterinario e petsitting. </w:t>
+        <w:t xml:space="preserve">servizi di Toilettatura, addestramento, veterinario e </w:t>
+      </w:r>
+      <w:proofErr w:type="spellStart"/>
+      <w:r>
+        <w:rPr>
+          <w:rFonts w:ascii="Amasis MT Pro" w:hAnsi="Amasis MT Pro"/>
+          <w:sz w:val="28"/>
+          <w:szCs w:val="28"/>
+        </w:rPr>
+        <w:t>petsitting</w:t>
+      </w:r>
+      <w:proofErr w:type="spellEnd"/>
+      <w:r>
+        <w:rPr>
+          <w:rFonts w:ascii="Amasis MT Pro" w:hAnsi="Amasis MT Pro"/>
+          <w:sz w:val="28"/>
+          <w:szCs w:val="28"/>
+        </w:rPr>
+        <w:t xml:space="preserve">. </w:t>
       </w:r>
     </w:p>
     <w:p>
@@ -1508,7 +1665,6 @@
     </w:p>
     <w:p>
       <w:pPr>
-        <w:jc w:val="both"/>
         <w:rPr>
           <w:rFonts w:ascii="Amasis MT Pro" w:hAnsi="Amasis MT Pro"/>
           <w:color w:val="000000" w:themeColor="text1"/>
@@ -1523,8 +1679,9 @@
           <w:sz w:val="28"/>
           <w:szCs w:val="28"/>
         </w:rPr>
-        <w:t>Abbiamo usato come schema logico il classico MWC (Model-View-Controller)</w:t>
-      </w:r>
+        <w:t>Abbiamo usato come schema logico il classico MWC (Model-</w:t>
+      </w:r>
+      <w:proofErr w:type="spellStart"/>
       <w:r>
         <w:rPr>
           <w:rFonts w:ascii="Amasis MT Pro" w:hAnsi="Amasis MT Pro"/>
@@ -1532,12 +1689,30 @@
           <w:sz w:val="28"/>
           <w:szCs w:val="28"/>
         </w:rPr>
+        <w:t>View</w:t>
+      </w:r>
+      <w:proofErr w:type="spellEnd"/>
+      <w:r>
+        <w:rPr>
+          <w:rFonts w:ascii="Amasis MT Pro" w:hAnsi="Amasis MT Pro"/>
+          <w:color w:val="000000" w:themeColor="text1"/>
+          <w:sz w:val="28"/>
+          <w:szCs w:val="28"/>
+        </w:rPr>
+        <w:t>-Controller)</w:t>
+      </w:r>
+      <w:r>
+        <w:rPr>
+          <w:rFonts w:ascii="Amasis MT Pro" w:hAnsi="Amasis MT Pro"/>
+          <w:color w:val="000000" w:themeColor="text1"/>
+          <w:sz w:val="28"/>
+          <w:szCs w:val="28"/>
+        </w:rPr>
         <w:t xml:space="preserve"> con il Model che, dunque, andava a settare i modelli dei dati con conseguente logica di business. </w:t>
       </w:r>
     </w:p>
     <w:p>
       <w:pPr>
-        <w:jc w:val="both"/>
         <w:rPr>
           <w:rFonts w:ascii="Amasis MT Pro" w:hAnsi="Amasis MT Pro"/>
           <w:color w:val="000000" w:themeColor="text1"/>
@@ -1552,19 +1727,19 @@
           <w:sz w:val="28"/>
           <w:szCs w:val="28"/>
         </w:rPr>
-        <w:t>Per quanto riguarda il View abbiamo adoperato il sistema delle View di Android Studio per gestire quella che poteva essere l’UI (interfaccia utente) migliore anche analizzando l’ipotetico pubblico a cui può essere diretta l’applicazione.</w:t>
-      </w:r>
-    </w:p>
-    <w:p>
-      <w:pPr>
-        <w:jc w:val="both"/>
+        <w:t xml:space="preserve">Per quanto riguarda il </w:t>
+      </w:r>
+      <w:proofErr w:type="spellStart"/>
+      <w:r>
         <w:rPr>
           <w:rFonts w:ascii="Amasis MT Pro" w:hAnsi="Amasis MT Pro"/>
           <w:color w:val="000000" w:themeColor="text1"/>
           <w:sz w:val="28"/>
           <w:szCs w:val="28"/>
         </w:rPr>
-      </w:pPr>
+        <w:t>View</w:t>
+      </w:r>
+      <w:proofErr w:type="spellEnd"/>
       <w:r>
         <w:rPr>
           <w:rFonts w:ascii="Amasis MT Pro" w:hAnsi="Amasis MT Pro"/>
@@ -1572,19 +1747,19 @@
           <w:sz w:val="28"/>
           <w:szCs w:val="28"/>
         </w:rPr>
-        <w:t>Con il Controller avremo le interazioni dell’utente che modificano/aggiornano Model e View in maniera tale da creare dinamicità nell’UX e una determinata coesione tra i vari componenti.</w:t>
-      </w:r>
-    </w:p>
-    <w:p>
-      <w:pPr>
-        <w:jc w:val="both"/>
+        <w:t xml:space="preserve"> abbiamo adoperato il sistema delle </w:t>
+      </w:r>
+      <w:proofErr w:type="spellStart"/>
+      <w:r>
         <w:rPr>
           <w:rFonts w:ascii="Amasis MT Pro" w:hAnsi="Amasis MT Pro"/>
           <w:color w:val="000000" w:themeColor="text1"/>
           <w:sz w:val="28"/>
           <w:szCs w:val="28"/>
         </w:rPr>
-      </w:pPr>
+        <w:t>View</w:t>
+      </w:r>
+      <w:proofErr w:type="spellEnd"/>
       <w:r>
         <w:rPr>
           <w:rFonts w:ascii="Amasis MT Pro" w:hAnsi="Amasis MT Pro"/>
@@ -1592,6 +1767,121 @@
           <w:sz w:val="28"/>
           <w:szCs w:val="28"/>
         </w:rPr>
+        <w:t xml:space="preserve"> di Android Studio per gestire quella che poteva essere l’UI (interfaccia utente) migliore anche analizzando l’ipotetico pubblico a cui può essere diretta l’applicazione.</w:t>
+      </w:r>
+    </w:p>
+    <w:p>
+      <w:pPr>
+        <w:rPr>
+          <w:rFonts w:ascii="Amasis MT Pro" w:hAnsi="Amasis MT Pro"/>
+          <w:color w:val="000000" w:themeColor="text1"/>
+          <w:sz w:val="28"/>
+          <w:szCs w:val="28"/>
+        </w:rPr>
+      </w:pPr>
+      <w:r>
+        <w:rPr>
+          <w:rFonts w:ascii="Amasis MT Pro" w:hAnsi="Amasis MT Pro"/>
+          <w:color w:val="000000" w:themeColor="text1"/>
+          <w:sz w:val="28"/>
+          <w:szCs w:val="28"/>
+        </w:rPr>
+        <w:t xml:space="preserve">Con il Controller avremo le interazioni dell’utente che modificano/aggiornano Model e </w:t>
+      </w:r>
+      <w:proofErr w:type="spellStart"/>
+      <w:r>
+        <w:rPr>
+          <w:rFonts w:ascii="Amasis MT Pro" w:hAnsi="Amasis MT Pro"/>
+          <w:color w:val="000000" w:themeColor="text1"/>
+          <w:sz w:val="28"/>
+          <w:szCs w:val="28"/>
+        </w:rPr>
+        <w:t>View</w:t>
+      </w:r>
+      <w:proofErr w:type="spellEnd"/>
+      <w:r>
+        <w:rPr>
+          <w:rFonts w:ascii="Amasis MT Pro" w:hAnsi="Amasis MT Pro"/>
+          <w:color w:val="000000" w:themeColor="text1"/>
+          <w:sz w:val="28"/>
+          <w:szCs w:val="28"/>
+        </w:rPr>
+        <w:t xml:space="preserve"> in maniera tale da creare dinamicità nell’UX e una determinata coesione tra i vari componenti.</w:t>
+      </w:r>
+    </w:p>
+    <w:p>
+      <w:pPr>
+        <w:rPr>
+          <w:rFonts w:ascii="Amasis MT Pro" w:hAnsi="Amasis MT Pro"/>
+          <w:color w:val="000000" w:themeColor="text1"/>
+          <w:sz w:val="28"/>
+          <w:szCs w:val="28"/>
+        </w:rPr>
+      </w:pPr>
+      <w:r>
+        <w:rPr>
+          <w:rFonts w:ascii="Amasis MT Pro" w:hAnsi="Amasis MT Pro"/>
+          <w:color w:val="000000" w:themeColor="text1"/>
+          <w:sz w:val="28"/>
+          <w:szCs w:val="28"/>
+        </w:rPr>
+        <w:t xml:space="preserve">Per realizzare tutto ciò sfrutteremo anche </w:t>
+      </w:r>
+      <w:proofErr w:type="spellStart"/>
+      <w:r>
+        <w:rPr>
+          <w:rFonts w:ascii="Amasis MT Pro" w:hAnsi="Amasis MT Pro"/>
+          <w:color w:val="000000" w:themeColor="text1"/>
+          <w:sz w:val="28"/>
+          <w:szCs w:val="28"/>
+        </w:rPr>
+        <w:t>SharedPreferences</w:t>
+      </w:r>
+      <w:proofErr w:type="spellEnd"/>
+      <w:r>
+        <w:rPr>
+          <w:rFonts w:ascii="Amasis MT Pro" w:hAnsi="Amasis MT Pro"/>
+          <w:color w:val="000000" w:themeColor="text1"/>
+          <w:sz w:val="28"/>
+          <w:szCs w:val="28"/>
+        </w:rPr>
+        <w:t xml:space="preserve">, una classe </w:t>
+      </w:r>
+      <w:r>
+        <w:rPr>
+          <w:rFonts w:ascii="Amasis MT Pro" w:hAnsi="Amasis MT Pro"/>
+          <w:color w:val="000000" w:themeColor="text1"/>
+          <w:sz w:val="28"/>
+          <w:szCs w:val="28"/>
+        </w:rPr>
+        <w:t xml:space="preserve">di </w:t>
+      </w:r>
+      <w:r>
+        <w:rPr>
+          <w:rFonts w:ascii="Amasis MT Pro" w:hAnsi="Amasis MT Pro"/>
+          <w:color w:val="000000" w:themeColor="text1"/>
+          <w:sz w:val="28"/>
+          <w:szCs w:val="28"/>
+        </w:rPr>
+        <w:t>Android che permette di salvare dati in modo persistente sotto forma di coppie chiave-valore. È molto utile per memorizzare piccole quantità di dati.</w:t>
+      </w:r>
+    </w:p>
+    <w:p>
+      <w:pPr>
+        <w:rPr>
+          <w:rFonts w:ascii="Amasis MT Pro" w:hAnsi="Amasis MT Pro"/>
+          <w:color w:val="000000" w:themeColor="text1"/>
+          <w:sz w:val="28"/>
+          <w:szCs w:val="28"/>
+        </w:rPr>
+      </w:pPr>
+      <w:r>
+        <w:rPr>
+          <w:rFonts w:ascii="Amasis MT Pro" w:hAnsi="Amasis MT Pro"/>
+          <w:color w:val="000000" w:themeColor="text1"/>
+          <w:sz w:val="28"/>
+          <w:szCs w:val="28"/>
+        </w:rPr>
         <w:t xml:space="preserve">Nella parte user cliente in app si può avere una lista dei nostri animali, possiamo aggiungere le loro caratteristiche e catalogare il loro stato d’animo e </w:t>
       </w:r>
       <w:r>
@@ -1651,7 +1941,6 @@
     </w:p>
     <w:p>
       <w:pPr>
-        <w:jc w:val="both"/>
         <w:rPr>
           <w:rFonts w:ascii="Amasis MT Pro" w:hAnsi="Amasis MT Pro"/>
           <w:color w:val="000000" w:themeColor="text1"/>
@@ -1671,7 +1960,6 @@
     </w:p>
     <w:p>
       <w:pPr>
-        <w:jc w:val="both"/>
         <w:rPr>
           <w:rFonts w:ascii="Amasis MT Pro" w:hAnsi="Amasis MT Pro"/>
           <w:sz w:val="28"/>
@@ -1692,7 +1980,25 @@
           <w:sz w:val="28"/>
           <w:szCs w:val="28"/>
         </w:rPr>
-        <w:t>bbiamo usato “Fork”, un sistema collegato a GitHub per scambiarci file</w:t>
+        <w:t>bbiamo usato “</w:t>
+      </w:r>
+      <w:proofErr w:type="spellStart"/>
+      <w:r>
+        <w:rPr>
+          <w:rFonts w:ascii="Amasis MT Pro" w:hAnsi="Amasis MT Pro"/>
+          <w:sz w:val="28"/>
+          <w:szCs w:val="28"/>
+        </w:rPr>
+        <w:t>Fork</w:t>
+      </w:r>
+      <w:proofErr w:type="spellEnd"/>
+      <w:r>
+        <w:rPr>
+          <w:rFonts w:ascii="Amasis MT Pro" w:hAnsi="Amasis MT Pro"/>
+          <w:sz w:val="28"/>
+          <w:szCs w:val="28"/>
+        </w:rPr>
+        <w:t>”, un sistema collegato a GitHub per scambiarci file</w:t>
       </w:r>
       <w:r>
         <w:rPr>
@@ -1707,133 +2013,62 @@
       <w:pPr>
         <w:rPr>
           <w:rFonts w:ascii="Amasis MT Pro" w:hAnsi="Amasis MT Pro"/>
-          <w:sz w:val="28"/>
-          <w:szCs w:val="28"/>
-        </w:rPr>
-      </w:pPr>
-    </w:p>
-    <w:p>
-      <w:pPr>
-        <w:rPr>
-          <w:rFonts w:ascii="Amasis MT Pro" w:hAnsi="Amasis MT Pro"/>
-          <w:sz w:val="28"/>
-          <w:szCs w:val="28"/>
-        </w:rPr>
-      </w:pPr>
-    </w:p>
-    <w:p>
-      <w:pPr>
-        <w:rPr>
-          <w:rFonts w:ascii="Amasis MT Pro" w:hAnsi="Amasis MT Pro"/>
-          <w:sz w:val="36"/>
-          <w:szCs w:val="36"/>
-        </w:rPr>
-      </w:pPr>
-    </w:p>
-    <w:p>
-      <w:pPr>
-        <w:rPr>
-          <w:rFonts w:ascii="Amasis MT Pro" w:hAnsi="Amasis MT Pro"/>
-          <w:sz w:val="36"/>
-          <w:szCs w:val="36"/>
-        </w:rPr>
-      </w:pPr>
-    </w:p>
-    <w:p>
-      <w:pPr>
-        <w:rPr>
-          <w:rFonts w:ascii="Amasis MT Pro" w:hAnsi="Amasis MT Pro"/>
-          <w:sz w:val="36"/>
-          <w:szCs w:val="36"/>
-        </w:rPr>
-      </w:pPr>
-    </w:p>
-    <w:p>
-      <w:pPr>
-        <w:rPr>
-          <w:rFonts w:ascii="Amasis MT Pro" w:hAnsi="Amasis MT Pro"/>
-          <w:sz w:val="36"/>
-          <w:szCs w:val="36"/>
-        </w:rPr>
-      </w:pPr>
-    </w:p>
-    <w:p>
-      <w:pPr>
-        <w:rPr>
-          <w:rFonts w:ascii="Amasis MT Pro" w:hAnsi="Amasis MT Pro"/>
-          <w:sz w:val="36"/>
-          <w:szCs w:val="36"/>
-        </w:rPr>
-      </w:pPr>
-    </w:p>
-    <w:p>
-      <w:pPr>
-        <w:rPr>
-          <w:rFonts w:ascii="Amasis MT Pro" w:hAnsi="Amasis MT Pro"/>
-          <w:sz w:val="36"/>
-          <w:szCs w:val="36"/>
-        </w:rPr>
-      </w:pPr>
-    </w:p>
-    <w:p>
-      <w:pPr>
-        <w:rPr>
-          <w:rFonts w:ascii="Amasis MT Pro" w:hAnsi="Amasis MT Pro"/>
-          <w:sz w:val="36"/>
-          <w:szCs w:val="36"/>
-        </w:rPr>
-      </w:pPr>
-    </w:p>
-    <w:p>
-      <w:pPr>
-        <w:rPr>
-          <w:rFonts w:ascii="Amasis MT Pro" w:hAnsi="Amasis MT Pro"/>
-          <w:sz w:val="36"/>
-          <w:szCs w:val="36"/>
-        </w:rPr>
-      </w:pPr>
-    </w:p>
-    <w:p>
-      <w:pPr>
-        <w:rPr>
-          <w:rFonts w:ascii="Amasis MT Pro" w:hAnsi="Amasis MT Pro"/>
-          <w:sz w:val="36"/>
-          <w:szCs w:val="36"/>
-        </w:rPr>
-      </w:pPr>
-    </w:p>
-    <w:p>
-      <w:pPr>
-        <w:rPr>
-          <w:rFonts w:ascii="Amasis MT Pro" w:hAnsi="Amasis MT Pro"/>
-          <w:sz w:val="36"/>
-          <w:szCs w:val="36"/>
-        </w:rPr>
-      </w:pPr>
-    </w:p>
-    <w:p>
-      <w:pPr>
-        <w:rPr>
-          <w:rFonts w:ascii="Amasis MT Pro" w:hAnsi="Amasis MT Pro"/>
-          <w:sz w:val="36"/>
-          <w:szCs w:val="36"/>
-        </w:rPr>
-      </w:pPr>
-    </w:p>
-    <w:p>
-      <w:pPr>
-        <w:rPr>
-          <w:rFonts w:ascii="Amasis MT Pro" w:hAnsi="Amasis MT Pro"/>
-          <w:sz w:val="36"/>
-          <w:szCs w:val="36"/>
-        </w:rPr>
-      </w:pPr>
-      <w:r>
-        <w:rPr>
-          <w:rFonts w:ascii="Amasis MT Pro" w:hAnsi="Amasis MT Pro"/>
-          <w:sz w:val="36"/>
-          <w:szCs w:val="36"/>
-        </w:rPr>
+          <w:sz w:val="32"/>
+          <w:szCs w:val="32"/>
+        </w:rPr>
+      </w:pPr>
+    </w:p>
+    <w:p>
+      <w:pPr>
+        <w:rPr>
+          <w:rFonts w:ascii="Amasis MT Pro" w:hAnsi="Amasis MT Pro"/>
+          <w:sz w:val="28"/>
+          <w:szCs w:val="28"/>
+        </w:rPr>
+      </w:pPr>
+    </w:p>
+    <w:p>
+      <w:pPr>
+        <w:rPr>
+          <w:rFonts w:ascii="Amasis MT Pro" w:hAnsi="Amasis MT Pro"/>
+          <w:sz w:val="36"/>
+          <w:szCs w:val="36"/>
+        </w:rPr>
+      </w:pPr>
+    </w:p>
+    <w:p>
+      <w:pPr>
+        <w:rPr>
+          <w:rFonts w:ascii="Amasis MT Pro" w:hAnsi="Amasis MT Pro"/>
+          <w:sz w:val="36"/>
+          <w:szCs w:val="36"/>
+        </w:rPr>
+      </w:pPr>
+    </w:p>
+    <w:p>
+      <w:pPr>
+        <w:rPr>
+          <w:rFonts w:ascii="Amasis MT Pro" w:hAnsi="Amasis MT Pro"/>
+          <w:sz w:val="36"/>
+          <w:szCs w:val="36"/>
+        </w:rPr>
+      </w:pPr>
+    </w:p>
+    <w:p>
+      <w:pPr>
+        <w:rPr>
+          <w:rFonts w:ascii="Amasis MT Pro" w:hAnsi="Amasis MT Pro"/>
+          <w:sz w:val="36"/>
+          <w:szCs w:val="36"/>
+        </w:rPr>
+      </w:pPr>
+      <w:r>
+        <w:rPr>
+          <w:rFonts w:ascii="Amasis MT Pro" w:hAnsi="Amasis MT Pro"/>
+          <w:sz w:val="36"/>
+          <w:szCs w:val="36"/>
+        </w:rPr>
+        <w:lastRenderedPageBreak/>
         <w:t>Materiale utilizzato</w:t>
       </w:r>
     </w:p>
@@ -1873,17 +2108,17 @@
           <w:szCs w:val="36"/>
         </w:rPr>
         <w:drawing>
-          <wp:anchor distT="0" distB="0" distL="114300" distR="114300" simplePos="0" relativeHeight="251668480" behindDoc="0" locked="0" layoutInCell="1" allowOverlap="1" wp14:anchorId="0870CAD4" wp14:editId="1E86162D">
+          <wp:anchor distT="0" distB="0" distL="114300" distR="114300" simplePos="0" relativeHeight="251668480" behindDoc="1" locked="0" layoutInCell="1" allowOverlap="1" wp14:anchorId="0870CAD4" wp14:editId="5937ECD3">
             <wp:simplePos x="0" y="0"/>
             <wp:positionH relativeFrom="margin">
-              <wp:align>left</wp:align>
+              <wp:posOffset>3851910</wp:posOffset>
             </wp:positionH>
             <wp:positionV relativeFrom="paragraph">
-              <wp:posOffset>5715</wp:posOffset>
+              <wp:posOffset>210185</wp:posOffset>
             </wp:positionV>
-            <wp:extent cx="1714500" cy="1714500"/>
-            <wp:effectExtent l="209550" t="0" r="0" b="114300"/>
-            <wp:wrapSquare wrapText="bothSides"/>
+            <wp:extent cx="1790700" cy="1790700"/>
+            <wp:effectExtent l="0" t="0" r="0" b="0"/>
+            <wp:wrapNone/>
             <wp:docPr id="680329586" name="Immagine 4"/>
             <wp:cNvGraphicFramePr>
               <a:graphicFrameLocks xmlns:a="http://schemas.openxmlformats.org/drawingml/2006/main" noChangeAspect="1"/>
@@ -1908,9 +2143,9 @@
                     </a:stretch>
                   </pic:blipFill>
                   <pic:spPr>
-                    <a:xfrm rot="3787816">
+                    <a:xfrm>
                       <a:off x="0" y="0"/>
-                      <a:ext cx="1714500" cy="1714500"/>
+                      <a:ext cx="1790700" cy="1790700"/>
                     </a:xfrm>
                     <a:prstGeom prst="rect">
                       <a:avLst/>
@@ -1919,45 +2154,32 @@
                 </pic:pic>
               </a:graphicData>
             </a:graphic>
+            <wp14:sizeRelH relativeFrom="margin">
+              <wp14:pctWidth>0</wp14:pctWidth>
+            </wp14:sizeRelH>
+            <wp14:sizeRelV relativeFrom="margin">
+              <wp14:pctHeight>0</wp14:pctHeight>
+            </wp14:sizeRelV>
           </wp:anchor>
         </w:drawing>
       </w:r>
       <w:r>
         <w:rPr>
-          <w:rFonts w:ascii="Amasis MT Pro" w:hAnsi="Amasis MT Pro"/>
-          <w:sz w:val="36"/>
-          <w:szCs w:val="36"/>
-        </w:rPr>
-        <w:tab/>
-      </w:r>
-    </w:p>
-    <w:p>
-      <w:pPr>
-        <w:rPr>
-          <w:rFonts w:ascii="Amasis MT Pro" w:hAnsi="Amasis MT Pro"/>
-          <w:sz w:val="36"/>
-          <w:szCs w:val="36"/>
-        </w:rPr>
-      </w:pPr>
-    </w:p>
-    <w:p>
-      <w:pPr>
-        <w:rPr>
-          <w:rFonts w:ascii="Amasis MT Pro" w:hAnsi="Amasis MT Pro"/>
-          <w:sz w:val="36"/>
-          <w:szCs w:val="36"/>
-        </w:rPr>
-      </w:pPr>
-      <w:r>
-        <w:rPr>
           <w:noProof/>
         </w:rPr>
-        <w:lastRenderedPageBreak/>
         <w:drawing>
-          <wp:inline distT="0" distB="0" distL="0" distR="0" wp14:anchorId="182C0C20" wp14:editId="7C6E442F">
-            <wp:extent cx="2216150" cy="1892075"/>
-            <wp:effectExtent l="323850" t="400050" r="260350" b="413385"/>
-            <wp:docPr id="1625705468" name="Immagine 1" descr="GitHub Service | Princeton Research Computing"/>
+          <wp:anchor distT="0" distB="0" distL="114300" distR="114300" simplePos="0" relativeHeight="251672576" behindDoc="0" locked="0" layoutInCell="1" allowOverlap="1" wp14:anchorId="2B2F321B" wp14:editId="02F5FFFF">
+            <wp:simplePos x="0" y="0"/>
+            <wp:positionH relativeFrom="margin">
+              <wp:align>left</wp:align>
+            </wp:positionH>
+            <wp:positionV relativeFrom="paragraph">
+              <wp:posOffset>13970</wp:posOffset>
+            </wp:positionV>
+            <wp:extent cx="2047875" cy="2047875"/>
+            <wp:effectExtent l="0" t="0" r="9525" b="9525"/>
+            <wp:wrapNone/>
+            <wp:docPr id="1438743369" name="Immagine 2" descr="Python Logo transparent PNG - StickPNG"/>
             <wp:cNvGraphicFramePr>
               <a:graphicFrameLocks xmlns:a="http://schemas.openxmlformats.org/drawingml/2006/main" noChangeAspect="1"/>
             </wp:cNvGraphicFramePr>
@@ -1965,7 +2187,7 @@
               <a:graphicData uri="http://schemas.openxmlformats.org/drawingml/2006/picture">
                 <pic:pic xmlns:pic="http://schemas.openxmlformats.org/drawingml/2006/picture">
                   <pic:nvPicPr>
-                    <pic:cNvPr id="0" name="Picture 1" descr="GitHub Service | Princeton Research Computing"/>
+                    <pic:cNvPr id="0" name="Picture 3" descr="Python Logo transparent PNG - StickPNG"/>
                     <pic:cNvPicPr>
                       <a:picLocks noChangeAspect="1" noChangeArrowheads="1"/>
                     </pic:cNvPicPr>
@@ -1984,9 +2206,9 @@
                     </a:stretch>
                   </pic:blipFill>
                   <pic:spPr bwMode="auto">
-                    <a:xfrm rot="9188844" flipV="1">
+                    <a:xfrm>
                       <a:off x="0" y="0"/>
-                      <a:ext cx="2220830" cy="1896071"/>
+                      <a:ext cx="2047875" cy="2047875"/>
                     </a:xfrm>
                     <a:prstGeom prst="rect">
                       <a:avLst/>
@@ -1999,18 +2221,142 @@
                 </pic:pic>
               </a:graphicData>
             </a:graphic>
-          </wp:inline>
+            <wp14:sizeRelH relativeFrom="margin">
+              <wp14:pctWidth>0</wp14:pctWidth>
+            </wp14:sizeRelH>
+            <wp14:sizeRelV relativeFrom="margin">
+              <wp14:pctHeight>0</wp14:pctHeight>
+            </wp14:sizeRelV>
+          </wp:anchor>
         </w:drawing>
       </w:r>
       <w:r>
         <w:rPr>
+          <w:rFonts w:ascii="Amasis MT Pro" w:hAnsi="Amasis MT Pro"/>
+          <w:sz w:val="36"/>
+          <w:szCs w:val="36"/>
+        </w:rPr>
+        <w:tab/>
+      </w:r>
+    </w:p>
+    <w:p>
+      <w:pPr>
+        <w:rPr>
+          <w:rFonts w:ascii="Amasis MT Pro" w:hAnsi="Amasis MT Pro"/>
+          <w:sz w:val="36"/>
+          <w:szCs w:val="36"/>
+        </w:rPr>
+      </w:pPr>
+    </w:p>
+    <w:p>
+      <w:pPr>
+        <w:tabs>
+          <w:tab w:val="left" w:pos="7200"/>
+        </w:tabs>
+        <w:rPr>
+          <w:rFonts w:ascii="Amasis MT Pro" w:hAnsi="Amasis MT Pro"/>
+          <w:sz w:val="36"/>
+          <w:szCs w:val="36"/>
+        </w:rPr>
+      </w:pPr>
+      <w:r>
+        <w:rPr>
+          <w:rFonts w:ascii="Amasis MT Pro" w:hAnsi="Amasis MT Pro"/>
+          <w:sz w:val="36"/>
+          <w:szCs w:val="36"/>
+        </w:rPr>
+        <w:tab/>
+      </w:r>
+    </w:p>
+    <w:p>
+      <w:pPr>
+        <w:rPr>
+          <w:rFonts w:ascii="Amasis MT Pro" w:hAnsi="Amasis MT Pro"/>
+          <w:sz w:val="36"/>
+          <w:szCs w:val="36"/>
+        </w:rPr>
+      </w:pPr>
+    </w:p>
+    <w:p>
+      <w:pPr>
+        <w:tabs>
+          <w:tab w:val="left" w:pos="3645"/>
+        </w:tabs>
+        <w:rPr>
+          <w:rFonts w:ascii="Amasis MT Pro" w:hAnsi="Amasis MT Pro"/>
+          <w:sz w:val="36"/>
+          <w:szCs w:val="36"/>
+        </w:rPr>
+      </w:pPr>
+      <w:r>
+        <w:rPr>
+          <w:rFonts w:ascii="Amasis MT Pro" w:hAnsi="Amasis MT Pro"/>
+          <w:sz w:val="36"/>
+          <w:szCs w:val="36"/>
+        </w:rPr>
+        <w:tab/>
+      </w:r>
+    </w:p>
+    <w:p>
+      <w:pPr>
+        <w:rPr>
+          <w:rFonts w:ascii="Amasis MT Pro" w:hAnsi="Amasis MT Pro"/>
+          <w:sz w:val="36"/>
+          <w:szCs w:val="36"/>
+        </w:rPr>
+      </w:pPr>
+    </w:p>
+    <w:p>
+      <w:pPr>
+        <w:rPr>
+          <w:rFonts w:ascii="Amasis MT Pro" w:hAnsi="Amasis MT Pro"/>
+          <w:sz w:val="36"/>
+          <w:szCs w:val="36"/>
+        </w:rPr>
+      </w:pPr>
+      <w:r>
+        <w:rPr>
+          <w:rFonts w:ascii="Amasis MT Pro" w:hAnsi="Amasis MT Pro"/>
           <w:noProof/>
+          <w:sz w:val="36"/>
+          <w:szCs w:val="36"/>
         </w:rPr>
         <w:drawing>
-          <wp:inline distT="0" distB="0" distL="0" distR="0" wp14:anchorId="2A3EFFEB" wp14:editId="2B00E615">
-            <wp:extent cx="2139950" cy="2139950"/>
-            <wp:effectExtent l="438150" t="438150" r="336550" b="431800"/>
-            <wp:docPr id="1438743369" name="Immagine 2" descr="Python Logo transparent PNG - StickPNG"/>
+          <wp:anchor distT="0" distB="0" distL="114300" distR="114300" simplePos="0" relativeHeight="251674624" behindDoc="0" locked="0" layoutInCell="1" allowOverlap="1" wp14:anchorId="5999B6C0" wp14:editId="602321BE">
+            <wp:simplePos x="0" y="0"/>
+            <wp:positionH relativeFrom="margin">
+              <wp:align>right</wp:align>
+            </wp:positionH>
+            <wp:positionV relativeFrom="paragraph">
+              <wp:posOffset>8255</wp:posOffset>
+            </wp:positionV>
+            <wp:extent cx="2733675" cy="1781175"/>
+            <wp:effectExtent l="0" t="0" r="0" b="0"/>
+            <wp:wrapThrough wrapText="bothSides">
+              <wp:wrapPolygon edited="0">
+                <wp:start x="12042" y="1155"/>
+                <wp:lineTo x="9332" y="3465"/>
+                <wp:lineTo x="6924" y="5082"/>
+                <wp:lineTo x="6472" y="6237"/>
+                <wp:lineTo x="6623" y="7393"/>
+                <wp:lineTo x="7526" y="9010"/>
+                <wp:lineTo x="6472" y="11089"/>
+                <wp:lineTo x="6774" y="12706"/>
+                <wp:lineTo x="10085" y="12706"/>
+                <wp:lineTo x="3010" y="16402"/>
+                <wp:lineTo x="3462" y="19405"/>
+                <wp:lineTo x="18364" y="19405"/>
+                <wp:lineTo x="18665" y="18481"/>
+                <wp:lineTo x="18213" y="17326"/>
+                <wp:lineTo x="17461" y="16402"/>
+                <wp:lineTo x="15203" y="12706"/>
+                <wp:lineTo x="15353" y="4158"/>
+                <wp:lineTo x="14751" y="3003"/>
+                <wp:lineTo x="13246" y="1155"/>
+                <wp:lineTo x="12042" y="1155"/>
+              </wp:wrapPolygon>
+            </wp:wrapThrough>
+            <wp:docPr id="19385226" name="Immagine 6" descr="Immagine che contiene Carattere, Elementi grafici, simbolo, logo&#10;&#10;Il contenuto generato dall'IA potrebbe non essere corretto."/>
             <wp:cNvGraphicFramePr>
               <a:graphicFrameLocks xmlns:a="http://schemas.openxmlformats.org/drawingml/2006/main" noChangeAspect="1"/>
             </wp:cNvGraphicFramePr>
@@ -2018,10 +2364,8 @@
               <a:graphicData uri="http://schemas.openxmlformats.org/drawingml/2006/picture">
                 <pic:pic xmlns:pic="http://schemas.openxmlformats.org/drawingml/2006/picture">
                   <pic:nvPicPr>
-                    <pic:cNvPr id="0" name="Picture 3" descr="Python Logo transparent PNG - StickPNG"/>
-                    <pic:cNvPicPr>
-                      <a:picLocks noChangeAspect="1" noChangeArrowheads="1"/>
-                    </pic:cNvPicPr>
+                    <pic:cNvPr id="19385226" name="Immagine 6" descr="Immagine che contiene Carattere, Elementi grafici, simbolo, logo&#10;&#10;Il contenuto generato dall'IA potrebbe non essere corretto."/>
+                    <pic:cNvPicPr/>
                   </pic:nvPicPr>
                   <pic:blipFill>
                     <a:blip r:embed="rId10">
@@ -2031,28 +2375,29 @@
                         </a:ext>
                       </a:extLst>
                     </a:blip>
-                    <a:srcRect/>
                     <a:stretch>
                       <a:fillRect/>
                     </a:stretch>
                   </pic:blipFill>
-                  <pic:spPr bwMode="auto">
-                    <a:xfrm rot="3203913">
+                  <pic:spPr>
+                    <a:xfrm>
                       <a:off x="0" y="0"/>
-                      <a:ext cx="2139950" cy="2139950"/>
+                      <a:ext cx="2733675" cy="1781175"/>
                     </a:xfrm>
                     <a:prstGeom prst="rect">
                       <a:avLst/>
                     </a:prstGeom>
-                    <a:noFill/>
-                    <a:ln>
-                      <a:noFill/>
-                    </a:ln>
                   </pic:spPr>
                 </pic:pic>
               </a:graphicData>
             </a:graphic>
-          </wp:inline>
+            <wp14:sizeRelH relativeFrom="margin">
+              <wp14:pctWidth>0</wp14:pctWidth>
+            </wp14:sizeRelH>
+            <wp14:sizeRelV relativeFrom="margin">
+              <wp14:pctHeight>0</wp14:pctHeight>
+            </wp14:sizeRelV>
+          </wp:anchor>
         </w:drawing>
       </w:r>
       <w:r>
@@ -2060,9 +2405,17 @@
           <w:noProof/>
         </w:rPr>
         <w:drawing>
-          <wp:inline distT="0" distB="0" distL="0" distR="0" wp14:anchorId="3DC0E704" wp14:editId="25D91F3E">
-            <wp:extent cx="2139950" cy="2139950"/>
-            <wp:effectExtent l="419100" t="419100" r="336550" b="431800"/>
+          <wp:anchor distT="0" distB="0" distL="114300" distR="114300" simplePos="0" relativeHeight="251671552" behindDoc="0" locked="0" layoutInCell="1" allowOverlap="1" wp14:anchorId="3DC0E704" wp14:editId="572A9E4C">
+            <wp:simplePos x="0" y="0"/>
+            <wp:positionH relativeFrom="margin">
+              <wp:align>left</wp:align>
+            </wp:positionH>
+            <wp:positionV relativeFrom="paragraph">
+              <wp:posOffset>12700</wp:posOffset>
+            </wp:positionV>
+            <wp:extent cx="2076450" cy="2139950"/>
+            <wp:effectExtent l="0" t="0" r="0" b="0"/>
+            <wp:wrapNone/>
             <wp:docPr id="576618543" name="Immagine 3" descr="Flask SVG and transparent PNG icons | TechIcons"/>
             <wp:cNvGraphicFramePr>
               <a:graphicFrameLocks xmlns:a="http://schemas.openxmlformats.org/drawingml/2006/main" noChangeAspect="1"/>
@@ -2090,9 +2443,9 @@
                     </a:stretch>
                   </pic:blipFill>
                   <pic:spPr bwMode="auto">
-                    <a:xfrm rot="14114161">
+                    <a:xfrm>
                       <a:off x="0" y="0"/>
-                      <a:ext cx="2139950" cy="2139950"/>
+                      <a:ext cx="2076450" cy="2139950"/>
                     </a:xfrm>
                     <a:prstGeom prst="rect">
                       <a:avLst/>
@@ -2105,7 +2458,10 @@
                 </pic:pic>
               </a:graphicData>
             </a:graphic>
-          </wp:inline>
+            <wp14:sizeRelH relativeFrom="margin">
+              <wp14:pctWidth>0</wp14:pctWidth>
+            </wp14:sizeRelH>
+          </wp:anchor>
         </w:drawing>
       </w:r>
     </w:p>
@@ -2135,12 +2491,166 @@
           <w:szCs w:val="36"/>
         </w:rPr>
       </w:pPr>
-      <w:r>
-        <w:rPr>
-          <w:rFonts w:ascii="Amasis MT Pro" w:hAnsi="Amasis MT Pro"/>
-          <w:sz w:val="36"/>
-          <w:szCs w:val="36"/>
-        </w:rPr>
+    </w:p>
+    <w:p>
+      <w:pPr>
+        <w:rPr>
+          <w:rFonts w:ascii="Amasis MT Pro" w:hAnsi="Amasis MT Pro"/>
+          <w:sz w:val="36"/>
+          <w:szCs w:val="36"/>
+        </w:rPr>
+      </w:pPr>
+    </w:p>
+    <w:p>
+      <w:pPr>
+        <w:rPr>
+          <w:rFonts w:ascii="Amasis MT Pro" w:hAnsi="Amasis MT Pro"/>
+          <w:sz w:val="36"/>
+          <w:szCs w:val="36"/>
+        </w:rPr>
+      </w:pPr>
+    </w:p>
+    <w:p>
+      <w:pPr>
+        <w:rPr>
+          <w:rFonts w:ascii="Amasis MT Pro" w:hAnsi="Amasis MT Pro"/>
+          <w:sz w:val="36"/>
+          <w:szCs w:val="36"/>
+        </w:rPr>
+      </w:pPr>
+      <w:r>
+        <w:rPr>
+          <w:rFonts w:ascii="Amasis MT Pro" w:hAnsi="Amasis MT Pro"/>
+          <w:noProof/>
+          <w:sz w:val="36"/>
+          <w:szCs w:val="36"/>
+        </w:rPr>
+        <w:drawing>
+          <wp:anchor distT="0" distB="0" distL="114300" distR="114300" simplePos="0" relativeHeight="251673600" behindDoc="1" locked="0" layoutInCell="1" allowOverlap="1" wp14:anchorId="6799EEE8" wp14:editId="51D127D9">
+            <wp:simplePos x="0" y="0"/>
+            <wp:positionH relativeFrom="margin">
+              <wp:align>left</wp:align>
+            </wp:positionH>
+            <wp:positionV relativeFrom="paragraph">
+              <wp:posOffset>10795</wp:posOffset>
+            </wp:positionV>
+            <wp:extent cx="2857500" cy="1600200"/>
+            <wp:effectExtent l="0" t="0" r="0" b="0"/>
+            <wp:wrapNone/>
+            <wp:docPr id="131303338" name="Immagine 4" descr="Immagine che contiene Carattere, logo, Elementi grafici, simbolo&#10;&#10;Il contenuto generato dall'IA potrebbe non essere corretto."/>
+            <wp:cNvGraphicFramePr>
+              <a:graphicFrameLocks xmlns:a="http://schemas.openxmlformats.org/drawingml/2006/main" noChangeAspect="1"/>
+            </wp:cNvGraphicFramePr>
+            <a:graphic xmlns:a="http://schemas.openxmlformats.org/drawingml/2006/main">
+              <a:graphicData uri="http://schemas.openxmlformats.org/drawingml/2006/picture">
+                <pic:pic xmlns:pic="http://schemas.openxmlformats.org/drawingml/2006/picture">
+                  <pic:nvPicPr>
+                    <pic:cNvPr id="131303338" name="Immagine 4" descr="Immagine che contiene Carattere, logo, Elementi grafici, simbolo&#10;&#10;Il contenuto generato dall'IA potrebbe non essere corretto."/>
+                    <pic:cNvPicPr/>
+                  </pic:nvPicPr>
+                  <pic:blipFill>
+                    <a:blip r:embed="rId12">
+                      <a:extLst>
+                        <a:ext uri="{28A0092B-C50C-407E-A947-70E740481C1C}">
+                          <a14:useLocalDpi xmlns:a14="http://schemas.microsoft.com/office/drawing/2010/main" val="0"/>
+                        </a:ext>
+                      </a:extLst>
+                    </a:blip>
+                    <a:stretch>
+                      <a:fillRect/>
+                    </a:stretch>
+                  </pic:blipFill>
+                  <pic:spPr>
+                    <a:xfrm>
+                      <a:off x="0" y="0"/>
+                      <a:ext cx="2857500" cy="1600200"/>
+                    </a:xfrm>
+                    <a:prstGeom prst="rect">
+                      <a:avLst/>
+                    </a:prstGeom>
+                  </pic:spPr>
+                </pic:pic>
+              </a:graphicData>
+            </a:graphic>
+          </wp:anchor>
+        </w:drawing>
+      </w:r>
+    </w:p>
+    <w:p>
+      <w:pPr>
+        <w:rPr>
+          <w:rFonts w:ascii="Amasis MT Pro" w:hAnsi="Amasis MT Pro"/>
+          <w:noProof/>
+          <w:sz w:val="36"/>
+          <w:szCs w:val="36"/>
+        </w:rPr>
+      </w:pPr>
+    </w:p>
+    <w:p>
+      <w:pPr>
+        <w:rPr>
+          <w:rFonts w:ascii="Amasis MT Pro" w:hAnsi="Amasis MT Pro"/>
+          <w:noProof/>
+          <w:sz w:val="36"/>
+          <w:szCs w:val="36"/>
+        </w:rPr>
+      </w:pPr>
+    </w:p>
+    <w:p>
+      <w:pPr>
+        <w:rPr>
+          <w:rFonts w:ascii="Amasis MT Pro" w:hAnsi="Amasis MT Pro"/>
+          <w:noProof/>
+          <w:sz w:val="36"/>
+          <w:szCs w:val="36"/>
+        </w:rPr>
+      </w:pPr>
+    </w:p>
+    <w:p>
+      <w:pPr>
+        <w:rPr>
+          <w:rFonts w:ascii="Amasis MT Pro" w:hAnsi="Amasis MT Pro"/>
+          <w:noProof/>
+          <w:sz w:val="36"/>
+          <w:szCs w:val="36"/>
+        </w:rPr>
+      </w:pPr>
+    </w:p>
+    <w:p>
+      <w:pPr>
+        <w:rPr>
+          <w:rFonts w:ascii="Amasis MT Pro" w:hAnsi="Amasis MT Pro"/>
+          <w:noProof/>
+          <w:sz w:val="36"/>
+          <w:szCs w:val="36"/>
+        </w:rPr>
+      </w:pPr>
+    </w:p>
+    <w:p>
+      <w:pPr>
+        <w:rPr>
+          <w:rFonts w:ascii="Amasis MT Pro" w:hAnsi="Amasis MT Pro"/>
+          <w:noProof/>
+          <w:sz w:val="36"/>
+          <w:szCs w:val="36"/>
+        </w:rPr>
+      </w:pPr>
+    </w:p>
+    <w:p>
+      <w:pPr>
+        <w:rPr>
+          <w:rFonts w:ascii="Amasis MT Pro" w:hAnsi="Amasis MT Pro"/>
+          <w:sz w:val="36"/>
+          <w:szCs w:val="36"/>
+        </w:rPr>
+      </w:pPr>
+      <w:r>
+        <w:rPr>
+          <w:rFonts w:ascii="Amasis MT Pro" w:hAnsi="Amasis MT Pro"/>
+          <w:sz w:val="36"/>
+          <w:szCs w:val="36"/>
+        </w:rPr>
+        <w:lastRenderedPageBreak/>
         <w:t xml:space="preserve">Struttura dei dati e modello ER: </w:t>
       </w:r>
     </w:p>
@@ -2189,7 +2699,6 @@
           <w:sz w:val="28"/>
           <w:szCs w:val="28"/>
         </w:rPr>
-        <w:lastRenderedPageBreak/>
         <w:t xml:space="preserve">A seguire </w:t>
       </w:r>
       <w:r>
@@ -2382,7 +2891,7 @@
                     </pic:cNvPicPr>
                   </pic:nvPicPr>
                   <pic:blipFill>
-                    <a:blip r:embed="rId12" cstate="print">
+                    <a:blip r:embed="rId13" cstate="print">
                       <a:extLst>
                         <a:ext uri="{28A0092B-C50C-407E-A947-70E740481C1C}">
                           <a14:useLocalDpi xmlns:a14="http://schemas.microsoft.com/office/drawing/2010/main" val="0"/>
@@ -2446,6 +2955,7 @@
           <w:sz w:val="28"/>
           <w:szCs w:val="28"/>
         </w:rPr>
+        <w:lastRenderedPageBreak/>
         <w:t xml:space="preserve">Abbiamo creato il nostro Database per poter collegare il passaggio dei vari dati delle rispettive entità all’interno dell’applicazione. </w:t>
       </w:r>
     </w:p>
@@ -2497,8 +3007,25 @@
           <w:sz w:val="28"/>
           <w:szCs w:val="28"/>
         </w:rPr>
-        <w:lastRenderedPageBreak/>
-        <w:t>Ne seguono ulteriori considerazioni come la difficoltà eventuale di richiamare con precisione quei dati tramite Flask ad esempio, poiché</w:t>
+        <w:t xml:space="preserve">Ne seguono ulteriori considerazioni come la difficoltà eventuale di richiamare con precisione quei dati tramite </w:t>
+      </w:r>
+      <w:proofErr w:type="spellStart"/>
+      <w:r>
+        <w:rPr>
+          <w:rFonts w:ascii="Amasis MT Pro" w:hAnsi="Amasis MT Pro"/>
+          <w:sz w:val="28"/>
+          <w:szCs w:val="28"/>
+        </w:rPr>
+        <w:t>Flask</w:t>
+      </w:r>
+      <w:proofErr w:type="spellEnd"/>
+      <w:r>
+        <w:rPr>
+          <w:rFonts w:ascii="Amasis MT Pro" w:hAnsi="Amasis MT Pro"/>
+          <w:sz w:val="28"/>
+          <w:szCs w:val="28"/>
+        </w:rPr>
+        <w:t xml:space="preserve"> ad esempio, poiché</w:t>
       </w:r>
       <w:r>
         <w:rPr>
@@ -2589,7 +3116,7 @@
                     <pic:cNvPicPr/>
                   </pic:nvPicPr>
                   <pic:blipFill>
-                    <a:blip r:embed="rId13"/>
+                    <a:blip r:embed="rId14"/>
                     <a:stretch>
                       <a:fillRect/>
                     </a:stretch>
@@ -2622,71 +3149,9 @@
         <w:rPr>
           <w:rFonts w:ascii="Amasis MT Pro" w:hAnsi="Amasis MT Pro"/>
           <w:noProof/>
-          <w:sz w:val="28"/>
-          <w:szCs w:val="28"/>
         </w:rPr>
         <w:drawing>
-          <wp:anchor distT="0" distB="0" distL="114300" distR="114300" simplePos="0" relativeHeight="251669504" behindDoc="0" locked="0" layoutInCell="1" allowOverlap="1" wp14:anchorId="3C03726E" wp14:editId="3BDAA875">
-            <wp:simplePos x="0" y="0"/>
-            <wp:positionH relativeFrom="page">
-              <wp:posOffset>5367836</wp:posOffset>
-            </wp:positionH>
-            <wp:positionV relativeFrom="paragraph">
-              <wp:posOffset>641894</wp:posOffset>
-            </wp:positionV>
-            <wp:extent cx="1702435" cy="2095500"/>
-            <wp:effectExtent l="0" t="0" r="0" b="0"/>
-            <wp:wrapSquare wrapText="bothSides"/>
-            <wp:docPr id="355980297" name="Immagine 1"/>
-            <wp:cNvGraphicFramePr>
-              <a:graphicFrameLocks xmlns:a="http://schemas.openxmlformats.org/drawingml/2006/main" noChangeAspect="1"/>
-            </wp:cNvGraphicFramePr>
-            <a:graphic xmlns:a="http://schemas.openxmlformats.org/drawingml/2006/main">
-              <a:graphicData uri="http://schemas.openxmlformats.org/drawingml/2006/picture">
-                <pic:pic xmlns:pic="http://schemas.openxmlformats.org/drawingml/2006/picture">
-                  <pic:nvPicPr>
-                    <pic:cNvPr id="355980297" name=""/>
-                    <pic:cNvPicPr/>
-                  </pic:nvPicPr>
-                  <pic:blipFill rotWithShape="1">
-                    <a:blip r:embed="rId14">
-                      <a:extLst>
-                        <a:ext uri="{28A0092B-C50C-407E-A947-70E740481C1C}">
-                          <a14:useLocalDpi xmlns:a14="http://schemas.microsoft.com/office/drawing/2010/main" val="0"/>
-                        </a:ext>
-                      </a:extLst>
-                    </a:blip>
-                    <a:srcRect t="1" b="411"/>
-                    <a:stretch/>
-                  </pic:blipFill>
-                  <pic:spPr>
-                    <a:xfrm>
-                      <a:off x="0" y="0"/>
-                      <a:ext cx="1702435" cy="2095500"/>
-                    </a:xfrm>
-                    <a:prstGeom prst="rect">
-                      <a:avLst/>
-                    </a:prstGeom>
-                  </pic:spPr>
-                </pic:pic>
-              </a:graphicData>
-            </a:graphic>
-            <wp14:sizeRelH relativeFrom="margin">
-              <wp14:pctWidth>0</wp14:pctWidth>
-            </wp14:sizeRelH>
-            <wp14:sizeRelV relativeFrom="margin">
-              <wp14:pctHeight>0</wp14:pctHeight>
-            </wp14:sizeRelV>
-          </wp:anchor>
-        </w:drawing>
-      </w:r>
-      <w:r>
-        <w:rPr>
-          <w:rFonts w:ascii="Amasis MT Pro" w:hAnsi="Amasis MT Pro"/>
-          <w:noProof/>
-        </w:rPr>
-        <w:drawing>
-          <wp:inline distT="0" distB="0" distL="0" distR="0" wp14:anchorId="4F709D1C" wp14:editId="6E49BD23">
+          <wp:inline distT="0" distB="0" distL="0" distR="0" wp14:anchorId="1E1610CF" wp14:editId="4F8FA9B8">
             <wp:extent cx="4093029" cy="1604010"/>
             <wp:effectExtent l="0" t="0" r="3175" b="0"/>
             <wp:docPr id="1541094878" name="Immagine 1" descr="Immagine che contiene testo, schermata, Carattere, numero&#10;&#10;Il contenuto generato dall'IA potrebbe non essere corretto."/>
@@ -2721,22 +3186,77 @@
           </wp:inline>
         </w:drawing>
       </w:r>
-    </w:p>
-    <w:p>
-      <w:pPr>
-        <w:rPr>
-          <w:rFonts w:ascii="Amasis MT Pro" w:hAnsi="Amasis MT Pro"/>
-        </w:rPr>
-      </w:pPr>
       <w:r>
         <w:rPr>
           <w:rFonts w:ascii="Amasis MT Pro" w:hAnsi="Amasis MT Pro"/>
           <w:noProof/>
+          <w:sz w:val="28"/>
+          <w:szCs w:val="28"/>
         </w:rPr>
         <w:drawing>
-          <wp:inline distT="0" distB="0" distL="0" distR="0" wp14:anchorId="1E3C915F" wp14:editId="578BDEB7">
-            <wp:extent cx="4103914" cy="2382918"/>
+          <wp:anchor distT="0" distB="0" distL="114300" distR="114300" simplePos="0" relativeHeight="251669504" behindDoc="0" locked="0" layoutInCell="1" allowOverlap="1" wp14:anchorId="3C03726E" wp14:editId="3BDAA875">
+            <wp:simplePos x="0" y="0"/>
+            <wp:positionH relativeFrom="page">
+              <wp:posOffset>5367836</wp:posOffset>
+            </wp:positionH>
+            <wp:positionV relativeFrom="paragraph">
+              <wp:posOffset>641894</wp:posOffset>
+            </wp:positionV>
+            <wp:extent cx="1702435" cy="2095500"/>
             <wp:effectExtent l="0" t="0" r="0" b="0"/>
+            <wp:wrapSquare wrapText="bothSides"/>
+            <wp:docPr id="355980297" name="Immagine 1"/>
+            <wp:cNvGraphicFramePr>
+              <a:graphicFrameLocks xmlns:a="http://schemas.openxmlformats.org/drawingml/2006/main" noChangeAspect="1"/>
+            </wp:cNvGraphicFramePr>
+            <a:graphic xmlns:a="http://schemas.openxmlformats.org/drawingml/2006/main">
+              <a:graphicData uri="http://schemas.openxmlformats.org/drawingml/2006/picture">
+                <pic:pic xmlns:pic="http://schemas.openxmlformats.org/drawingml/2006/picture">
+                  <pic:nvPicPr>
+                    <pic:cNvPr id="355980297" name=""/>
+                    <pic:cNvPicPr/>
+                  </pic:nvPicPr>
+                  <pic:blipFill rotWithShape="1">
+                    <a:blip r:embed="rId16">
+                      <a:extLst>
+                        <a:ext uri="{28A0092B-C50C-407E-A947-70E740481C1C}">
+                          <a14:useLocalDpi xmlns:a14="http://schemas.microsoft.com/office/drawing/2010/main" val="0"/>
+                        </a:ext>
+                      </a:extLst>
+                    </a:blip>
+                    <a:srcRect t="1" b="411"/>
+                    <a:stretch/>
+                  </pic:blipFill>
+                  <pic:spPr>
+                    <a:xfrm>
+                      <a:off x="0" y="0"/>
+                      <a:ext cx="1702435" cy="2095500"/>
+                    </a:xfrm>
+                    <a:prstGeom prst="rect">
+                      <a:avLst/>
+                    </a:prstGeom>
+                  </pic:spPr>
+                </pic:pic>
+              </a:graphicData>
+            </a:graphic>
+            <wp14:sizeRelH relativeFrom="margin">
+              <wp14:pctWidth>0</wp14:pctWidth>
+            </wp14:sizeRelH>
+            <wp14:sizeRelV relativeFrom="margin">
+              <wp14:pctHeight>0</wp14:pctHeight>
+            </wp14:sizeRelV>
+          </wp:anchor>
+        </w:drawing>
+      </w:r>
+      <w:r>
+        <w:rPr>
+          <w:rFonts w:ascii="Amasis MT Pro" w:hAnsi="Amasis MT Pro"/>
+          <w:noProof/>
+        </w:rPr>
+        <w:drawing>
+          <wp:inline distT="0" distB="0" distL="0" distR="0" wp14:anchorId="184D0BF4" wp14:editId="04195461">
+            <wp:extent cx="4092575" cy="1983105"/>
+            <wp:effectExtent l="0" t="0" r="3175" b="0"/>
             <wp:docPr id="640867295" name="Immagine 1" descr="Immagine che contiene testo, schermata, numero, Carattere&#10;&#10;Il contenuto generato dall'IA potrebbe non essere corretto."/>
             <wp:cNvGraphicFramePr>
               <a:graphicFrameLocks xmlns:a="http://schemas.openxmlformats.org/drawingml/2006/main" noChangeAspect="1"/>
@@ -2749,7 +3269,7 @@
                     <pic:cNvPicPr/>
                   </pic:nvPicPr>
                   <pic:blipFill>
-                    <a:blip r:embed="rId16"/>
+                    <a:blip r:embed="rId17"/>
                     <a:stretch>
                       <a:fillRect/>
                     </a:stretch>
@@ -2757,7 +3277,7 @@
                   <pic:spPr>
                     <a:xfrm>
                       <a:off x="0" y="0"/>
-                      <a:ext cx="4122295" cy="2393591"/>
+                      <a:ext cx="4133311" cy="2002844"/>
                     </a:xfrm>
                     <a:prstGeom prst="rect">
                       <a:avLst/>
@@ -2774,6 +3294,42 @@
       <w:pPr>
         <w:rPr>
           <w:rFonts w:ascii="Amasis MT Pro" w:hAnsi="Amasis MT Pro"/>
+          <w:sz w:val="28"/>
+          <w:szCs w:val="28"/>
+        </w:rPr>
+      </w:pPr>
+      <w:r>
+        <w:rPr>
+          <w:rFonts w:ascii="Amasis MT Pro" w:hAnsi="Amasis MT Pro"/>
+          <w:sz w:val="28"/>
+          <w:szCs w:val="28"/>
+        </w:rPr>
+        <w:lastRenderedPageBreak/>
+        <w:t xml:space="preserve">Unendo la struttura dati del </w:t>
+      </w:r>
+      <w:proofErr w:type="spellStart"/>
+      <w:r>
+        <w:rPr>
+          <w:rFonts w:ascii="Amasis MT Pro" w:hAnsi="Amasis MT Pro"/>
+          <w:sz w:val="28"/>
+          <w:szCs w:val="28"/>
+        </w:rPr>
+        <w:t>Db</w:t>
+      </w:r>
+      <w:proofErr w:type="spellEnd"/>
+      <w:r>
+        <w:rPr>
+          <w:rFonts w:ascii="Amasis MT Pro" w:hAnsi="Amasis MT Pro"/>
+          <w:sz w:val="28"/>
+          <w:szCs w:val="28"/>
+        </w:rPr>
+        <w:t xml:space="preserve"> ed il modello ER da noi creato abbiamo riassunto tramite questo schema a tabelle tutti i principi fondamentali delle nostre entità specificando anche il tipo di rapporto che hanno (1:1; 1:N, N:N).</w:t>
+      </w:r>
+    </w:p>
+    <w:p>
+      <w:pPr>
+        <w:rPr>
+          <w:rFonts w:ascii="Amasis MT Pro" w:hAnsi="Amasis MT Pro"/>
           <w:noProof/>
         </w:rPr>
       </w:pPr>
@@ -2784,51 +3340,25 @@
           <w:rFonts w:ascii="Amasis MT Pro" w:hAnsi="Amasis MT Pro"/>
         </w:rPr>
       </w:pPr>
-    </w:p>
-    <w:p>
-      <w:pPr>
-        <w:rPr>
-          <w:rFonts w:ascii="Amasis MT Pro" w:hAnsi="Amasis MT Pro"/>
-          <w:sz w:val="28"/>
-          <w:szCs w:val="28"/>
-        </w:rPr>
-      </w:pPr>
-    </w:p>
-    <w:p>
-      <w:pPr>
-        <w:rPr>
-          <w:rFonts w:ascii="Amasis MT Pro" w:hAnsi="Amasis MT Pro"/>
-        </w:rPr>
-      </w:pPr>
-      <w:r>
-        <w:rPr>
-          <w:rFonts w:ascii="Amasis MT Pro" w:hAnsi="Amasis MT Pro"/>
-          <w:sz w:val="28"/>
-          <w:szCs w:val="28"/>
-        </w:rPr>
-        <w:lastRenderedPageBreak/>
-        <w:t>Unendo poi i due schemi otteniamo questi collegamenti:</w:t>
-      </w:r>
       <w:r>
         <w:rPr>
           <w:rFonts w:ascii="Amasis MT Pro" w:hAnsi="Amasis MT Pro"/>
           <w:noProof/>
-          <w:sz w:val="32"/>
-          <w:szCs w:val="32"/>
-        </w:rPr>
-        <w:t xml:space="preserve"> </w:t>
-      </w:r>
-      <w:r>
-        <w:rPr>
-          <w:rFonts w:ascii="Amasis MT Pro" w:hAnsi="Amasis MT Pro"/>
-          <w:noProof/>
           <w:sz w:val="28"/>
           <w:szCs w:val="28"/>
         </w:rPr>
         <w:drawing>
-          <wp:inline distT="0" distB="0" distL="0" distR="0" wp14:anchorId="74831214" wp14:editId="7417AA12">
-            <wp:extent cx="6119280" cy="4914900"/>
-            <wp:effectExtent l="0" t="0" r="0" b="0"/>
+          <wp:anchor distT="0" distB="0" distL="114300" distR="114300" simplePos="0" relativeHeight="251670528" behindDoc="0" locked="0" layoutInCell="1" allowOverlap="1" wp14:anchorId="74831214" wp14:editId="243B0B91">
+            <wp:simplePos x="0" y="0"/>
+            <wp:positionH relativeFrom="margin">
+              <wp:align>center</wp:align>
+            </wp:positionH>
+            <wp:positionV relativeFrom="paragraph">
+              <wp:posOffset>488950</wp:posOffset>
+            </wp:positionV>
+            <wp:extent cx="6697345" cy="5609590"/>
+            <wp:effectExtent l="0" t="0" r="8255" b="0"/>
+            <wp:wrapSquare wrapText="bothSides"/>
             <wp:docPr id="925959555" name="Immagine 2" descr="Immagine che contiene testo, diagramma, schermata, Piano"/>
             <wp:cNvGraphicFramePr>
               <a:graphicFrameLocks xmlns:a="http://schemas.openxmlformats.org/drawingml/2006/main" noChangeAspect="1"/>
@@ -2842,23 +3372,21 @@
                       <a:picLocks noChangeAspect="1" noChangeArrowheads="1"/>
                     </pic:cNvPicPr>
                   </pic:nvPicPr>
-                  <pic:blipFill>
-                    <a:blip r:embed="rId17" cstate="print">
+                  <pic:blipFill rotWithShape="1">
+                    <a:blip r:embed="rId18" cstate="print">
                       <a:extLst>
                         <a:ext uri="{28A0092B-C50C-407E-A947-70E740481C1C}">
                           <a14:useLocalDpi xmlns:a14="http://schemas.microsoft.com/office/drawing/2010/main" val="0"/>
                         </a:ext>
                       </a:extLst>
                     </a:blip>
-                    <a:srcRect/>
-                    <a:stretch>
-                      <a:fillRect/>
-                    </a:stretch>
+                    <a:srcRect l="2490" t="2929" r="2564" b="2481"/>
+                    <a:stretch/>
                   </pic:blipFill>
                   <pic:spPr bwMode="auto">
                     <a:xfrm>
                       <a:off x="0" y="0"/>
-                      <a:ext cx="6128956" cy="4922671"/>
+                      <a:ext cx="6697345" cy="5609590"/>
                     </a:xfrm>
                     <a:prstGeom prst="rect">
                       <a:avLst/>
@@ -2867,11 +3395,19 @@
                     <a:ln>
                       <a:noFill/>
                     </a:ln>
+                    <a:extLst>
+                      <a:ext uri="{53640926-AAD7-44D8-BBD7-CCE9431645EC}">
+                        <a14:shadowObscured xmlns:a14="http://schemas.microsoft.com/office/drawing/2010/main"/>
+                      </a:ext>
+                    </a:extLst>
                   </pic:spPr>
                 </pic:pic>
               </a:graphicData>
             </a:graphic>
-          </wp:inline>
+            <wp14:sizeRelV relativeFrom="margin">
+              <wp14:pctHeight>0</wp14:pctHeight>
+            </wp14:sizeRelV>
+          </wp:anchor>
         </w:drawing>
       </w:r>
     </w:p>
@@ -2888,71 +3424,16 @@
       <w:pPr>
         <w:rPr>
           <w:rFonts w:ascii="Amasis MT Pro" w:hAnsi="Amasis MT Pro"/>
-          <w:sz w:val="28"/>
-          <w:szCs w:val="28"/>
-        </w:rPr>
-      </w:pPr>
-    </w:p>
-    <w:p>
-      <w:pPr>
-        <w:rPr>
-          <w:rFonts w:ascii="Amasis MT Pro" w:hAnsi="Amasis MT Pro"/>
-          <w:sz w:val="28"/>
-          <w:szCs w:val="28"/>
-        </w:rPr>
-      </w:pPr>
-    </w:p>
-    <w:p>
-      <w:pPr>
-        <w:rPr>
-          <w:rFonts w:ascii="Amasis MT Pro" w:hAnsi="Amasis MT Pro"/>
-          <w:sz w:val="28"/>
-          <w:szCs w:val="28"/>
-        </w:rPr>
-      </w:pPr>
-    </w:p>
-    <w:p>
-      <w:pPr>
-        <w:rPr>
-          <w:rFonts w:ascii="Amasis MT Pro" w:hAnsi="Amasis MT Pro"/>
-          <w:sz w:val="28"/>
-          <w:szCs w:val="28"/>
-        </w:rPr>
-      </w:pPr>
-    </w:p>
-    <w:p>
-      <w:pPr>
-        <w:rPr>
-          <w:rFonts w:ascii="Amasis MT Pro" w:hAnsi="Amasis MT Pro"/>
-          <w:sz w:val="28"/>
-          <w:szCs w:val="28"/>
-        </w:rPr>
-      </w:pPr>
-    </w:p>
-    <w:p>
-      <w:pPr>
-        <w:rPr>
-          <w:rFonts w:ascii="Amasis MT Pro" w:hAnsi="Amasis MT Pro"/>
-          <w:sz w:val="28"/>
-          <w:szCs w:val="28"/>
-        </w:rPr>
-      </w:pPr>
-    </w:p>
-    <w:p>
-      <w:pPr>
-        <w:rPr>
-          <w:rFonts w:ascii="Amasis MT Pro" w:hAnsi="Amasis MT Pro"/>
-          <w:sz w:val="28"/>
-          <w:szCs w:val="28"/>
-        </w:rPr>
-      </w:pPr>
-    </w:p>
-    <w:p>
-      <w:pPr>
-        <w:rPr>
-          <w:rFonts w:ascii="Amasis MT Pro" w:hAnsi="Amasis MT Pro"/>
-          <w:sz w:val="28"/>
-          <w:szCs w:val="28"/>
+          <w:noProof/>
+          <w:sz w:val="28"/>
+          <w:szCs w:val="28"/>
+        </w:rPr>
+      </w:pPr>
+    </w:p>
+    <w:p>
+      <w:pPr>
+        <w:rPr>
+          <w:rFonts w:ascii="Amasis MT Pro" w:hAnsi="Amasis MT Pro"/>
         </w:rPr>
       </w:pPr>
     </w:p>
@@ -2980,7 +3461,33 @@
           <w:szCs w:val="28"/>
         </w:rPr>
         <w:lastRenderedPageBreak/>
-        <w:t>L’app è stata creata attraverso Android Studio con file xml per la parte grafica e file java per la logica. La versione Android che abbiamo usato è la versione 23 “Marshmallow”.</w:t>
+        <w:t>L’app è stata creata attraverso Android Studio</w:t>
+      </w:r>
+      <w:r>
+        <w:rPr>
+          <w:rFonts w:ascii="Amasis MT Pro" w:hAnsi="Amasis MT Pro"/>
+          <w:sz w:val="28"/>
+          <w:szCs w:val="28"/>
+        </w:rPr>
+        <w:t xml:space="preserve"> attraverso la gestione della cartella res comprensiva di </w:t>
+      </w:r>
+      <w:proofErr w:type="spellStart"/>
+      <w:r>
+        <w:rPr>
+          <w:rFonts w:ascii="Amasis MT Pro" w:hAnsi="Amasis MT Pro"/>
+          <w:sz w:val="28"/>
+          <w:szCs w:val="28"/>
+        </w:rPr>
+        <w:t>drawable</w:t>
+      </w:r>
+      <w:proofErr w:type="spellEnd"/>
+      <w:r>
+        <w:rPr>
+          <w:rFonts w:ascii="Amasis MT Pro" w:hAnsi="Amasis MT Pro"/>
+          <w:sz w:val="28"/>
+          <w:szCs w:val="28"/>
+        </w:rPr>
+        <w:t>, layout</w:t>
       </w:r>
       <w:r>
         <w:rPr>
@@ -2993,6 +3500,78 @@
       <w:r>
         <w:rPr>
           <w:rFonts w:ascii="Amasis MT Pro" w:hAnsi="Amasis MT Pro"/>
+          <w:sz w:val="28"/>
+          <w:szCs w:val="28"/>
+        </w:rPr>
+        <w:t>(</w:t>
+      </w:r>
+      <w:r>
+        <w:rPr>
+          <w:rFonts w:ascii="Amasis MT Pro" w:hAnsi="Amasis MT Pro"/>
+          <w:sz w:val="28"/>
+          <w:szCs w:val="28"/>
+        </w:rPr>
+        <w:t>con file xml per la parte grafica</w:t>
+      </w:r>
+      <w:r>
+        <w:rPr>
+          <w:rFonts w:ascii="Amasis MT Pro" w:hAnsi="Amasis MT Pro"/>
+          <w:sz w:val="28"/>
+          <w:szCs w:val="28"/>
+        </w:rPr>
+        <w:t>)</w:t>
+      </w:r>
+      <w:r>
+        <w:rPr>
+          <w:rFonts w:ascii="Amasis MT Pro" w:hAnsi="Amasis MT Pro"/>
+          <w:sz w:val="28"/>
+          <w:szCs w:val="28"/>
+        </w:rPr>
+        <w:t xml:space="preserve"> e </w:t>
+      </w:r>
+      <w:r>
+        <w:rPr>
+          <w:rFonts w:ascii="Amasis MT Pro" w:hAnsi="Amasis MT Pro"/>
+          <w:sz w:val="28"/>
+          <w:szCs w:val="28"/>
+        </w:rPr>
+        <w:t>file</w:t>
+      </w:r>
+      <w:r>
+        <w:rPr>
+          <w:rFonts w:ascii="Amasis MT Pro" w:hAnsi="Amasis MT Pro"/>
+          <w:sz w:val="28"/>
+          <w:szCs w:val="28"/>
+        </w:rPr>
+        <w:t xml:space="preserve"> java per la logica</w:t>
+      </w:r>
+      <w:r>
+        <w:rPr>
+          <w:rFonts w:ascii="Amasis MT Pro" w:hAnsi="Amasis MT Pro"/>
+          <w:sz w:val="28"/>
+          <w:szCs w:val="28"/>
+        </w:rPr>
+        <w:t xml:space="preserve"> delle activity e classi modello</w:t>
+      </w:r>
+      <w:r>
+        <w:rPr>
+          <w:rFonts w:ascii="Amasis MT Pro" w:hAnsi="Amasis MT Pro"/>
+          <w:sz w:val="28"/>
+          <w:szCs w:val="28"/>
+        </w:rPr>
+        <w:t>. La versione Android che abbiamo usato è la versione 23 “Marshmallow”.</w:t>
+      </w:r>
+      <w:r>
+        <w:rPr>
+          <w:rFonts w:ascii="Amasis MT Pro" w:hAnsi="Amasis MT Pro"/>
+          <w:sz w:val="28"/>
+          <w:szCs w:val="28"/>
+        </w:rPr>
+        <w:t xml:space="preserve"> </w:t>
+      </w:r>
+      <w:r>
+        <w:rPr>
+          <w:rFonts w:ascii="Amasis MT Pro" w:hAnsi="Amasis MT Pro"/>
           <w:color w:val="FF0000"/>
           <w:sz w:val="28"/>
           <w:szCs w:val="28"/>
@@ -3032,8 +3611,34 @@
           <w:sz w:val="28"/>
           <w:szCs w:val="28"/>
         </w:rPr>
-        <w:t>ed è stato usato Retrofit per sfruttare i collegamenti con gli endpoint di Flask</w:t>
-      </w:r>
+        <w:t>ed è stato usato Retrofit</w:t>
+      </w:r>
+      <w:r>
+        <w:rPr>
+          <w:rFonts w:ascii="Amasis MT Pro" w:hAnsi="Amasis MT Pro"/>
+          <w:sz w:val="28"/>
+          <w:szCs w:val="28"/>
+        </w:rPr>
+        <w:t xml:space="preserve"> come libreria</w:t>
+      </w:r>
+      <w:r>
+        <w:rPr>
+          <w:rFonts w:ascii="Amasis MT Pro" w:hAnsi="Amasis MT Pro"/>
+          <w:sz w:val="28"/>
+          <w:szCs w:val="28"/>
+        </w:rPr>
+        <w:t xml:space="preserve"> per sfruttare i collegamenti con gli endpoint di </w:t>
+      </w:r>
+      <w:proofErr w:type="spellStart"/>
+      <w:r>
+        <w:rPr>
+          <w:rFonts w:ascii="Amasis MT Pro" w:hAnsi="Amasis MT Pro"/>
+          <w:sz w:val="28"/>
+          <w:szCs w:val="28"/>
+        </w:rPr>
+        <w:t>Flask</w:t>
+      </w:r>
+      <w:proofErr w:type="spellEnd"/>
       <w:r>
         <w:rPr>
           <w:rFonts w:ascii="Amasis MT Pro" w:hAnsi="Amasis MT Pro"/>
@@ -3042,6 +3647,24 @@
         </w:rPr>
         <w:t xml:space="preserve"> (vedi capitolo successivo) le pagine gestite con java rispettano per la maggior parte quest’ ordine:</w:t>
       </w:r>
+    </w:p>
+    <w:p>
+      <w:pPr>
+        <w:rPr>
+          <w:rFonts w:ascii="Amasis MT Pro" w:hAnsi="Amasis MT Pro"/>
+          <w:sz w:val="28"/>
+          <w:szCs w:val="28"/>
+        </w:rPr>
+      </w:pPr>
+    </w:p>
+    <w:p>
+      <w:pPr>
+        <w:rPr>
+          <w:rFonts w:ascii="Amasis MT Pro" w:hAnsi="Amasis MT Pro"/>
+          <w:sz w:val="28"/>
+          <w:szCs w:val="28"/>
+        </w:rPr>
+      </w:pPr>
     </w:p>
     <w:p>
       <w:pPr>
@@ -3146,15 +3769,43 @@
           <w:sz w:val="28"/>
           <w:szCs w:val="28"/>
         </w:rPr>
-        <w:t>possibilità di passare a un'altra schermata attraverso Intent</w:t>
-      </w:r>
-      <w:r>
-        <w:rPr>
-          <w:rFonts w:ascii="Amasis MT Pro" w:hAnsi="Amasis MT Pro"/>
-          <w:sz w:val="28"/>
-          <w:szCs w:val="28"/>
-        </w:rPr>
-        <w:t xml:space="preserve">, cioè una richiesta da parte dell’utente al sistema di poter vedere informazioni diverse a schermo. L’intent ci dà anche la possibilità di passare dati tra una schermata a </w:t>
+        <w:t xml:space="preserve">possibilità di passare a un'altra schermata attraverso </w:t>
+      </w:r>
+      <w:proofErr w:type="spellStart"/>
+      <w:r>
+        <w:rPr>
+          <w:rFonts w:ascii="Amasis MT Pro" w:hAnsi="Amasis MT Pro"/>
+          <w:sz w:val="28"/>
+          <w:szCs w:val="28"/>
+        </w:rPr>
+        <w:t>Intent</w:t>
+      </w:r>
+      <w:proofErr w:type="spellEnd"/>
+      <w:r>
+        <w:rPr>
+          <w:rFonts w:ascii="Amasis MT Pro" w:hAnsi="Amasis MT Pro"/>
+          <w:sz w:val="28"/>
+          <w:szCs w:val="28"/>
+        </w:rPr>
+        <w:t>, cioè una richiesta da parte dell’utente al sistema di poter vedere informazioni diverse a schermo. L’</w:t>
+      </w:r>
+      <w:proofErr w:type="spellStart"/>
+      <w:r>
+        <w:rPr>
+          <w:rFonts w:ascii="Amasis MT Pro" w:hAnsi="Amasis MT Pro"/>
+          <w:sz w:val="28"/>
+          <w:szCs w:val="28"/>
+        </w:rPr>
+        <w:t>intent</w:t>
+      </w:r>
+      <w:proofErr w:type="spellEnd"/>
+      <w:r>
+        <w:rPr>
+          <w:rFonts w:ascii="Amasis MT Pro" w:hAnsi="Amasis MT Pro"/>
+          <w:sz w:val="28"/>
+          <w:szCs w:val="28"/>
+        </w:rPr>
+        <w:t xml:space="preserve"> ci dà anche la possibilità di passare dati tra una schermata a </w:t>
       </w:r>
       <w:r>
         <w:rPr>
@@ -3181,6 +3832,24 @@
           <w:szCs w:val="36"/>
         </w:rPr>
       </w:pPr>
+    </w:p>
+    <w:p>
+      <w:pPr>
+        <w:rPr>
+          <w:rFonts w:ascii="Amasis MT Pro" w:hAnsi="Amasis MT Pro"/>
+          <w:sz w:val="36"/>
+          <w:szCs w:val="36"/>
+        </w:rPr>
+      </w:pPr>
+    </w:p>
+    <w:p>
+      <w:pPr>
+        <w:rPr>
+          <w:rFonts w:ascii="Amasis MT Pro" w:hAnsi="Amasis MT Pro"/>
+          <w:sz w:val="36"/>
+          <w:szCs w:val="36"/>
+        </w:rPr>
+      </w:pPr>
       <w:r>
         <w:rPr>
           <w:rFonts w:ascii="Amasis MT Pro" w:hAnsi="Amasis MT Pro"/>
@@ -3228,7 +3897,23 @@
           <w:sz w:val="28"/>
           <w:szCs w:val="28"/>
         </w:rPr>
-        <w:t>dell’app in breve:</w:t>
+        <w:t>dell’app in breve</w:t>
+      </w:r>
+      <w:r>
+        <w:rPr>
+          <w:rFonts w:ascii="Amasis MT Pro" w:hAnsi="Amasis MT Pro"/>
+          <w:sz w:val="28"/>
+          <w:szCs w:val="28"/>
+        </w:rPr>
+        <w:t xml:space="preserve"> saranno le seguenti</w:t>
+      </w:r>
+      <w:r>
+        <w:rPr>
+          <w:rFonts w:ascii="Amasis MT Pro" w:hAnsi="Amasis MT Pro"/>
+          <w:sz w:val="28"/>
+          <w:szCs w:val="28"/>
+        </w:rPr>
+        <w:t>:</w:t>
       </w:r>
     </w:p>
     <w:p>
@@ -3270,7 +3955,7 @@
                     <pic:cNvPicPr/>
                   </pic:nvPicPr>
                   <pic:blipFill>
-                    <a:blip r:embed="rId18" cstate="print">
+                    <a:blip r:embed="rId19" cstate="print">
                       <a:extLst>
                         <a:ext uri="{28A0092B-C50C-407E-A947-70E740481C1C}">
                           <a14:useLocalDpi xmlns:a14="http://schemas.microsoft.com/office/drawing/2010/main" val="0"/>
@@ -3308,6 +3993,32 @@
           <w:sz w:val="28"/>
           <w:szCs w:val="28"/>
         </w:rPr>
+        <w:t xml:space="preserve">          </w:t>
+      </w:r>
+    </w:p>
+    <w:p>
+      <w:pPr>
+        <w:rPr>
+          <w:rFonts w:ascii="Amasis MT Pro" w:hAnsi="Amasis MT Pro"/>
+          <w:sz w:val="28"/>
+          <w:szCs w:val="28"/>
+        </w:rPr>
+      </w:pPr>
+      <w:r>
+        <w:rPr>
+          <w:rFonts w:ascii="Amasis MT Pro" w:hAnsi="Amasis MT Pro"/>
+          <w:sz w:val="28"/>
+          <w:szCs w:val="28"/>
+        </w:rPr>
+        <w:t xml:space="preserve">           </w:t>
+      </w:r>
+      <w:r>
+        <w:rPr>
+          <w:rFonts w:ascii="Amasis MT Pro" w:hAnsi="Amasis MT Pro"/>
+          <w:color w:val="FF0000"/>
+          <w:sz w:val="28"/>
+          <w:szCs w:val="28"/>
+        </w:rPr>
         <w:t>Schermata home:</w:t>
       </w:r>
     </w:p>
@@ -3325,6 +4036,14 @@
           <w:sz w:val="28"/>
           <w:szCs w:val="28"/>
         </w:rPr>
+        <w:t xml:space="preserve">          - </w:t>
+      </w:r>
+      <w:r>
+        <w:rPr>
+          <w:rFonts w:ascii="Amasis MT Pro" w:hAnsi="Amasis MT Pro"/>
+          <w:sz w:val="28"/>
+          <w:szCs w:val="28"/>
+        </w:rPr>
         <w:t>lista con tutti i nostri animali</w:t>
       </w:r>
     </w:p>
@@ -3342,6 +4061,14 @@
           <w:sz w:val="28"/>
           <w:szCs w:val="28"/>
         </w:rPr>
+        <w:t xml:space="preserve">          - </w:t>
+      </w:r>
+      <w:r>
+        <w:rPr>
+          <w:rFonts w:ascii="Amasis MT Pro" w:hAnsi="Amasis MT Pro"/>
+          <w:sz w:val="28"/>
+          <w:szCs w:val="28"/>
+        </w:rPr>
         <w:t>possibilità di registrarne di nuovi</w:t>
       </w:r>
     </w:p>
@@ -3359,6 +4086,14 @@
           <w:sz w:val="28"/>
           <w:szCs w:val="28"/>
         </w:rPr>
+        <w:t xml:space="preserve">          - </w:t>
+      </w:r>
+      <w:r>
+        <w:rPr>
+          <w:rFonts w:ascii="Amasis MT Pro" w:hAnsi="Amasis MT Pro"/>
+          <w:sz w:val="28"/>
+          <w:szCs w:val="28"/>
+        </w:rPr>
         <w:t xml:space="preserve">lista di attività registrate di oggi </w:t>
       </w:r>
     </w:p>
@@ -3376,6 +4111,14 @@
           <w:sz w:val="28"/>
           <w:szCs w:val="28"/>
         </w:rPr>
+        <w:t xml:space="preserve">          - </w:t>
+      </w:r>
+      <w:r>
+        <w:rPr>
+          <w:rFonts w:ascii="Amasis MT Pro" w:hAnsi="Amasis MT Pro"/>
+          <w:sz w:val="28"/>
+          <w:szCs w:val="28"/>
+        </w:rPr>
         <w:t>bottone per cercare servizi nell’area</w:t>
       </w:r>
     </w:p>
@@ -3403,7 +4146,7 @@
     </w:p>
     <w:p>
       <w:pPr>
-        <w:jc w:val="right"/>
+        <w:ind w:left="2832" w:firstLine="708"/>
         <w:rPr>
           <w:rFonts w:ascii="Amasis MT Pro" w:hAnsi="Amasis MT Pro"/>
           <w:sz w:val="28"/>
@@ -3414,10 +4157,10 @@
         <w:rPr>
           <w:rFonts w:ascii="Amasis MT Pro" w:hAnsi="Amasis MT Pro"/>
           <w:noProof/>
-          <w:sz w:val="28"/>
-          <w:szCs w:val="28"/>
-        </w:rPr>
-        <w:lastRenderedPageBreak/>
+          <w:color w:val="FF0000"/>
+          <w:sz w:val="28"/>
+          <w:szCs w:val="28"/>
+        </w:rPr>
         <w:drawing>
           <wp:anchor distT="0" distB="0" distL="114300" distR="114300" simplePos="0" relativeHeight="251659264" behindDoc="1" locked="0" layoutInCell="1" allowOverlap="1" wp14:anchorId="226A6EC3" wp14:editId="352C5783">
             <wp:simplePos x="0" y="0"/>
@@ -3450,7 +4193,7 @@
                     <pic:cNvPicPr/>
                   </pic:nvPicPr>
                   <pic:blipFill>
-                    <a:blip r:embed="rId19">
+                    <a:blip r:embed="rId20">
                       <a:extLst>
                         <a:ext uri="{28A0092B-C50C-407E-A947-70E740481C1C}">
                           <a14:useLocalDpi xmlns:a14="http://schemas.microsoft.com/office/drawing/2010/main" val="0"/>
@@ -3485,14 +4228,16 @@
       <w:r>
         <w:rPr>
           <w:rFonts w:ascii="Amasis MT Pro" w:hAnsi="Amasis MT Pro"/>
-          <w:sz w:val="28"/>
-          <w:szCs w:val="28"/>
-        </w:rPr>
-        <w:t>s</w:t>
-      </w:r>
-      <w:r>
-        <w:rPr>
-          <w:rFonts w:ascii="Amasis MT Pro" w:hAnsi="Amasis MT Pro"/>
+          <w:color w:val="FF0000"/>
+          <w:sz w:val="28"/>
+          <w:szCs w:val="28"/>
+        </w:rPr>
+        <w:t>S</w:t>
+      </w:r>
+      <w:r>
+        <w:rPr>
+          <w:rFonts w:ascii="Amasis MT Pro" w:hAnsi="Amasis MT Pro"/>
+          <w:color w:val="FF0000"/>
           <w:sz w:val="28"/>
           <w:szCs w:val="28"/>
         </w:rPr>
@@ -3501,6 +4246,7 @@
       <w:r>
         <w:rPr>
           <w:rFonts w:ascii="Amasis MT Pro" w:hAnsi="Amasis MT Pro"/>
+          <w:color w:val="FF0000"/>
           <w:sz w:val="28"/>
           <w:szCs w:val="28"/>
         </w:rPr>
@@ -3509,6 +4255,7 @@
       <w:r>
         <w:rPr>
           <w:rFonts w:ascii="Amasis MT Pro" w:hAnsi="Amasis MT Pro"/>
+          <w:color w:val="FF0000"/>
           <w:sz w:val="28"/>
           <w:szCs w:val="28"/>
         </w:rPr>
@@ -3517,57 +4264,178 @@
     </w:p>
     <w:p>
       <w:pPr>
+        <w:rPr>
+          <w:rFonts w:ascii="Amasis MT Pro" w:hAnsi="Amasis MT Pro"/>
+          <w:sz w:val="28"/>
+          <w:szCs w:val="28"/>
+        </w:rPr>
+      </w:pPr>
+      <w:r>
+        <w:rPr>
+          <w:rFonts w:ascii="Amasis MT Pro" w:hAnsi="Amasis MT Pro"/>
+          <w:sz w:val="28"/>
+          <w:szCs w:val="28"/>
+        </w:rPr>
+        <w:t xml:space="preserve">    </w:t>
+      </w:r>
+      <w:r>
+        <w:rPr>
+          <w:rFonts w:ascii="Amasis MT Pro" w:hAnsi="Amasis MT Pro"/>
+          <w:sz w:val="28"/>
+          <w:szCs w:val="28"/>
+        </w:rPr>
+        <w:t>-</w:t>
+      </w:r>
+      <w:r>
+        <w:rPr>
+          <w:rFonts w:ascii="Amasis MT Pro" w:hAnsi="Amasis MT Pro"/>
+          <w:sz w:val="28"/>
+          <w:szCs w:val="28"/>
+        </w:rPr>
+        <w:t xml:space="preserve"> </w:t>
+      </w:r>
+      <w:r>
+        <w:rPr>
+          <w:rFonts w:ascii="Amasis MT Pro" w:hAnsi="Amasis MT Pro"/>
+          <w:sz w:val="28"/>
+          <w:szCs w:val="28"/>
+        </w:rPr>
+        <w:t>informazioni più dettagliate su uno dei nostri animali</w:t>
+      </w:r>
+      <w:r>
+        <w:rPr>
+          <w:rFonts w:ascii="Amasis MT Pro" w:hAnsi="Amasis MT Pro"/>
+          <w:sz w:val="28"/>
+          <w:szCs w:val="28"/>
+        </w:rPr>
+        <w:tab/>
+      </w:r>
+      <w:r>
+        <w:rPr>
+          <w:rFonts w:ascii="Amasis MT Pro" w:hAnsi="Amasis MT Pro"/>
+          <w:sz w:val="28"/>
+          <w:szCs w:val="28"/>
+        </w:rPr>
+        <w:tab/>
+      </w:r>
+      <w:r>
+        <w:rPr>
+          <w:rFonts w:ascii="Amasis MT Pro" w:hAnsi="Amasis MT Pro"/>
+          <w:sz w:val="28"/>
+          <w:szCs w:val="28"/>
+        </w:rPr>
+        <w:tab/>
+      </w:r>
+      <w:r>
+        <w:rPr>
+          <w:rFonts w:ascii="Amasis MT Pro" w:hAnsi="Amasis MT Pro"/>
+          <w:sz w:val="28"/>
+          <w:szCs w:val="28"/>
+        </w:rPr>
+        <w:tab/>
+      </w:r>
+      <w:r>
+        <w:rPr>
+          <w:rFonts w:ascii="Amasis MT Pro" w:hAnsi="Amasis MT Pro"/>
+          <w:sz w:val="28"/>
+          <w:szCs w:val="28"/>
+        </w:rPr>
+        <w:tab/>
+      </w:r>
+      <w:r>
+        <w:rPr>
+          <w:rFonts w:ascii="Amasis MT Pro" w:hAnsi="Amasis MT Pro"/>
+          <w:sz w:val="28"/>
+          <w:szCs w:val="28"/>
+        </w:rPr>
+        <w:tab/>
+        <w:t xml:space="preserve">      - </w:t>
+      </w:r>
+      <w:r>
+        <w:rPr>
+          <w:rFonts w:ascii="Amasis MT Pro" w:hAnsi="Amasis MT Pro"/>
+          <w:sz w:val="28"/>
+          <w:szCs w:val="28"/>
+        </w:rPr>
+        <w:t>possibilità di modifica</w:t>
+      </w:r>
+    </w:p>
+    <w:p>
+      <w:pPr>
+        <w:jc w:val="center"/>
+        <w:rPr>
+          <w:rFonts w:ascii="Amasis MT Pro" w:hAnsi="Amasis MT Pro"/>
+          <w:sz w:val="28"/>
+          <w:szCs w:val="28"/>
+        </w:rPr>
+      </w:pPr>
+      <w:r>
+        <w:rPr>
+          <w:rFonts w:ascii="Amasis MT Pro" w:hAnsi="Amasis MT Pro"/>
+          <w:sz w:val="28"/>
+          <w:szCs w:val="28"/>
+        </w:rPr>
+        <w:t xml:space="preserve">  </w:t>
+      </w:r>
+      <w:r>
+        <w:rPr>
+          <w:rFonts w:ascii="Amasis MT Pro" w:hAnsi="Amasis MT Pro"/>
+          <w:sz w:val="28"/>
+          <w:szCs w:val="28"/>
+        </w:rPr>
+        <w:tab/>
+        <w:t xml:space="preserve">     </w:t>
+      </w:r>
+      <w:r>
+        <w:rPr>
+          <w:rFonts w:ascii="Amasis MT Pro" w:hAnsi="Amasis MT Pro"/>
+          <w:sz w:val="28"/>
+          <w:szCs w:val="28"/>
+        </w:rPr>
+        <w:tab/>
+        <w:t xml:space="preserve"> </w:t>
+      </w:r>
+      <w:r>
+        <w:rPr>
+          <w:rFonts w:ascii="Amasis MT Pro" w:hAnsi="Amasis MT Pro"/>
+          <w:sz w:val="28"/>
+          <w:szCs w:val="28"/>
+        </w:rPr>
+        <w:tab/>
+        <w:t xml:space="preserve">     - </w:t>
+      </w:r>
+      <w:r>
+        <w:rPr>
+          <w:rFonts w:ascii="Amasis MT Pro" w:hAnsi="Amasis MT Pro"/>
+          <w:sz w:val="28"/>
+          <w:szCs w:val="28"/>
+        </w:rPr>
+        <w:t>accesso alla cartella clinica</w:t>
+      </w:r>
+    </w:p>
+    <w:p>
+      <w:pPr>
         <w:jc w:val="right"/>
         <w:rPr>
           <w:rFonts w:ascii="Amasis MT Pro" w:hAnsi="Amasis MT Pro"/>
-          <w:sz w:val="28"/>
-          <w:szCs w:val="28"/>
-        </w:rPr>
-      </w:pPr>
-      <w:r>
-        <w:rPr>
-          <w:rFonts w:ascii="Amasis MT Pro" w:hAnsi="Amasis MT Pro"/>
-          <w:sz w:val="28"/>
-          <w:szCs w:val="28"/>
-        </w:rPr>
-        <w:t>informazioni più dettagliate su uno dei nostri animali</w:t>
-      </w:r>
+        </w:rPr>
+      </w:pPr>
     </w:p>
     <w:p>
       <w:pPr>
         <w:jc w:val="right"/>
         <w:rPr>
           <w:rFonts w:ascii="Amasis MT Pro" w:hAnsi="Amasis MT Pro"/>
-          <w:sz w:val="28"/>
-          <w:szCs w:val="28"/>
-        </w:rPr>
-      </w:pPr>
-      <w:r>
-        <w:rPr>
-          <w:rFonts w:ascii="Amasis MT Pro" w:hAnsi="Amasis MT Pro"/>
-          <w:sz w:val="28"/>
-          <w:szCs w:val="28"/>
-        </w:rPr>
-        <w:t>possibilità di modifica</w:t>
-      </w:r>
+        </w:rPr>
+      </w:pPr>
     </w:p>
     <w:p>
       <w:pPr>
         <w:jc w:val="right"/>
         <w:rPr>
           <w:rFonts w:ascii="Amasis MT Pro" w:hAnsi="Amasis MT Pro"/>
-          <w:sz w:val="28"/>
-          <w:szCs w:val="28"/>
-        </w:rPr>
-      </w:pPr>
-      <w:r>
-        <w:rPr>
-          <w:rFonts w:ascii="Amasis MT Pro" w:hAnsi="Amasis MT Pro"/>
-          <w:sz w:val="28"/>
-          <w:szCs w:val="28"/>
-        </w:rPr>
-        <w:t>accesso alla cartella clinica</w:t>
-      </w:r>
+        </w:rPr>
+      </w:pPr>
     </w:p>
     <w:p>
       <w:pPr>
@@ -3579,30 +4447,6 @@
     </w:p>
     <w:p>
       <w:pPr>
-        <w:jc w:val="right"/>
-        <w:rPr>
-          <w:rFonts w:ascii="Amasis MT Pro" w:hAnsi="Amasis MT Pro"/>
-        </w:rPr>
-      </w:pPr>
-    </w:p>
-    <w:p>
-      <w:pPr>
-        <w:jc w:val="right"/>
-        <w:rPr>
-          <w:rFonts w:ascii="Amasis MT Pro" w:hAnsi="Amasis MT Pro"/>
-        </w:rPr>
-      </w:pPr>
-    </w:p>
-    <w:p>
-      <w:pPr>
-        <w:jc w:val="right"/>
-        <w:rPr>
-          <w:rFonts w:ascii="Amasis MT Pro" w:hAnsi="Amasis MT Pro"/>
-        </w:rPr>
-      </w:pPr>
-    </w:p>
-    <w:p>
-      <w:pPr>
         <w:rPr>
           <w:rFonts w:ascii="Amasis MT Pro" w:hAnsi="Amasis MT Pro"/>
         </w:rPr>
@@ -3613,7 +4457,7 @@
           <w:noProof/>
         </w:rPr>
         <w:drawing>
-          <wp:anchor distT="0" distB="0" distL="114300" distR="114300" simplePos="0" relativeHeight="251660288" behindDoc="0" locked="0" layoutInCell="1" allowOverlap="1" wp14:anchorId="54F62B64" wp14:editId="687B2DE0">
+          <wp:anchor distT="0" distB="0" distL="114300" distR="114300" simplePos="0" relativeHeight="251660288" behindDoc="0" locked="0" layoutInCell="1" allowOverlap="1" wp14:anchorId="54F62B64" wp14:editId="21A8AA8F">
             <wp:simplePos x="0" y="0"/>
             <wp:positionH relativeFrom="margin">
               <wp:align>left</wp:align>
@@ -3636,7 +4480,7 @@
                     <pic:cNvPicPr/>
                   </pic:nvPicPr>
                   <pic:blipFill>
-                    <a:blip r:embed="rId20" cstate="print">
+                    <a:blip r:embed="rId21" cstate="print">
                       <a:extLst>
                         <a:ext uri="{28A0092B-C50C-407E-A947-70E740481C1C}">
                           <a14:useLocalDpi xmlns:a14="http://schemas.microsoft.com/office/drawing/2010/main" val="0"/>
@@ -3683,32 +4527,71 @@
           <w:sz w:val="28"/>
           <w:szCs w:val="28"/>
         </w:rPr>
-        <w:t>schermata cartella clinica:</w:t>
-      </w:r>
-    </w:p>
-    <w:p>
-      <w:pPr>
-        <w:rPr>
-          <w:rFonts w:ascii="Amasis MT Pro" w:hAnsi="Amasis MT Pro"/>
-          <w:sz w:val="28"/>
-          <w:szCs w:val="28"/>
-        </w:rPr>
-      </w:pPr>
-      <w:r>
-        <w:rPr>
-          <w:rFonts w:ascii="Amasis MT Pro" w:hAnsi="Amasis MT Pro"/>
+        <w:t xml:space="preserve">       </w:t>
+      </w:r>
+      <w:r>
+        <w:rPr>
+          <w:rFonts w:ascii="Amasis MT Pro" w:hAnsi="Amasis MT Pro"/>
+          <w:color w:val="FF0000"/>
+          <w:sz w:val="28"/>
+          <w:szCs w:val="28"/>
+        </w:rPr>
+        <w:t>S</w:t>
+      </w:r>
+      <w:r>
+        <w:rPr>
+          <w:rFonts w:ascii="Amasis MT Pro" w:hAnsi="Amasis MT Pro"/>
+          <w:color w:val="FF0000"/>
+          <w:sz w:val="28"/>
+          <w:szCs w:val="28"/>
+        </w:rPr>
+        <w:t>chermata cartella clinica:</w:t>
+      </w:r>
+    </w:p>
+    <w:p>
+      <w:pPr>
+        <w:rPr>
+          <w:rFonts w:ascii="Amasis MT Pro" w:hAnsi="Amasis MT Pro"/>
+          <w:sz w:val="28"/>
+          <w:szCs w:val="28"/>
+        </w:rPr>
+      </w:pPr>
+      <w:r>
+        <w:rPr>
+          <w:rFonts w:ascii="Amasis MT Pro" w:hAnsi="Amasis MT Pro"/>
+          <w:sz w:val="28"/>
+          <w:szCs w:val="28"/>
+        </w:rPr>
+        <w:t xml:space="preserve">       </w:t>
+      </w:r>
+      <w:r>
+        <w:rPr>
+          <w:rFonts w:ascii="Amasis MT Pro" w:hAnsi="Amasis MT Pro"/>
+          <w:sz w:val="28"/>
+          <w:szCs w:val="28"/>
+        </w:rPr>
+        <w:t>-</w:t>
+      </w:r>
+      <w:r>
+        <w:rPr>
+          <w:rFonts w:ascii="Amasis MT Pro" w:hAnsi="Amasis MT Pro"/>
+          <w:sz w:val="28"/>
+          <w:szCs w:val="28"/>
+        </w:rPr>
+        <w:t xml:space="preserve"> </w:t>
+      </w:r>
+      <w:r>
+        <w:rPr>
           <w:noProof/>
-          <w:sz w:val="28"/>
-          <w:szCs w:val="28"/>
         </w:rPr>
         <w:drawing>
-          <wp:anchor distT="0" distB="0" distL="114300" distR="114300" simplePos="0" relativeHeight="251661312" behindDoc="0" locked="0" layoutInCell="1" allowOverlap="1" wp14:anchorId="52862408" wp14:editId="40D97945">
+          <wp:anchor distT="0" distB="0" distL="114300" distR="114300" simplePos="0" relativeHeight="251661312" behindDoc="0" locked="0" layoutInCell="1" allowOverlap="1" wp14:anchorId="52862408" wp14:editId="295A8AD7">
             <wp:simplePos x="0" y="0"/>
             <wp:positionH relativeFrom="column">
-              <wp:posOffset>4448865</wp:posOffset>
+              <wp:posOffset>4686935</wp:posOffset>
             </wp:positionH>
             <wp:positionV relativeFrom="paragraph">
-              <wp:posOffset>11678</wp:posOffset>
+              <wp:posOffset>11430</wp:posOffset>
             </wp:positionV>
             <wp:extent cx="1856740" cy="907415"/>
             <wp:effectExtent l="0" t="0" r="0" b="6985"/>
@@ -3725,7 +4608,7 @@
                     <pic:cNvPicPr/>
                   </pic:nvPicPr>
                   <pic:blipFill>
-                    <a:blip r:embed="rId21">
+                    <a:blip r:embed="rId22">
                       <a:extLst>
                         <a:ext uri="{28A0092B-C50C-407E-A947-70E740481C1C}">
                           <a14:useLocalDpi xmlns:a14="http://schemas.microsoft.com/office/drawing/2010/main" val="0"/>
@@ -3780,24 +4663,41 @@
           <w:sz w:val="28"/>
           <w:szCs w:val="28"/>
         </w:rPr>
+        <w:t xml:space="preserve">       - </w:t>
+      </w:r>
+      <w:r>
+        <w:rPr>
+          <w:rFonts w:ascii="Amasis MT Pro" w:hAnsi="Amasis MT Pro"/>
+          <w:sz w:val="28"/>
+          <w:szCs w:val="28"/>
+        </w:rPr>
         <w:t>per aggiungere un log</w:t>
       </w:r>
-    </w:p>
-    <w:p>
-      <w:pPr>
-        <w:rPr>
-          <w:rFonts w:ascii="Amasis MT Pro" w:hAnsi="Amasis MT Pro"/>
-          <w:sz w:val="28"/>
-          <w:szCs w:val="28"/>
-        </w:rPr>
-      </w:pPr>
-      <w:r>
-        <w:rPr>
-          <w:rFonts w:ascii="Amasis MT Pro" w:hAnsi="Amasis MT Pro"/>
-          <w:sz w:val="28"/>
-          <w:szCs w:val="28"/>
-        </w:rPr>
-        <w:t>compare una finestra di dialogo:</w:t>
+      <w:r>
+        <w:rPr>
+          <w:rFonts w:ascii="Amasis MT Pro" w:hAnsi="Amasis MT Pro"/>
+          <w:sz w:val="28"/>
+          <w:szCs w:val="28"/>
+        </w:rPr>
+        <w:t xml:space="preserve"> compare </w:t>
+      </w:r>
+    </w:p>
+    <w:p>
+      <w:pPr>
+        <w:rPr>
+          <w:rFonts w:ascii="Amasis MT Pro" w:hAnsi="Amasis MT Pro"/>
+          <w:sz w:val="28"/>
+          <w:szCs w:val="28"/>
+        </w:rPr>
+      </w:pPr>
+      <w:r>
+        <w:rPr>
+          <w:rFonts w:ascii="Amasis MT Pro" w:hAnsi="Amasis MT Pro"/>
+          <w:sz w:val="28"/>
+          <w:szCs w:val="28"/>
+        </w:rPr>
+        <w:tab/>
+        <w:t xml:space="preserve">         una finestra di dialogo           </w:t>
       </w:r>
     </w:p>
     <w:p>
@@ -3876,7 +4776,7 @@
                     <pic:cNvPicPr/>
                   </pic:nvPicPr>
                   <pic:blipFill>
-                    <a:blip r:embed="rId22" cstate="print">
+                    <a:blip r:embed="rId23" cstate="print">
                       <a:extLst>
                         <a:ext uri="{28A0092B-C50C-407E-A947-70E740481C1C}">
                           <a14:useLocalDpi xmlns:a14="http://schemas.microsoft.com/office/drawing/2010/main" val="0"/>
@@ -3914,21 +4814,33 @@
         <w:jc w:val="right"/>
         <w:rPr>
           <w:rFonts w:ascii="Amasis MT Pro" w:hAnsi="Amasis MT Pro"/>
-          <w:sz w:val="28"/>
-          <w:szCs w:val="28"/>
-        </w:rPr>
-      </w:pPr>
-      <w:r>
-        <w:rPr>
-          <w:rFonts w:ascii="Amasis MT Pro" w:hAnsi="Amasis MT Pro"/>
-          <w:sz w:val="28"/>
-          <w:szCs w:val="28"/>
-        </w:rPr>
-        <w:t>schermata ricerca servizi</w:t>
-      </w:r>
-      <w:r>
-        <w:rPr>
-          <w:rFonts w:ascii="Amasis MT Pro" w:hAnsi="Amasis MT Pro"/>
+          <w:color w:val="FF0000"/>
+          <w:sz w:val="28"/>
+          <w:szCs w:val="28"/>
+        </w:rPr>
+      </w:pPr>
+      <w:r>
+        <w:rPr>
+          <w:rFonts w:ascii="Amasis MT Pro" w:hAnsi="Amasis MT Pro"/>
+          <w:color w:val="FF0000"/>
+          <w:sz w:val="28"/>
+          <w:szCs w:val="28"/>
+        </w:rPr>
+        <w:t>S</w:t>
+      </w:r>
+      <w:r>
+        <w:rPr>
+          <w:rFonts w:ascii="Amasis MT Pro" w:hAnsi="Amasis MT Pro"/>
+          <w:color w:val="FF0000"/>
+          <w:sz w:val="28"/>
+          <w:szCs w:val="28"/>
+        </w:rPr>
+        <w:t>chermata ricerca servizi</w:t>
+      </w:r>
+      <w:r>
+        <w:rPr>
+          <w:rFonts w:ascii="Amasis MT Pro" w:hAnsi="Amasis MT Pro"/>
+          <w:color w:val="FF0000"/>
           <w:sz w:val="28"/>
           <w:szCs w:val="28"/>
         </w:rPr>
@@ -4040,7 +4952,6 @@
           <w:sz w:val="36"/>
           <w:szCs w:val="36"/>
         </w:rPr>
-        <w:lastRenderedPageBreak/>
         <w:t>Il sito</w:t>
       </w:r>
     </w:p>
@@ -4306,6 +5217,7 @@
           <w:szCs w:val="36"/>
         </w:rPr>
       </w:pPr>
+      <w:proofErr w:type="spellStart"/>
       <w:r>
         <w:rPr>
           <w:rFonts w:ascii="Amasis MT Pro" w:hAnsi="Amasis MT Pro"/>
@@ -4314,22 +5226,33 @@
         </w:rPr>
         <w:t>Flask</w:t>
       </w:r>
-    </w:p>
-    <w:p>
-      <w:pPr>
-        <w:rPr>
-          <w:rFonts w:ascii="Amasis MT Pro" w:hAnsi="Amasis MT Pro"/>
-          <w:sz w:val="28"/>
-          <w:szCs w:val="28"/>
-        </w:rPr>
-      </w:pPr>
-      <w:r>
-        <w:rPr>
-          <w:rFonts w:ascii="Amasis MT Pro" w:hAnsi="Amasis MT Pro"/>
-          <w:sz w:val="28"/>
-          <w:szCs w:val="28"/>
-        </w:rPr>
-        <w:t xml:space="preserve">Flask è un framework, ovvero un insieme di librerie e metodi che ci danno una base solida per costruire la nostra app/sito. È scritto in linguaggio Python e </w:t>
+      <w:proofErr w:type="spellEnd"/>
+    </w:p>
+    <w:p>
+      <w:pPr>
+        <w:rPr>
+          <w:rFonts w:ascii="Amasis MT Pro" w:hAnsi="Amasis MT Pro"/>
+          <w:sz w:val="28"/>
+          <w:szCs w:val="28"/>
+        </w:rPr>
+      </w:pPr>
+      <w:proofErr w:type="spellStart"/>
+      <w:r>
+        <w:rPr>
+          <w:rFonts w:ascii="Amasis MT Pro" w:hAnsi="Amasis MT Pro"/>
+          <w:sz w:val="28"/>
+          <w:szCs w:val="28"/>
+        </w:rPr>
+        <w:t>Flask</w:t>
+      </w:r>
+      <w:proofErr w:type="spellEnd"/>
+      <w:r>
+        <w:rPr>
+          <w:rFonts w:ascii="Amasis MT Pro" w:hAnsi="Amasis MT Pro"/>
+          <w:sz w:val="28"/>
+          <w:szCs w:val="28"/>
+        </w:rPr>
+        <w:t xml:space="preserve"> è un framework, ovvero un insieme di librerie e metodi che ci danno una base solida per costruire la nostra app/sito. È scritto in linguaggio Python e </w:t>
       </w:r>
       <w:r>
         <w:rPr>
@@ -4562,7 +5485,7 @@
                     <pic:cNvPicPr/>
                   </pic:nvPicPr>
                   <pic:blipFill>
-                    <a:blip r:embed="rId23">
+                    <a:blip r:embed="rId24">
                       <a:extLst>
                         <a:ext uri="{28A0092B-C50C-407E-A947-70E740481C1C}">
                           <a14:useLocalDpi xmlns:a14="http://schemas.microsoft.com/office/drawing/2010/main" val="0"/>
@@ -4640,7 +5563,25 @@
           <w:sz w:val="28"/>
           <w:szCs w:val="28"/>
         </w:rPr>
-        <w:t>all’interno della funzione checkCredentials esiste un metodo Call, che apre il collegamento. La Call è strutturata per inviare le due stringhe e ricevere una risposta positiva o negativa.</w:t>
+        <w:t xml:space="preserve">all’interno della funzione </w:t>
+      </w:r>
+      <w:proofErr w:type="spellStart"/>
+      <w:r>
+        <w:rPr>
+          <w:rFonts w:ascii="Amasis MT Pro" w:hAnsi="Amasis MT Pro"/>
+          <w:sz w:val="28"/>
+          <w:szCs w:val="28"/>
+        </w:rPr>
+        <w:t>checkCredentials</w:t>
+      </w:r>
+      <w:proofErr w:type="spellEnd"/>
+      <w:r>
+        <w:rPr>
+          <w:rFonts w:ascii="Amasis MT Pro" w:hAnsi="Amasis MT Pro"/>
+          <w:sz w:val="28"/>
+          <w:szCs w:val="28"/>
+        </w:rPr>
+        <w:t xml:space="preserve"> esiste un metodo Call, che apre il collegamento. La Call è strutturata per inviare le due stringhe e ricevere una risposta positiva o negativa.</w:t>
       </w:r>
     </w:p>
     <w:p>
@@ -4662,7 +5603,25 @@
           <w:sz w:val="28"/>
           <w:szCs w:val="28"/>
         </w:rPr>
-        <w:t xml:space="preserve">Attraverso una classe chiamata APIService, i dati vengono inviati </w:t>
+        <w:t xml:space="preserve">Attraverso una classe chiamata </w:t>
+      </w:r>
+      <w:proofErr w:type="spellStart"/>
+      <w:r>
+        <w:rPr>
+          <w:rFonts w:ascii="Amasis MT Pro" w:hAnsi="Amasis MT Pro"/>
+          <w:sz w:val="28"/>
+          <w:szCs w:val="28"/>
+        </w:rPr>
+        <w:t>APIService</w:t>
+      </w:r>
+      <w:proofErr w:type="spellEnd"/>
+      <w:r>
+        <w:rPr>
+          <w:rFonts w:ascii="Amasis MT Pro" w:hAnsi="Amasis MT Pro"/>
+          <w:sz w:val="28"/>
+          <w:szCs w:val="28"/>
+        </w:rPr>
+        <w:t xml:space="preserve">, i dati vengono inviati </w:t>
       </w:r>
       <w:r>
         <w:rPr>
@@ -4678,8 +5637,18 @@
           <w:sz w:val="28"/>
           <w:szCs w:val="28"/>
         </w:rPr>
-        <w:t xml:space="preserve"> formato JSON a un endpoint, cioè un indirizzo URL di Flask</w:t>
-      </w:r>
+        <w:t xml:space="preserve"> formato JSON a un endpoint, cioè un indirizzo URL di </w:t>
+      </w:r>
+      <w:proofErr w:type="spellStart"/>
+      <w:r>
+        <w:rPr>
+          <w:rFonts w:ascii="Amasis MT Pro" w:hAnsi="Amasis MT Pro"/>
+          <w:sz w:val="28"/>
+          <w:szCs w:val="28"/>
+        </w:rPr>
+        <w:t>Flask</w:t>
+      </w:r>
+      <w:proofErr w:type="spellEnd"/>
       <w:r>
         <w:rPr>
           <w:rFonts w:ascii="Amasis MT Pro" w:hAnsi="Amasis MT Pro"/>
@@ -4713,6 +5682,7 @@
           <w:sz w:val="28"/>
           <w:szCs w:val="28"/>
         </w:rPr>
+        <w:lastRenderedPageBreak/>
         <w:drawing>
           <wp:anchor distT="0" distB="0" distL="114300" distR="114300" simplePos="0" relativeHeight="251664384" behindDoc="1" locked="0" layoutInCell="1" allowOverlap="1" wp14:anchorId="4F7FBC3B" wp14:editId="54C3D1FC">
             <wp:simplePos x="0" y="0"/>
@@ -4737,7 +5707,7 @@
                     <pic:cNvPicPr/>
                   </pic:nvPicPr>
                   <pic:blipFill>
-                    <a:blip r:embed="rId24">
+                    <a:blip r:embed="rId25">
                       <a:extLst>
                         <a:ext uri="{28A0092B-C50C-407E-A947-70E740481C1C}">
                           <a14:useLocalDpi xmlns:a14="http://schemas.microsoft.com/office/drawing/2010/main" val="0"/>
@@ -4790,7 +5760,6 @@
           <w:sz w:val="28"/>
           <w:szCs w:val="28"/>
         </w:rPr>
-        <w:lastRenderedPageBreak/>
         <w:drawing>
           <wp:anchor distT="0" distB="0" distL="114300" distR="114300" simplePos="0" relativeHeight="251665408" behindDoc="0" locked="0" layoutInCell="1" allowOverlap="1" wp14:anchorId="2F7FFE93" wp14:editId="58AB7198">
             <wp:simplePos x="0" y="0"/>
@@ -4815,7 +5784,7 @@
                     <pic:cNvPicPr/>
                   </pic:nvPicPr>
                   <pic:blipFill>
-                    <a:blip r:embed="rId25">
+                    <a:blip r:embed="rId26">
                       <a:extLst>
                         <a:ext uri="{28A0092B-C50C-407E-A947-70E740481C1C}">
                           <a14:useLocalDpi xmlns:a14="http://schemas.microsoft.com/office/drawing/2010/main" val="0"/>
@@ -4853,7 +5822,25 @@
           <w:sz w:val="28"/>
           <w:szCs w:val="28"/>
         </w:rPr>
-        <w:t>l’endpoint di Flask prende i</w:t>
+        <w:t xml:space="preserve">l’endpoint di </w:t>
+      </w:r>
+      <w:proofErr w:type="spellStart"/>
+      <w:r>
+        <w:rPr>
+          <w:rFonts w:ascii="Amasis MT Pro" w:hAnsi="Amasis MT Pro"/>
+          <w:sz w:val="28"/>
+          <w:szCs w:val="28"/>
+        </w:rPr>
+        <w:t>Flask</w:t>
+      </w:r>
+      <w:proofErr w:type="spellEnd"/>
+      <w:r>
+        <w:rPr>
+          <w:rFonts w:ascii="Amasis MT Pro" w:hAnsi="Amasis MT Pro"/>
+          <w:sz w:val="28"/>
+          <w:szCs w:val="28"/>
+        </w:rPr>
+        <w:t xml:space="preserve"> prende i</w:t>
       </w:r>
       <w:r>
         <w:rPr>
@@ -4942,7 +5929,7 @@
                     <pic:cNvPicPr/>
                   </pic:nvPicPr>
                   <pic:blipFill>
-                    <a:blip r:embed="rId26">
+                    <a:blip r:embed="rId27">
                       <a:extLst>
                         <a:ext uri="{28A0092B-C50C-407E-A947-70E740481C1C}">
                           <a14:useLocalDpi xmlns:a14="http://schemas.microsoft.com/office/drawing/2010/main" val="0"/>
@@ -5039,7 +6026,7 @@
                     <pic:cNvPicPr/>
                   </pic:nvPicPr>
                   <pic:blipFill>
-                    <a:blip r:embed="rId27">
+                    <a:blip r:embed="rId28">
                       <a:extLst>
                         <a:ext uri="{28A0092B-C50C-407E-A947-70E740481C1C}">
                           <a14:useLocalDpi xmlns:a14="http://schemas.microsoft.com/office/drawing/2010/main" val="0"/>
@@ -5111,16 +6098,71 @@
           <w:sz w:val="28"/>
           <w:szCs w:val="28"/>
         </w:rPr>
-        <w:t>ll’app, passano attraverso Flask che fa da tramite per il server, dove sono contenute le informazioni in un database</w:t>
-      </w:r>
-      <w:r>
-        <w:rPr>
-          <w:rFonts w:ascii="Amasis MT Pro" w:hAnsi="Amasis MT Pro"/>
-          <w:sz w:val="28"/>
-          <w:szCs w:val="28"/>
-        </w:rPr>
-        <w:t xml:space="preserve">, Flask poi gestisce la risposta da ritornare all’utente. Nello stesso modo viene gestito il sito, il quale, però non richiede di usare APIService ma si connette direttamente agli URL di </w:t>
-      </w:r>
+        <w:t xml:space="preserve">ll’app, passano attraverso </w:t>
+      </w:r>
+      <w:proofErr w:type="spellStart"/>
+      <w:r>
+        <w:rPr>
+          <w:rFonts w:ascii="Amasis MT Pro" w:hAnsi="Amasis MT Pro"/>
+          <w:sz w:val="28"/>
+          <w:szCs w:val="28"/>
+        </w:rPr>
+        <w:t>Flask</w:t>
+      </w:r>
+      <w:proofErr w:type="spellEnd"/>
+      <w:r>
+        <w:rPr>
+          <w:rFonts w:ascii="Amasis MT Pro" w:hAnsi="Amasis MT Pro"/>
+          <w:sz w:val="28"/>
+          <w:szCs w:val="28"/>
+        </w:rPr>
+        <w:t xml:space="preserve"> che fa da tramite per il server, dove sono contenute le informazioni in un database</w:t>
+      </w:r>
+      <w:r>
+        <w:rPr>
+          <w:rFonts w:ascii="Amasis MT Pro" w:hAnsi="Amasis MT Pro"/>
+          <w:sz w:val="28"/>
+          <w:szCs w:val="28"/>
+        </w:rPr>
+        <w:t xml:space="preserve">, </w:t>
+      </w:r>
+      <w:proofErr w:type="spellStart"/>
+      <w:r>
+        <w:rPr>
+          <w:rFonts w:ascii="Amasis MT Pro" w:hAnsi="Amasis MT Pro"/>
+          <w:sz w:val="28"/>
+          <w:szCs w:val="28"/>
+        </w:rPr>
+        <w:t>Flask</w:t>
+      </w:r>
+      <w:proofErr w:type="spellEnd"/>
+      <w:r>
+        <w:rPr>
+          <w:rFonts w:ascii="Amasis MT Pro" w:hAnsi="Amasis MT Pro"/>
+          <w:sz w:val="28"/>
+          <w:szCs w:val="28"/>
+        </w:rPr>
+        <w:t xml:space="preserve"> poi gestisce la risposta da ritornare all’utente. Nello stesso modo viene gestito il sito, il quale, però non richiede di usare </w:t>
+      </w:r>
+      <w:proofErr w:type="spellStart"/>
+      <w:r>
+        <w:rPr>
+          <w:rFonts w:ascii="Amasis MT Pro" w:hAnsi="Amasis MT Pro"/>
+          <w:sz w:val="28"/>
+          <w:szCs w:val="28"/>
+        </w:rPr>
+        <w:t>APIService</w:t>
+      </w:r>
+      <w:proofErr w:type="spellEnd"/>
+      <w:r>
+        <w:rPr>
+          <w:rFonts w:ascii="Amasis MT Pro" w:hAnsi="Amasis MT Pro"/>
+          <w:sz w:val="28"/>
+          <w:szCs w:val="28"/>
+        </w:rPr>
+        <w:t xml:space="preserve"> ma si connette direttamente agli URL di </w:t>
+      </w:r>
+      <w:proofErr w:type="spellStart"/>
       <w:r>
         <w:rPr>
           <w:rFonts w:ascii="Amasis MT Pro" w:hAnsi="Amasis MT Pro"/>
@@ -5137,85 +6179,85 @@
         </w:rPr>
         <w:t>lask</w:t>
       </w:r>
-    </w:p>
-    <w:p>
-      <w:pPr>
-        <w:rPr>
-          <w:rFonts w:ascii="Amasis MT Pro" w:hAnsi="Amasis MT Pro"/>
-          <w:sz w:val="28"/>
-          <w:szCs w:val="28"/>
-        </w:rPr>
-      </w:pPr>
-    </w:p>
-    <w:p>
-      <w:pPr>
-        <w:rPr>
-          <w:rFonts w:ascii="Amasis MT Pro" w:hAnsi="Amasis MT Pro"/>
-          <w:sz w:val="36"/>
-          <w:szCs w:val="36"/>
-        </w:rPr>
-      </w:pPr>
-    </w:p>
-    <w:p>
-      <w:pPr>
-        <w:rPr>
-          <w:rFonts w:ascii="Amasis MT Pro" w:hAnsi="Amasis MT Pro"/>
-          <w:sz w:val="36"/>
-          <w:szCs w:val="36"/>
-        </w:rPr>
-      </w:pPr>
-    </w:p>
-    <w:p>
-      <w:pPr>
-        <w:rPr>
-          <w:rFonts w:ascii="Amasis MT Pro" w:hAnsi="Amasis MT Pro"/>
-          <w:sz w:val="36"/>
-          <w:szCs w:val="36"/>
-        </w:rPr>
-      </w:pPr>
-    </w:p>
-    <w:p>
-      <w:pPr>
-        <w:rPr>
-          <w:rFonts w:ascii="Amasis MT Pro" w:hAnsi="Amasis MT Pro"/>
-          <w:sz w:val="36"/>
-          <w:szCs w:val="36"/>
-        </w:rPr>
-      </w:pPr>
-    </w:p>
-    <w:p>
-      <w:pPr>
-        <w:rPr>
-          <w:rFonts w:ascii="Amasis MT Pro" w:hAnsi="Amasis MT Pro"/>
-          <w:sz w:val="36"/>
-          <w:szCs w:val="36"/>
-        </w:rPr>
-      </w:pPr>
-    </w:p>
-    <w:p>
-      <w:pPr>
-        <w:rPr>
-          <w:rFonts w:ascii="Amasis MT Pro" w:hAnsi="Amasis MT Pro"/>
-          <w:sz w:val="36"/>
-          <w:szCs w:val="36"/>
-        </w:rPr>
-      </w:pPr>
-    </w:p>
-    <w:p>
-      <w:pPr>
-        <w:rPr>
-          <w:rFonts w:ascii="Amasis MT Pro" w:hAnsi="Amasis MT Pro"/>
-          <w:sz w:val="36"/>
-          <w:szCs w:val="36"/>
-        </w:rPr>
-      </w:pPr>
-      <w:r>
-        <w:rPr>
-          <w:rFonts w:ascii="Amasis MT Pro" w:hAnsi="Amasis MT Pro"/>
-          <w:sz w:val="36"/>
-          <w:szCs w:val="36"/>
-        </w:rPr>
-        <w:lastRenderedPageBreak/>
+      <w:proofErr w:type="spellEnd"/>
+    </w:p>
+    <w:p>
+      <w:pPr>
+        <w:rPr>
+          <w:rFonts w:ascii="Amasis MT Pro" w:hAnsi="Amasis MT Pro"/>
+          <w:sz w:val="28"/>
+          <w:szCs w:val="28"/>
+        </w:rPr>
+      </w:pPr>
+    </w:p>
+    <w:p>
+      <w:pPr>
+        <w:rPr>
+          <w:rFonts w:ascii="Amasis MT Pro" w:hAnsi="Amasis MT Pro"/>
+          <w:sz w:val="36"/>
+          <w:szCs w:val="36"/>
+        </w:rPr>
+      </w:pPr>
+    </w:p>
+    <w:p>
+      <w:pPr>
+        <w:rPr>
+          <w:rFonts w:ascii="Amasis MT Pro" w:hAnsi="Amasis MT Pro"/>
+          <w:sz w:val="36"/>
+          <w:szCs w:val="36"/>
+        </w:rPr>
+      </w:pPr>
+    </w:p>
+    <w:p>
+      <w:pPr>
+        <w:rPr>
+          <w:rFonts w:ascii="Amasis MT Pro" w:hAnsi="Amasis MT Pro"/>
+          <w:sz w:val="36"/>
+          <w:szCs w:val="36"/>
+        </w:rPr>
+      </w:pPr>
+    </w:p>
+    <w:p>
+      <w:pPr>
+        <w:rPr>
+          <w:rFonts w:ascii="Amasis MT Pro" w:hAnsi="Amasis MT Pro"/>
+          <w:sz w:val="36"/>
+          <w:szCs w:val="36"/>
+        </w:rPr>
+      </w:pPr>
+    </w:p>
+    <w:p>
+      <w:pPr>
+        <w:rPr>
+          <w:rFonts w:ascii="Amasis MT Pro" w:hAnsi="Amasis MT Pro"/>
+          <w:sz w:val="36"/>
+          <w:szCs w:val="36"/>
+        </w:rPr>
+      </w:pPr>
+    </w:p>
+    <w:p>
+      <w:pPr>
+        <w:rPr>
+          <w:rFonts w:ascii="Amasis MT Pro" w:hAnsi="Amasis MT Pro"/>
+          <w:sz w:val="36"/>
+          <w:szCs w:val="36"/>
+        </w:rPr>
+      </w:pPr>
+    </w:p>
+    <w:p>
+      <w:pPr>
+        <w:rPr>
+          <w:rFonts w:ascii="Amasis MT Pro" w:hAnsi="Amasis MT Pro"/>
+          <w:sz w:val="36"/>
+          <w:szCs w:val="36"/>
+        </w:rPr>
+      </w:pPr>
+      <w:r>
+        <w:rPr>
+          <w:rFonts w:ascii="Amasis MT Pro" w:hAnsi="Amasis MT Pro"/>
+          <w:sz w:val="36"/>
+          <w:szCs w:val="36"/>
+        </w:rPr>
         <w:t>Esempio d’uso (</w:t>
       </w:r>
       <w:r>
@@ -5239,42 +6281,232 @@
       <w:pPr>
         <w:rPr>
           <w:rFonts w:ascii="Amasis MT Pro" w:hAnsi="Amasis MT Pro"/>
-          <w:sz w:val="28"/>
-          <w:szCs w:val="28"/>
-        </w:rPr>
-      </w:pPr>
-      <w:r>
-        <w:rPr>
-          <w:rFonts w:ascii="Amasis MT Pro" w:hAnsi="Amasis MT Pro"/>
-          <w:sz w:val="28"/>
-          <w:szCs w:val="28"/>
-        </w:rPr>
-        <w:t>Supponiamo di avere due animali di cui prendersi cura, è possibile creare un profilo utente, si inseriscono i nostri dati</w:t>
-      </w:r>
-      <w:r>
-        <w:rPr>
-          <w:rFonts w:ascii="Amasis MT Pro" w:hAnsi="Amasis MT Pro"/>
-          <w:sz w:val="28"/>
-          <w:szCs w:val="28"/>
-        </w:rPr>
-        <w:t xml:space="preserve"> nell’app per registrarsi ed effettuare il login. Successivamente si registrano gli animali uno alla volta con le proprie caratteristiche come peso, altezza, segni particolari…</w:t>
-      </w:r>
-    </w:p>
-    <w:p>
-      <w:pPr>
-        <w:rPr>
-          <w:rFonts w:ascii="Amasis MT Pro" w:hAnsi="Amasis MT Pro"/>
-          <w:sz w:val="28"/>
-          <w:szCs w:val="28"/>
-        </w:rPr>
-      </w:pPr>
-      <w:r>
-        <w:rPr>
-          <w:rFonts w:ascii="Amasis MT Pro" w:hAnsi="Amasis MT Pro"/>
-          <w:sz w:val="28"/>
-          <w:szCs w:val="28"/>
-        </w:rPr>
-        <w:t>Ora che le registrazioni sono fatte è possibile cercare servizi che possano interessarci messi online dai fornitori.</w:t>
+          <w:sz w:val="36"/>
+          <w:szCs w:val="36"/>
+        </w:rPr>
+      </w:pPr>
+    </w:p>
+    <w:p>
+      <w:pPr>
+        <w:rPr>
+          <w:rFonts w:ascii="Amasis MT Pro" w:hAnsi="Amasis MT Pro"/>
+          <w:sz w:val="28"/>
+          <w:szCs w:val="28"/>
+        </w:rPr>
+      </w:pPr>
+      <w:r>
+        <w:rPr>
+          <w:rFonts w:ascii="Amasis MT Pro" w:hAnsi="Amasis MT Pro"/>
+          <w:sz w:val="28"/>
+          <w:szCs w:val="28"/>
+        </w:rPr>
+        <w:t xml:space="preserve">L’utente x ha appena adottato un cucciolo di cane. </w:t>
+      </w:r>
+    </w:p>
+    <w:p>
+      <w:pPr>
+        <w:rPr>
+          <w:rFonts w:ascii="Amasis MT Pro" w:hAnsi="Amasis MT Pro"/>
+          <w:sz w:val="28"/>
+          <w:szCs w:val="28"/>
+        </w:rPr>
+      </w:pPr>
+      <w:r>
+        <w:rPr>
+          <w:rFonts w:ascii="Amasis MT Pro" w:hAnsi="Amasis MT Pro"/>
+          <w:sz w:val="28"/>
+          <w:szCs w:val="28"/>
+        </w:rPr>
+        <w:t>Dovrà innanzitutto registrarsi con il proprio indirizzo mail e password per poter accedere all’interno dell’app ed usufruire degli strumenti dati a disposizione.</w:t>
+      </w:r>
+    </w:p>
+    <w:p>
+      <w:pPr>
+        <w:rPr>
+          <w:rFonts w:ascii="Amasis MT Pro" w:hAnsi="Amasis MT Pro"/>
+          <w:sz w:val="28"/>
+          <w:szCs w:val="28"/>
+        </w:rPr>
+      </w:pPr>
+      <w:r>
+        <w:rPr>
+          <w:rFonts w:ascii="Amasis MT Pro" w:hAnsi="Amasis MT Pro"/>
+          <w:sz w:val="28"/>
+          <w:szCs w:val="28"/>
+        </w:rPr>
+        <w:t>Se già registrato, i dati verranno auto compilati e verrà permesso l’accesso.</w:t>
+      </w:r>
+    </w:p>
+    <w:p>
+      <w:pPr>
+        <w:rPr>
+          <w:rFonts w:ascii="Amasis MT Pro" w:hAnsi="Amasis MT Pro"/>
+          <w:sz w:val="28"/>
+          <w:szCs w:val="28"/>
+        </w:rPr>
+      </w:pPr>
+      <w:r>
+        <w:rPr>
+          <w:rFonts w:ascii="Amasis MT Pro" w:hAnsi="Amasis MT Pro"/>
+          <w:sz w:val="28"/>
+          <w:szCs w:val="28"/>
+        </w:rPr>
+        <w:t>L’utente vuole giustamente</w:t>
+      </w:r>
+      <w:r>
+        <w:rPr>
+          <w:rFonts w:ascii="Amasis MT Pro" w:hAnsi="Amasis MT Pro"/>
+          <w:sz w:val="28"/>
+          <w:szCs w:val="28"/>
+        </w:rPr>
+        <w:t xml:space="preserve"> tenere traccia delle</w:t>
+      </w:r>
+      <w:r>
+        <w:rPr>
+          <w:rFonts w:ascii="Amasis MT Pro" w:hAnsi="Amasis MT Pro"/>
+          <w:sz w:val="28"/>
+          <w:szCs w:val="28"/>
+        </w:rPr>
+        <w:t xml:space="preserve"> </w:t>
+      </w:r>
+      <w:r>
+        <w:rPr>
+          <w:rFonts w:ascii="Amasis MT Pro" w:hAnsi="Amasis MT Pro"/>
+          <w:sz w:val="28"/>
+          <w:szCs w:val="28"/>
+        </w:rPr>
+        <w:t xml:space="preserve">caratteristiche </w:t>
+      </w:r>
+      <w:r>
+        <w:rPr>
+          <w:rFonts w:ascii="Amasis MT Pro" w:hAnsi="Amasis MT Pro"/>
+          <w:sz w:val="28"/>
+          <w:szCs w:val="28"/>
+        </w:rPr>
+        <w:t xml:space="preserve">dell’animale </w:t>
+      </w:r>
+      <w:r>
+        <w:rPr>
+          <w:rFonts w:ascii="Amasis MT Pro" w:hAnsi="Amasis MT Pro"/>
+          <w:sz w:val="28"/>
+          <w:szCs w:val="28"/>
+        </w:rPr>
+        <w:t>(</w:t>
+      </w:r>
+      <w:r>
+        <w:rPr>
+          <w:rFonts w:ascii="Amasis MT Pro" w:hAnsi="Amasis MT Pro"/>
+          <w:sz w:val="28"/>
+          <w:szCs w:val="28"/>
+        </w:rPr>
+        <w:t>p</w:t>
+      </w:r>
+      <w:r>
+        <w:rPr>
+          <w:rFonts w:ascii="Amasis MT Pro" w:hAnsi="Amasis MT Pro"/>
+          <w:sz w:val="28"/>
+          <w:szCs w:val="28"/>
+        </w:rPr>
+        <w:t>eso, altezza, segni particolari) e soprattutto registrare le eventuali allergie o problematiche in maniera tale da poterne sempre tenere traccia in giro ed al bisogno. Avrà dunque la possibilità di registrare questo cucciolo con il suo nome ed anche un rating emotivo dell’animale</w:t>
+      </w:r>
+      <w:r>
+        <w:rPr>
+          <w:rFonts w:ascii="Amasis MT Pro" w:hAnsi="Amasis MT Pro"/>
+          <w:sz w:val="28"/>
+          <w:szCs w:val="28"/>
+        </w:rPr>
+        <w:t>, oltre che le caratteristiche comprensive di una cartella clinica.</w:t>
+      </w:r>
+    </w:p>
+    <w:p>
+      <w:pPr>
+        <w:rPr>
+          <w:rFonts w:ascii="Amasis MT Pro" w:hAnsi="Amasis MT Pro"/>
+          <w:sz w:val="28"/>
+          <w:szCs w:val="28"/>
+        </w:rPr>
+      </w:pPr>
+      <w:r>
+        <w:rPr>
+          <w:rFonts w:ascii="Amasis MT Pro" w:hAnsi="Amasis MT Pro"/>
+          <w:sz w:val="28"/>
+          <w:szCs w:val="28"/>
+        </w:rPr>
+        <w:t>Ma se l’utente avesse anche un altro animale da gestire?</w:t>
+      </w:r>
+    </w:p>
+    <w:p>
+      <w:pPr>
+        <w:rPr>
+          <w:rFonts w:ascii="Amasis MT Pro" w:hAnsi="Amasis MT Pro"/>
+          <w:sz w:val="28"/>
+          <w:szCs w:val="28"/>
+        </w:rPr>
+      </w:pPr>
+      <w:r>
+        <w:rPr>
+          <w:rFonts w:ascii="Amasis MT Pro" w:hAnsi="Amasis MT Pro"/>
+          <w:sz w:val="28"/>
+          <w:szCs w:val="28"/>
+        </w:rPr>
+        <w:t>Potrà effettivamente aggiungere anc</w:t>
+      </w:r>
+      <w:r>
+        <w:rPr>
+          <w:rFonts w:ascii="Amasis MT Pro" w:hAnsi="Amasis MT Pro"/>
+          <w:sz w:val="28"/>
+          <w:szCs w:val="28"/>
+        </w:rPr>
+        <w:t>h</w:t>
+      </w:r>
+      <w:r>
+        <w:rPr>
+          <w:rFonts w:ascii="Amasis MT Pro" w:hAnsi="Amasis MT Pro"/>
+          <w:sz w:val="28"/>
+          <w:szCs w:val="28"/>
+        </w:rPr>
+        <w:t>e quest’ultimo in maniera tale da avere nella sua Home traccia de</w:t>
+      </w:r>
+      <w:r>
+        <w:rPr>
+          <w:rFonts w:ascii="Amasis MT Pro" w:hAnsi="Amasis MT Pro"/>
+          <w:sz w:val="28"/>
+          <w:szCs w:val="28"/>
+        </w:rPr>
+        <w:t>gli animali registrati</w:t>
+      </w:r>
+      <w:r>
+        <w:rPr>
+          <w:rFonts w:ascii="Amasis MT Pro" w:hAnsi="Amasis MT Pro"/>
+          <w:sz w:val="28"/>
+          <w:szCs w:val="28"/>
+        </w:rPr>
+        <w:t>.</w:t>
+      </w:r>
+    </w:p>
+    <w:p>
+      <w:pPr>
+        <w:rPr>
+          <w:rFonts w:ascii="Amasis MT Pro" w:hAnsi="Amasis MT Pro"/>
+          <w:sz w:val="28"/>
+          <w:szCs w:val="28"/>
+        </w:rPr>
+      </w:pPr>
+      <w:r>
+        <w:rPr>
+          <w:rFonts w:ascii="Amasis MT Pro" w:hAnsi="Amasis MT Pro"/>
+          <w:sz w:val="28"/>
+          <w:szCs w:val="28"/>
+        </w:rPr>
+        <w:t>Ora che le registrazioni sono fatte è possibile cercare servizi che possano interessarci messi online dai fornitori</w:t>
+      </w:r>
+      <w:r>
+        <w:rPr>
+          <w:rFonts w:ascii="Amasis MT Pro" w:hAnsi="Amasis MT Pro"/>
+          <w:sz w:val="28"/>
+          <w:szCs w:val="28"/>
+        </w:rPr>
+        <w:t xml:space="preserve"> (SVILUPPO FUTURO)</w:t>
       </w:r>
     </w:p>
     <w:p>
@@ -5293,157 +6525,198 @@
         </w:rPr>
         <w:t>Si possono anche registrare visite veterinarie ricevute e il comportamento dell’animale</w:t>
       </w:r>
-    </w:p>
-    <w:p>
-      <w:pPr>
-        <w:rPr>
-          <w:rFonts w:ascii="Amasis MT Pro" w:hAnsi="Amasis MT Pro"/>
-          <w:sz w:val="28"/>
-          <w:szCs w:val="28"/>
-        </w:rPr>
-      </w:pPr>
-    </w:p>
-    <w:p>
-      <w:pPr>
-        <w:rPr>
-          <w:rFonts w:ascii="Amasis MT Pro" w:hAnsi="Amasis MT Pro"/>
-          <w:sz w:val="36"/>
-          <w:szCs w:val="36"/>
-        </w:rPr>
-      </w:pPr>
-    </w:p>
-    <w:p>
-      <w:pPr>
-        <w:rPr>
-          <w:rFonts w:ascii="Amasis MT Pro" w:hAnsi="Amasis MT Pro"/>
-          <w:sz w:val="36"/>
-          <w:szCs w:val="36"/>
-        </w:rPr>
-      </w:pPr>
-    </w:p>
-    <w:p>
-      <w:pPr>
-        <w:rPr>
-          <w:rFonts w:ascii="Amasis MT Pro" w:hAnsi="Amasis MT Pro"/>
-          <w:sz w:val="36"/>
-          <w:szCs w:val="36"/>
-        </w:rPr>
-      </w:pPr>
-    </w:p>
-    <w:p>
-      <w:pPr>
-        <w:rPr>
-          <w:rFonts w:ascii="Amasis MT Pro" w:hAnsi="Amasis MT Pro"/>
-          <w:sz w:val="36"/>
-          <w:szCs w:val="36"/>
-        </w:rPr>
-      </w:pPr>
-    </w:p>
-    <w:p>
-      <w:pPr>
-        <w:rPr>
-          <w:rFonts w:ascii="Amasis MT Pro" w:hAnsi="Amasis MT Pro"/>
-          <w:sz w:val="36"/>
-          <w:szCs w:val="36"/>
-        </w:rPr>
-      </w:pPr>
-    </w:p>
-    <w:p>
-      <w:pPr>
-        <w:rPr>
-          <w:rFonts w:ascii="Amasis MT Pro" w:hAnsi="Amasis MT Pro"/>
-          <w:sz w:val="36"/>
-          <w:szCs w:val="36"/>
-        </w:rPr>
-      </w:pPr>
-    </w:p>
-    <w:p>
-      <w:pPr>
-        <w:rPr>
-          <w:rFonts w:ascii="Amasis MT Pro" w:hAnsi="Amasis MT Pro"/>
-          <w:sz w:val="36"/>
-          <w:szCs w:val="36"/>
-        </w:rPr>
-      </w:pPr>
-    </w:p>
-    <w:p>
-      <w:pPr>
-        <w:rPr>
-          <w:rFonts w:ascii="Amasis MT Pro" w:hAnsi="Amasis MT Pro"/>
-          <w:sz w:val="36"/>
-          <w:szCs w:val="36"/>
-        </w:rPr>
-      </w:pPr>
-    </w:p>
-    <w:p>
-      <w:pPr>
-        <w:rPr>
-          <w:rFonts w:ascii="Amasis MT Pro" w:hAnsi="Amasis MT Pro"/>
-          <w:sz w:val="36"/>
-          <w:szCs w:val="36"/>
-        </w:rPr>
-      </w:pPr>
-    </w:p>
-    <w:p>
-      <w:pPr>
-        <w:rPr>
-          <w:rFonts w:ascii="Amasis MT Pro" w:hAnsi="Amasis MT Pro"/>
-          <w:sz w:val="36"/>
-          <w:szCs w:val="36"/>
-        </w:rPr>
-      </w:pPr>
-    </w:p>
-    <w:p>
-      <w:pPr>
-        <w:rPr>
-          <w:rFonts w:ascii="Amasis MT Pro" w:hAnsi="Amasis MT Pro"/>
-          <w:sz w:val="36"/>
-          <w:szCs w:val="36"/>
-        </w:rPr>
-      </w:pPr>
-    </w:p>
-    <w:p>
-      <w:pPr>
-        <w:rPr>
-          <w:rFonts w:ascii="Amasis MT Pro" w:hAnsi="Amasis MT Pro"/>
-          <w:sz w:val="36"/>
-          <w:szCs w:val="36"/>
-        </w:rPr>
-      </w:pPr>
-    </w:p>
-    <w:p>
-      <w:pPr>
-        <w:rPr>
-          <w:rFonts w:ascii="Amasis MT Pro" w:hAnsi="Amasis MT Pro"/>
-          <w:sz w:val="36"/>
-          <w:szCs w:val="36"/>
-        </w:rPr>
-      </w:pPr>
-    </w:p>
-    <w:p>
-      <w:pPr>
-        <w:rPr>
-          <w:rFonts w:ascii="Amasis MT Pro" w:hAnsi="Amasis MT Pro"/>
-          <w:sz w:val="36"/>
-          <w:szCs w:val="36"/>
-        </w:rPr>
-      </w:pPr>
-    </w:p>
-    <w:p>
-      <w:pPr>
-        <w:rPr>
-          <w:rFonts w:ascii="Amasis MT Pro" w:hAnsi="Amasis MT Pro"/>
-          <w:sz w:val="36"/>
-          <w:szCs w:val="36"/>
-        </w:rPr>
-      </w:pPr>
-      <w:r>
-        <w:rPr>
-          <w:rFonts w:ascii="Amasis MT Pro" w:hAnsi="Amasis MT Pro"/>
-          <w:sz w:val="36"/>
-          <w:szCs w:val="36"/>
-        </w:rPr>
-        <w:lastRenderedPageBreak/>
+      <w:r>
+        <w:rPr>
+          <w:rFonts w:ascii="Amasis MT Pro" w:hAnsi="Amasis MT Pro"/>
+          <w:sz w:val="28"/>
+          <w:szCs w:val="28"/>
+        </w:rPr>
+        <w:t>.</w:t>
+      </w:r>
+    </w:p>
+    <w:p>
+      <w:pPr>
+        <w:rPr>
+          <w:rFonts w:ascii="Amasis MT Pro" w:hAnsi="Amasis MT Pro"/>
+          <w:sz w:val="28"/>
+          <w:szCs w:val="28"/>
+        </w:rPr>
+      </w:pPr>
+      <w:r>
+        <w:rPr>
+          <w:rFonts w:ascii="Amasis MT Pro" w:hAnsi="Amasis MT Pro"/>
+          <w:sz w:val="28"/>
+          <w:szCs w:val="28"/>
+        </w:rPr>
+        <w:t xml:space="preserve">Tutte queste attività saranno ordinate con rispettive data ed orario all’interno del calendario utente. </w:t>
+      </w:r>
+    </w:p>
+    <w:p>
+      <w:pPr>
+        <w:rPr>
+          <w:rFonts w:ascii="Amasis MT Pro" w:hAnsi="Amasis MT Pro"/>
+          <w:sz w:val="28"/>
+          <w:szCs w:val="28"/>
+        </w:rPr>
+      </w:pPr>
+      <w:r>
+        <w:rPr>
+          <w:rFonts w:ascii="Amasis MT Pro" w:hAnsi="Amasis MT Pro"/>
+          <w:sz w:val="28"/>
+          <w:szCs w:val="28"/>
+        </w:rPr>
+        <w:t>Il calendario ha la possibilità di registrare localmente questi eventi e facilitare l’utente in questa interazione.</w:t>
+      </w:r>
+    </w:p>
+    <w:p>
+      <w:pPr>
+        <w:rPr>
+          <w:rFonts w:ascii="Amasis MT Pro" w:hAnsi="Amasis MT Pro"/>
+          <w:sz w:val="28"/>
+          <w:szCs w:val="28"/>
+        </w:rPr>
+      </w:pPr>
+    </w:p>
+    <w:p>
+      <w:pPr>
+        <w:rPr>
+          <w:rFonts w:ascii="Amasis MT Pro" w:hAnsi="Amasis MT Pro"/>
+          <w:sz w:val="36"/>
+          <w:szCs w:val="36"/>
+        </w:rPr>
+      </w:pPr>
+    </w:p>
+    <w:p>
+      <w:pPr>
+        <w:rPr>
+          <w:rFonts w:ascii="Amasis MT Pro" w:hAnsi="Amasis MT Pro"/>
+          <w:sz w:val="36"/>
+          <w:szCs w:val="36"/>
+        </w:rPr>
+      </w:pPr>
+    </w:p>
+    <w:p>
+      <w:pPr>
+        <w:rPr>
+          <w:rFonts w:ascii="Amasis MT Pro" w:hAnsi="Amasis MT Pro"/>
+          <w:sz w:val="36"/>
+          <w:szCs w:val="36"/>
+        </w:rPr>
+      </w:pPr>
+    </w:p>
+    <w:p>
+      <w:pPr>
+        <w:rPr>
+          <w:rFonts w:ascii="Amasis MT Pro" w:hAnsi="Amasis MT Pro"/>
+          <w:sz w:val="36"/>
+          <w:szCs w:val="36"/>
+        </w:rPr>
+      </w:pPr>
+    </w:p>
+    <w:p>
+      <w:pPr>
+        <w:rPr>
+          <w:rFonts w:ascii="Amasis MT Pro" w:hAnsi="Amasis MT Pro"/>
+          <w:sz w:val="36"/>
+          <w:szCs w:val="36"/>
+        </w:rPr>
+      </w:pPr>
+    </w:p>
+    <w:p>
+      <w:pPr>
+        <w:rPr>
+          <w:rFonts w:ascii="Amasis MT Pro" w:hAnsi="Amasis MT Pro"/>
+          <w:sz w:val="36"/>
+          <w:szCs w:val="36"/>
+        </w:rPr>
+      </w:pPr>
+    </w:p>
+    <w:p>
+      <w:pPr>
+        <w:rPr>
+          <w:rFonts w:ascii="Amasis MT Pro" w:hAnsi="Amasis MT Pro"/>
+          <w:sz w:val="36"/>
+          <w:szCs w:val="36"/>
+        </w:rPr>
+      </w:pPr>
+    </w:p>
+    <w:p>
+      <w:pPr>
+        <w:rPr>
+          <w:rFonts w:ascii="Amasis MT Pro" w:hAnsi="Amasis MT Pro"/>
+          <w:sz w:val="36"/>
+          <w:szCs w:val="36"/>
+        </w:rPr>
+      </w:pPr>
+    </w:p>
+    <w:p>
+      <w:pPr>
+        <w:rPr>
+          <w:rFonts w:ascii="Amasis MT Pro" w:hAnsi="Amasis MT Pro"/>
+          <w:sz w:val="36"/>
+          <w:szCs w:val="36"/>
+        </w:rPr>
+      </w:pPr>
+    </w:p>
+    <w:p>
+      <w:pPr>
+        <w:rPr>
+          <w:rFonts w:ascii="Amasis MT Pro" w:hAnsi="Amasis MT Pro"/>
+          <w:sz w:val="36"/>
+          <w:szCs w:val="36"/>
+        </w:rPr>
+      </w:pPr>
+    </w:p>
+    <w:p>
+      <w:pPr>
+        <w:rPr>
+          <w:rFonts w:ascii="Amasis MT Pro" w:hAnsi="Amasis MT Pro"/>
+          <w:sz w:val="36"/>
+          <w:szCs w:val="36"/>
+        </w:rPr>
+      </w:pPr>
+    </w:p>
+    <w:p>
+      <w:pPr>
+        <w:rPr>
+          <w:rFonts w:ascii="Amasis MT Pro" w:hAnsi="Amasis MT Pro"/>
+          <w:sz w:val="36"/>
+          <w:szCs w:val="36"/>
+        </w:rPr>
+      </w:pPr>
+    </w:p>
+    <w:p>
+      <w:pPr>
+        <w:rPr>
+          <w:rFonts w:ascii="Amasis MT Pro" w:hAnsi="Amasis MT Pro"/>
+          <w:sz w:val="36"/>
+          <w:szCs w:val="36"/>
+        </w:rPr>
+      </w:pPr>
+    </w:p>
+    <w:p>
+      <w:pPr>
+        <w:rPr>
+          <w:rFonts w:ascii="Amasis MT Pro" w:hAnsi="Amasis MT Pro"/>
+          <w:sz w:val="36"/>
+          <w:szCs w:val="36"/>
+        </w:rPr>
+      </w:pPr>
+    </w:p>
+    <w:p>
+      <w:pPr>
+        <w:rPr>
+          <w:rFonts w:ascii="Amasis MT Pro" w:hAnsi="Amasis MT Pro"/>
+          <w:sz w:val="36"/>
+          <w:szCs w:val="36"/>
+        </w:rPr>
+      </w:pPr>
+      <w:r>
+        <w:rPr>
+          <w:rFonts w:ascii="Amasis MT Pro" w:hAnsi="Amasis MT Pro"/>
+          <w:sz w:val="36"/>
+          <w:szCs w:val="36"/>
+        </w:rPr>
         <w:t>Sviluppi futuri</w:t>
       </w:r>
     </w:p>
@@ -5455,13 +6728,23 @@
           <w:szCs w:val="28"/>
         </w:rPr>
       </w:pPr>
-      <w:r>
-        <w:rPr>
-          <w:rFonts w:ascii="Amasis MT Pro" w:hAnsi="Amasis MT Pro"/>
-          <w:sz w:val="28"/>
-          <w:szCs w:val="28"/>
-        </w:rPr>
-        <w:t xml:space="preserve">Crikle potrà essere ampliato in modo da </w:t>
+      <w:proofErr w:type="spellStart"/>
+      <w:r>
+        <w:rPr>
+          <w:rFonts w:ascii="Amasis MT Pro" w:hAnsi="Amasis MT Pro"/>
+          <w:sz w:val="28"/>
+          <w:szCs w:val="28"/>
+        </w:rPr>
+        <w:t>Crikle</w:t>
+      </w:r>
+      <w:proofErr w:type="spellEnd"/>
+      <w:r>
+        <w:rPr>
+          <w:rFonts w:ascii="Amasis MT Pro" w:hAnsi="Amasis MT Pro"/>
+          <w:sz w:val="28"/>
+          <w:szCs w:val="28"/>
+        </w:rPr>
+        <w:t xml:space="preserve"> potrà essere ampliato in modo da </w:t>
       </w:r>
       <w:r>
         <w:rPr>
@@ -5480,6 +6763,61 @@
           <w:szCs w:val="28"/>
         </w:rPr>
       </w:pPr>
+      <w:r>
+        <w:rPr>
+          <w:rFonts w:ascii="Amasis MT Pro" w:hAnsi="Amasis MT Pro"/>
+          <w:sz w:val="28"/>
+          <w:szCs w:val="28"/>
+        </w:rPr>
+        <w:t>Le prenotazioni e la ricerca dei servizi saranno degli sviluppi futuri in quanto abbiamo trovato difficoltà nel finalizzare questi componenti.</w:t>
+      </w:r>
+    </w:p>
+    <w:p>
+      <w:pPr>
+        <w:rPr>
+          <w:rFonts w:ascii="Amasis MT Pro" w:hAnsi="Amasis MT Pro"/>
+          <w:color w:val="FF0000"/>
+          <w:sz w:val="28"/>
+          <w:szCs w:val="28"/>
+        </w:rPr>
+      </w:pPr>
+      <w:r>
+        <w:rPr>
+          <w:rFonts w:ascii="Amasis MT Pro" w:hAnsi="Amasis MT Pro"/>
+          <w:color w:val="FF0000"/>
+          <w:sz w:val="28"/>
+          <w:szCs w:val="28"/>
+        </w:rPr>
+        <w:t>Anche il calendario che salvi i propri dati sul Database remoto e non solo su quello locale può essere un aspetto da implementare in futuro.</w:t>
+      </w:r>
+    </w:p>
+    <w:p>
+      <w:pPr>
+        <w:rPr>
+          <w:rFonts w:ascii="Amasis MT Pro" w:hAnsi="Amasis MT Pro"/>
+          <w:color w:val="FF0000"/>
+          <w:sz w:val="28"/>
+          <w:szCs w:val="28"/>
+        </w:rPr>
+      </w:pPr>
+      <w:r>
+        <w:rPr>
+          <w:rFonts w:ascii="Amasis MT Pro" w:hAnsi="Amasis MT Pro"/>
+          <w:color w:val="FF0000"/>
+          <w:sz w:val="28"/>
+          <w:szCs w:val="28"/>
+        </w:rPr>
+        <w:t>Per quanto riguarda la parte web manca appunto il collegamento dalla ricerca delle attività commerciali da parte dell’utente e quindi la risposta delle attività del fornitore dal sito.</w:t>
+      </w:r>
+    </w:p>
+    <w:p>
+      <w:pPr>
+        <w:rPr>
+          <w:rFonts w:ascii="Amasis MT Pro" w:hAnsi="Amasis MT Pro"/>
+          <w:sz w:val="28"/>
+          <w:szCs w:val="28"/>
+        </w:rPr>
+      </w:pPr>
     </w:p>
     <w:p>
       <w:pPr>
@@ -5491,7 +6829,7 @@
       </w:pPr>
     </w:p>
     <w:sectPr>
-      <w:footerReference w:type="default" r:id="rId28"/>
+      <w:footerReference w:type="default" r:id="rId29"/>
       <w:pgSz w:w="11906" w:h="16838" w:code="9"/>
       <w:pgMar w:top="1418" w:right="1134" w:bottom="1134" w:left="1134" w:header="709" w:footer="340" w:gutter="0"/>
       <w:cols w:space="708"/>
@@ -5528,6 +6866,28 @@
 
 <file path=word/footer1.xml><?xml version="1.0" encoding="utf-8"?>
 <w:ftr xmlns:wpc="http://schemas.microsoft.com/office/word/2010/wordprocessingCanvas" xmlns:cx="http://schemas.microsoft.com/office/drawing/2014/chartex" xmlns:cx1="http://schemas.microsoft.com/office/drawing/2015/9/8/chartex" xmlns:cx2="http://schemas.microsoft.com/office/drawing/2015/10/21/chartex" xmlns:cx3="http://schemas.microsoft.com/office/drawing/2016/5/9/chartex" xmlns:cx4="http://schemas.microsoft.com/office/drawing/2016/5/10/chartex" xmlns:cx5="http://schemas.microsoft.com/office/drawing/2016/5/11/chartex" xmlns:cx6="http://schemas.microsoft.com/office/drawing/2016/5/12/chartex" xmlns:cx7="http://schemas.microsoft.com/office/drawing/2016/5/13/chartex" xmlns:cx8="http://schemas.microsoft.com/office/drawing/2016/5/14/chartex" xmlns:mc="http://schemas.openxmlformats.org/markup-compatibility/2006" xmlns:aink="http://schemas.microsoft.com/office/drawing/2016/ink" xmlns:am3d="http://schemas.microsoft.com/office/drawing/2017/model3d" xmlns:o="urn:schemas-microsoft-com:office:office" xmlns:oel="http://schemas.microsoft.com/office/2019/extlst" xmlns:r="http://schemas.openxmlformats.org/officeDocument/2006/relationships" xmlns:m="http://schemas.openxmlformats.org/officeDocument/2006/math" xmlns:v="urn:schemas-microsoft-com:vml" xmlns:wp14="http://schemas.microsoft.com/office/word/2010/wordprocessingDrawing" xmlns:wp="http://schemas.openxmlformats.org/drawingml/2006/wordprocessingDrawing" xmlns:w10="urn:schemas-microsoft-com:office:word" xmlns:w="http://schemas.openxmlformats.org/wordprocessingml/2006/main" xmlns:w14="http://schemas.microsoft.com/office/word/2010/wordml" xmlns:w15="http://schemas.microsoft.com/office/word/2012/wordml" xmlns:w16cex="http://schemas.microsoft.com/office/word/2018/wordml/cex" xmlns:w16cid="http://schemas.microsoft.com/office/word/2016/wordml/cid" xmlns:w16="http://schemas.microsoft.com/office/word/2018/wordml" xmlns:w16du="http://schemas.microsoft.com/office/word/2023/wordml/word16du" xmlns:w16sdtdh="http://schemas.microsoft.com/office/word/2020/wordml/sdtdatahash" xmlns:w16sdtfl="http://schemas.microsoft.com/office/word/2024/wordml/sdtformatlock" xmlns:w16se="http://schemas.microsoft.com/office/word/2015/wordml/symex" xmlns:wpg="http://schemas.microsoft.com/office/word/2010/wordprocessingGroup" xmlns:wpi="http://schemas.microsoft.com/office/word/2010/wordprocessingInk" xmlns:wne="http://schemas.microsoft.com/office/word/2006/wordml" xmlns:wps="http://schemas.microsoft.com/office/word/2010/wordprocessingShape" mc:Ignorable="w14 w15 w16se w16cid w16 w16cex w16sdtdh w16sdtfl w16du wp14">
+  <w:sdt>
+    <w:sdtPr>
+      <w:id w:val="1115333090"/>
+      <w:docPartObj>
+        <w:docPartGallery w:val="Page Numbers (Bottom of Page)"/>
+        <w:docPartUnique/>
+      </w:docPartObj>
+    </w:sdtPr>
+    <w:sdtContent>
+      <w:p>
+        <w:pPr>
+          <w:pStyle w:val="Pidipagina"/>
+        </w:pPr>
+        <w:r>
+          <w:tab/>
+        </w:r>
+        <w:r>
+          <w:tab/>
+        </w:r>
+      </w:p>
+    </w:sdtContent>
+  </w:sdt>
   <w:p>
     <w:pPr>
       <w:pStyle w:val="Pidipagina"/>
@@ -5537,6 +6897,24 @@
         <w:tab w:val="left" w:pos="8196"/>
       </w:tabs>
     </w:pPr>
+    <w:r>
+      <w:tab/>
+    </w:r>
+    <w:r>
+      <w:tab/>
+    </w:r>
+    <w:r>
+      <w:tab/>
+    </w:r>
+    <w:r>
+      <w:tab/>
+    </w:r>
+    <w:r>
+      <w:tab/>
+    </w:r>
+    <w:r>
+      <w:tab/>
+    </w:r>
   </w:p>
 </w:ftr>
 </file>
@@ -5569,6 +6947,118 @@
 <file path=word/numbering.xml><?xml version="1.0" encoding="utf-8"?>
 <w:numbering xmlns:wpc="http://schemas.microsoft.com/office/word/2010/wordprocessingCanvas" xmlns:cx="http://schemas.microsoft.com/office/drawing/2014/chartex" xmlns:cx1="http://schemas.microsoft.com/office/drawing/2015/9/8/chartex" xmlns:cx2="http://schemas.microsoft.com/office/drawing/2015/10/21/chartex" xmlns:cx3="http://schemas.microsoft.com/office/drawing/2016/5/9/chartex" xmlns:cx4="http://schemas.microsoft.com/office/drawing/2016/5/10/chartex" xmlns:cx5="http://schemas.microsoft.com/office/drawing/2016/5/11/chartex" xmlns:cx6="http://schemas.microsoft.com/office/drawing/2016/5/12/chartex" xmlns:cx7="http://schemas.microsoft.com/office/drawing/2016/5/13/chartex" xmlns:cx8="http://schemas.microsoft.com/office/drawing/2016/5/14/chartex" xmlns:mc="http://schemas.openxmlformats.org/markup-compatibility/2006" xmlns:aink="http://schemas.microsoft.com/office/drawing/2016/ink" xmlns:am3d="http://schemas.microsoft.com/office/drawing/2017/model3d" xmlns:o="urn:schemas-microsoft-com:office:office" xmlns:oel="http://schemas.microsoft.com/office/2019/extlst" xmlns:r="http://schemas.openxmlformats.org/officeDocument/2006/relationships" xmlns:m="http://schemas.openxmlformats.org/officeDocument/2006/math" xmlns:v="urn:schemas-microsoft-com:vml" xmlns:wp14="http://schemas.microsoft.com/office/word/2010/wordprocessingDrawing" xmlns:wp="http://schemas.openxmlformats.org/drawingml/2006/wordprocessingDrawing" xmlns:w10="urn:schemas-microsoft-com:office:word" xmlns:w="http://schemas.openxmlformats.org/wordprocessingml/2006/main" xmlns:w14="http://schemas.microsoft.com/office/word/2010/wordml" xmlns:w15="http://schemas.microsoft.com/office/word/2012/wordml" xmlns:w16cex="http://schemas.microsoft.com/office/word/2018/wordml/cex" xmlns:w16cid="http://schemas.microsoft.com/office/word/2016/wordml/cid" xmlns:w16="http://schemas.microsoft.com/office/word/2018/wordml" xmlns:w16du="http://schemas.microsoft.com/office/word/2023/wordml/word16du" xmlns:w16sdtdh="http://schemas.microsoft.com/office/word/2020/wordml/sdtdatahash" xmlns:w16sdtfl="http://schemas.microsoft.com/office/word/2024/wordml/sdtformatlock" xmlns:w16se="http://schemas.microsoft.com/office/word/2015/wordml/symex" xmlns:wpg="http://schemas.microsoft.com/office/word/2010/wordprocessingGroup" xmlns:wpi="http://schemas.microsoft.com/office/word/2010/wordprocessingInk" xmlns:wne="http://schemas.microsoft.com/office/word/2006/wordml" xmlns:wps="http://schemas.microsoft.com/office/word/2010/wordprocessingShape" mc:Ignorable="w14 w15 w16se w16cid w16 w16cex w16sdtdh w16sdtfl w16du wp14">
   <w:abstractNum w:abstractNumId="0" w15:restartNumberingAfterBreak="0">
+    <w:nsid w:val="06B74B36"/>
+    <w:multiLevelType w:val="hybridMultilevel"/>
+    <w:tmpl w:val="DF8EE680"/>
+    <w:lvl w:ilvl="0" w:tplc="547EFF9E">
+      <w:numFmt w:val="bullet"/>
+      <w:lvlText w:val="-"/>
+      <w:lvlJc w:val="left"/>
+      <w:pPr>
+        <w:ind w:left="720" w:hanging="360"/>
+      </w:pPr>
+      <w:rPr>
+        <w:rFonts w:ascii="Amasis MT Pro" w:eastAsiaTheme="minorHAnsi" w:hAnsi="Amasis MT Pro" w:cstheme="minorBidi" w:hint="default"/>
+      </w:rPr>
+    </w:lvl>
+    <w:lvl w:ilvl="1" w:tplc="04100003" w:tentative="1">
+      <w:start w:val="1"/>
+      <w:numFmt w:val="bullet"/>
+      <w:lvlText w:val="o"/>
+      <w:lvlJc w:val="left"/>
+      <w:pPr>
+        <w:ind w:left="1440" w:hanging="360"/>
+      </w:pPr>
+      <w:rPr>
+        <w:rFonts w:ascii="Courier New" w:hAnsi="Courier New" w:cs="Courier New" w:hint="default"/>
+      </w:rPr>
+    </w:lvl>
+    <w:lvl w:ilvl="2" w:tplc="04100005" w:tentative="1">
+      <w:start w:val="1"/>
+      <w:numFmt w:val="bullet"/>
+      <w:lvlText w:val=""/>
+      <w:lvlJc w:val="left"/>
+      <w:pPr>
+        <w:ind w:left="2160" w:hanging="360"/>
+      </w:pPr>
+      <w:rPr>
+        <w:rFonts w:ascii="Wingdings" w:hAnsi="Wingdings" w:hint="default"/>
+      </w:rPr>
+    </w:lvl>
+    <w:lvl w:ilvl="3" w:tplc="04100001" w:tentative="1">
+      <w:start w:val="1"/>
+      <w:numFmt w:val="bullet"/>
+      <w:lvlText w:val=""/>
+      <w:lvlJc w:val="left"/>
+      <w:pPr>
+        <w:ind w:left="2880" w:hanging="360"/>
+      </w:pPr>
+      <w:rPr>
+        <w:rFonts w:ascii="Symbol" w:hAnsi="Symbol" w:hint="default"/>
+      </w:rPr>
+    </w:lvl>
+    <w:lvl w:ilvl="4" w:tplc="04100003" w:tentative="1">
+      <w:start w:val="1"/>
+      <w:numFmt w:val="bullet"/>
+      <w:lvlText w:val="o"/>
+      <w:lvlJc w:val="left"/>
+      <w:pPr>
+        <w:ind w:left="3600" w:hanging="360"/>
+      </w:pPr>
+      <w:rPr>
+        <w:rFonts w:ascii="Courier New" w:hAnsi="Courier New" w:cs="Courier New" w:hint="default"/>
+      </w:rPr>
+    </w:lvl>
+    <w:lvl w:ilvl="5" w:tplc="04100005" w:tentative="1">
+      <w:start w:val="1"/>
+      <w:numFmt w:val="bullet"/>
+      <w:lvlText w:val=""/>
+      <w:lvlJc w:val="left"/>
+      <w:pPr>
+        <w:ind w:left="4320" w:hanging="360"/>
+      </w:pPr>
+      <w:rPr>
+        <w:rFonts w:ascii="Wingdings" w:hAnsi="Wingdings" w:hint="default"/>
+      </w:rPr>
+    </w:lvl>
+    <w:lvl w:ilvl="6" w:tplc="04100001" w:tentative="1">
+      <w:start w:val="1"/>
+      <w:numFmt w:val="bullet"/>
+      <w:lvlText w:val=""/>
+      <w:lvlJc w:val="left"/>
+      <w:pPr>
+        <w:ind w:left="5040" w:hanging="360"/>
+      </w:pPr>
+      <w:rPr>
+        <w:rFonts w:ascii="Symbol" w:hAnsi="Symbol" w:hint="default"/>
+      </w:rPr>
+    </w:lvl>
+    <w:lvl w:ilvl="7" w:tplc="04100003" w:tentative="1">
+      <w:start w:val="1"/>
+      <w:numFmt w:val="bullet"/>
+      <w:lvlText w:val="o"/>
+      <w:lvlJc w:val="left"/>
+      <w:pPr>
+        <w:ind w:left="5760" w:hanging="360"/>
+      </w:pPr>
+      <w:rPr>
+        <w:rFonts w:ascii="Courier New" w:hAnsi="Courier New" w:cs="Courier New" w:hint="default"/>
+      </w:rPr>
+    </w:lvl>
+    <w:lvl w:ilvl="8" w:tplc="04100005" w:tentative="1">
+      <w:start w:val="1"/>
+      <w:numFmt w:val="bullet"/>
+      <w:lvlText w:val=""/>
+      <w:lvlJc w:val="left"/>
+      <w:pPr>
+        <w:ind w:left="6480" w:hanging="360"/>
+      </w:pPr>
+      <w:rPr>
+        <w:rFonts w:ascii="Wingdings" w:hAnsi="Wingdings" w:hint="default"/>
+      </w:rPr>
+    </w:lvl>
+  </w:abstractNum>
+  <w:abstractNum w:abstractNumId="1" w15:restartNumberingAfterBreak="0">
     <w:nsid w:val="12FE45E5"/>
     <w:multiLevelType w:val="hybridMultilevel"/>
     <w:tmpl w:val="508C9A4C"/>
@@ -5680,7 +7170,7 @@
       </w:rPr>
     </w:lvl>
   </w:abstractNum>
-  <w:abstractNum w:abstractNumId="1" w15:restartNumberingAfterBreak="0">
+  <w:abstractNum w:abstractNumId="2" w15:restartNumberingAfterBreak="0">
     <w:nsid w:val="1E085A79"/>
     <w:multiLevelType w:val="hybridMultilevel"/>
     <w:tmpl w:val="9D601C0A"/>
@@ -5792,7 +7282,7 @@
       </w:rPr>
     </w:lvl>
   </w:abstractNum>
-  <w:abstractNum w:abstractNumId="2" w15:restartNumberingAfterBreak="0">
+  <w:abstractNum w:abstractNumId="3" w15:restartNumberingAfterBreak="0">
     <w:nsid w:val="32180DA5"/>
     <w:multiLevelType w:val="hybridMultilevel"/>
     <w:tmpl w:val="9C642C76"/>
@@ -5881,7 +7371,343 @@
       </w:pPr>
     </w:lvl>
   </w:abstractNum>
-  <w:abstractNum w:abstractNumId="3" w15:restartNumberingAfterBreak="0">
+  <w:abstractNum w:abstractNumId="4" w15:restartNumberingAfterBreak="0">
+    <w:nsid w:val="354311AF"/>
+    <w:multiLevelType w:val="hybridMultilevel"/>
+    <w:tmpl w:val="16869AEA"/>
+    <w:lvl w:ilvl="0" w:tplc="BD70209A">
+      <w:numFmt w:val="bullet"/>
+      <w:lvlText w:val="-"/>
+      <w:lvlJc w:val="left"/>
+      <w:pPr>
+        <w:ind w:left="1668" w:hanging="360"/>
+      </w:pPr>
+      <w:rPr>
+        <w:rFonts w:ascii="Amasis MT Pro" w:eastAsiaTheme="minorHAnsi" w:hAnsi="Amasis MT Pro" w:cstheme="minorBidi" w:hint="default"/>
+      </w:rPr>
+    </w:lvl>
+    <w:lvl w:ilvl="1" w:tplc="04100003" w:tentative="1">
+      <w:start w:val="1"/>
+      <w:numFmt w:val="bullet"/>
+      <w:lvlText w:val="o"/>
+      <w:lvlJc w:val="left"/>
+      <w:pPr>
+        <w:ind w:left="2388" w:hanging="360"/>
+      </w:pPr>
+      <w:rPr>
+        <w:rFonts w:ascii="Courier New" w:hAnsi="Courier New" w:cs="Courier New" w:hint="default"/>
+      </w:rPr>
+    </w:lvl>
+    <w:lvl w:ilvl="2" w:tplc="04100005" w:tentative="1">
+      <w:start w:val="1"/>
+      <w:numFmt w:val="bullet"/>
+      <w:lvlText w:val=""/>
+      <w:lvlJc w:val="left"/>
+      <w:pPr>
+        <w:ind w:left="3108" w:hanging="360"/>
+      </w:pPr>
+      <w:rPr>
+        <w:rFonts w:ascii="Wingdings" w:hAnsi="Wingdings" w:hint="default"/>
+      </w:rPr>
+    </w:lvl>
+    <w:lvl w:ilvl="3" w:tplc="04100001" w:tentative="1">
+      <w:start w:val="1"/>
+      <w:numFmt w:val="bullet"/>
+      <w:lvlText w:val=""/>
+      <w:lvlJc w:val="left"/>
+      <w:pPr>
+        <w:ind w:left="3828" w:hanging="360"/>
+      </w:pPr>
+      <w:rPr>
+        <w:rFonts w:ascii="Symbol" w:hAnsi="Symbol" w:hint="default"/>
+      </w:rPr>
+    </w:lvl>
+    <w:lvl w:ilvl="4" w:tplc="04100003" w:tentative="1">
+      <w:start w:val="1"/>
+      <w:numFmt w:val="bullet"/>
+      <w:lvlText w:val="o"/>
+      <w:lvlJc w:val="left"/>
+      <w:pPr>
+        <w:ind w:left="4548" w:hanging="360"/>
+      </w:pPr>
+      <w:rPr>
+        <w:rFonts w:ascii="Courier New" w:hAnsi="Courier New" w:cs="Courier New" w:hint="default"/>
+      </w:rPr>
+    </w:lvl>
+    <w:lvl w:ilvl="5" w:tplc="04100005" w:tentative="1">
+      <w:start w:val="1"/>
+      <w:numFmt w:val="bullet"/>
+      <w:lvlText w:val=""/>
+      <w:lvlJc w:val="left"/>
+      <w:pPr>
+        <w:ind w:left="5268" w:hanging="360"/>
+      </w:pPr>
+      <w:rPr>
+        <w:rFonts w:ascii="Wingdings" w:hAnsi="Wingdings" w:hint="default"/>
+      </w:rPr>
+    </w:lvl>
+    <w:lvl w:ilvl="6" w:tplc="04100001" w:tentative="1">
+      <w:start w:val="1"/>
+      <w:numFmt w:val="bullet"/>
+      <w:lvlText w:val=""/>
+      <w:lvlJc w:val="left"/>
+      <w:pPr>
+        <w:ind w:left="5988" w:hanging="360"/>
+      </w:pPr>
+      <w:rPr>
+        <w:rFonts w:ascii="Symbol" w:hAnsi="Symbol" w:hint="default"/>
+      </w:rPr>
+    </w:lvl>
+    <w:lvl w:ilvl="7" w:tplc="04100003" w:tentative="1">
+      <w:start w:val="1"/>
+      <w:numFmt w:val="bullet"/>
+      <w:lvlText w:val="o"/>
+      <w:lvlJc w:val="left"/>
+      <w:pPr>
+        <w:ind w:left="6708" w:hanging="360"/>
+      </w:pPr>
+      <w:rPr>
+        <w:rFonts w:ascii="Courier New" w:hAnsi="Courier New" w:cs="Courier New" w:hint="default"/>
+      </w:rPr>
+    </w:lvl>
+    <w:lvl w:ilvl="8" w:tplc="04100005" w:tentative="1">
+      <w:start w:val="1"/>
+      <w:numFmt w:val="bullet"/>
+      <w:lvlText w:val=""/>
+      <w:lvlJc w:val="left"/>
+      <w:pPr>
+        <w:ind w:left="7428" w:hanging="360"/>
+      </w:pPr>
+      <w:rPr>
+        <w:rFonts w:ascii="Wingdings" w:hAnsi="Wingdings" w:hint="default"/>
+      </w:rPr>
+    </w:lvl>
+  </w:abstractNum>
+  <w:abstractNum w:abstractNumId="5" w15:restartNumberingAfterBreak="0">
+    <w:nsid w:val="38E26D67"/>
+    <w:multiLevelType w:val="hybridMultilevel"/>
+    <w:tmpl w:val="B9A8E6BC"/>
+    <w:lvl w:ilvl="0" w:tplc="76CCFC5A">
+      <w:numFmt w:val="bullet"/>
+      <w:lvlText w:val="-"/>
+      <w:lvlJc w:val="left"/>
+      <w:pPr>
+        <w:ind w:left="1080" w:hanging="360"/>
+      </w:pPr>
+      <w:rPr>
+        <w:rFonts w:ascii="Amasis MT Pro" w:eastAsiaTheme="minorHAnsi" w:hAnsi="Amasis MT Pro" w:cstheme="minorBidi" w:hint="default"/>
+      </w:rPr>
+    </w:lvl>
+    <w:lvl w:ilvl="1" w:tplc="04100003" w:tentative="1">
+      <w:start w:val="1"/>
+      <w:numFmt w:val="bullet"/>
+      <w:lvlText w:val="o"/>
+      <w:lvlJc w:val="left"/>
+      <w:pPr>
+        <w:ind w:left="1800" w:hanging="360"/>
+      </w:pPr>
+      <w:rPr>
+        <w:rFonts w:ascii="Courier New" w:hAnsi="Courier New" w:cs="Courier New" w:hint="default"/>
+      </w:rPr>
+    </w:lvl>
+    <w:lvl w:ilvl="2" w:tplc="04100005" w:tentative="1">
+      <w:start w:val="1"/>
+      <w:numFmt w:val="bullet"/>
+      <w:lvlText w:val=""/>
+      <w:lvlJc w:val="left"/>
+      <w:pPr>
+        <w:ind w:left="2520" w:hanging="360"/>
+      </w:pPr>
+      <w:rPr>
+        <w:rFonts w:ascii="Wingdings" w:hAnsi="Wingdings" w:hint="default"/>
+      </w:rPr>
+    </w:lvl>
+    <w:lvl w:ilvl="3" w:tplc="04100001" w:tentative="1">
+      <w:start w:val="1"/>
+      <w:numFmt w:val="bullet"/>
+      <w:lvlText w:val=""/>
+      <w:lvlJc w:val="left"/>
+      <w:pPr>
+        <w:ind w:left="3240" w:hanging="360"/>
+      </w:pPr>
+      <w:rPr>
+        <w:rFonts w:ascii="Symbol" w:hAnsi="Symbol" w:hint="default"/>
+      </w:rPr>
+    </w:lvl>
+    <w:lvl w:ilvl="4" w:tplc="04100003" w:tentative="1">
+      <w:start w:val="1"/>
+      <w:numFmt w:val="bullet"/>
+      <w:lvlText w:val="o"/>
+      <w:lvlJc w:val="left"/>
+      <w:pPr>
+        <w:ind w:left="3960" w:hanging="360"/>
+      </w:pPr>
+      <w:rPr>
+        <w:rFonts w:ascii="Courier New" w:hAnsi="Courier New" w:cs="Courier New" w:hint="default"/>
+      </w:rPr>
+    </w:lvl>
+    <w:lvl w:ilvl="5" w:tplc="04100005" w:tentative="1">
+      <w:start w:val="1"/>
+      <w:numFmt w:val="bullet"/>
+      <w:lvlText w:val=""/>
+      <w:lvlJc w:val="left"/>
+      <w:pPr>
+        <w:ind w:left="4680" w:hanging="360"/>
+      </w:pPr>
+      <w:rPr>
+        <w:rFonts w:ascii="Wingdings" w:hAnsi="Wingdings" w:hint="default"/>
+      </w:rPr>
+    </w:lvl>
+    <w:lvl w:ilvl="6" w:tplc="04100001" w:tentative="1">
+      <w:start w:val="1"/>
+      <w:numFmt w:val="bullet"/>
+      <w:lvlText w:val=""/>
+      <w:lvlJc w:val="left"/>
+      <w:pPr>
+        <w:ind w:left="5400" w:hanging="360"/>
+      </w:pPr>
+      <w:rPr>
+        <w:rFonts w:ascii="Symbol" w:hAnsi="Symbol" w:hint="default"/>
+      </w:rPr>
+    </w:lvl>
+    <w:lvl w:ilvl="7" w:tplc="04100003" w:tentative="1">
+      <w:start w:val="1"/>
+      <w:numFmt w:val="bullet"/>
+      <w:lvlText w:val="o"/>
+      <w:lvlJc w:val="left"/>
+      <w:pPr>
+        <w:ind w:left="6120" w:hanging="360"/>
+      </w:pPr>
+      <w:rPr>
+        <w:rFonts w:ascii="Courier New" w:hAnsi="Courier New" w:cs="Courier New" w:hint="default"/>
+      </w:rPr>
+    </w:lvl>
+    <w:lvl w:ilvl="8" w:tplc="04100005" w:tentative="1">
+      <w:start w:val="1"/>
+      <w:numFmt w:val="bullet"/>
+      <w:lvlText w:val=""/>
+      <w:lvlJc w:val="left"/>
+      <w:pPr>
+        <w:ind w:left="6840" w:hanging="360"/>
+      </w:pPr>
+      <w:rPr>
+        <w:rFonts w:ascii="Wingdings" w:hAnsi="Wingdings" w:hint="default"/>
+      </w:rPr>
+    </w:lvl>
+  </w:abstractNum>
+  <w:abstractNum w:abstractNumId="6" w15:restartNumberingAfterBreak="0">
+    <w:nsid w:val="3E615EE3"/>
+    <w:multiLevelType w:val="hybridMultilevel"/>
+    <w:tmpl w:val="6C349CAC"/>
+    <w:lvl w:ilvl="0" w:tplc="48E29840">
+      <w:numFmt w:val="bullet"/>
+      <w:lvlText w:val="-"/>
+      <w:lvlJc w:val="left"/>
+      <w:pPr>
+        <w:ind w:left="1308" w:hanging="360"/>
+      </w:pPr>
+      <w:rPr>
+        <w:rFonts w:ascii="Amasis MT Pro" w:eastAsiaTheme="minorHAnsi" w:hAnsi="Amasis MT Pro" w:cstheme="minorBidi" w:hint="default"/>
+      </w:rPr>
+    </w:lvl>
+    <w:lvl w:ilvl="1" w:tplc="04100003" w:tentative="1">
+      <w:start w:val="1"/>
+      <w:numFmt w:val="bullet"/>
+      <w:lvlText w:val="o"/>
+      <w:lvlJc w:val="left"/>
+      <w:pPr>
+        <w:ind w:left="2028" w:hanging="360"/>
+      </w:pPr>
+      <w:rPr>
+        <w:rFonts w:ascii="Courier New" w:hAnsi="Courier New" w:cs="Courier New" w:hint="default"/>
+      </w:rPr>
+    </w:lvl>
+    <w:lvl w:ilvl="2" w:tplc="04100005" w:tentative="1">
+      <w:start w:val="1"/>
+      <w:numFmt w:val="bullet"/>
+      <w:lvlText w:val=""/>
+      <w:lvlJc w:val="left"/>
+      <w:pPr>
+        <w:ind w:left="2748" w:hanging="360"/>
+      </w:pPr>
+      <w:rPr>
+        <w:rFonts w:ascii="Wingdings" w:hAnsi="Wingdings" w:hint="default"/>
+      </w:rPr>
+    </w:lvl>
+    <w:lvl w:ilvl="3" w:tplc="04100001" w:tentative="1">
+      <w:start w:val="1"/>
+      <w:numFmt w:val="bullet"/>
+      <w:lvlText w:val=""/>
+      <w:lvlJc w:val="left"/>
+      <w:pPr>
+        <w:ind w:left="3468" w:hanging="360"/>
+      </w:pPr>
+      <w:rPr>
+        <w:rFonts w:ascii="Symbol" w:hAnsi="Symbol" w:hint="default"/>
+      </w:rPr>
+    </w:lvl>
+    <w:lvl w:ilvl="4" w:tplc="04100003" w:tentative="1">
+      <w:start w:val="1"/>
+      <w:numFmt w:val="bullet"/>
+      <w:lvlText w:val="o"/>
+      <w:lvlJc w:val="left"/>
+      <w:pPr>
+        <w:ind w:left="4188" w:hanging="360"/>
+      </w:pPr>
+      <w:rPr>
+        <w:rFonts w:ascii="Courier New" w:hAnsi="Courier New" w:cs="Courier New" w:hint="default"/>
+      </w:rPr>
+    </w:lvl>
+    <w:lvl w:ilvl="5" w:tplc="04100005" w:tentative="1">
+      <w:start w:val="1"/>
+      <w:numFmt w:val="bullet"/>
+      <w:lvlText w:val=""/>
+      <w:lvlJc w:val="left"/>
+      <w:pPr>
+        <w:ind w:left="4908" w:hanging="360"/>
+      </w:pPr>
+      <w:rPr>
+        <w:rFonts w:ascii="Wingdings" w:hAnsi="Wingdings" w:hint="default"/>
+      </w:rPr>
+    </w:lvl>
+    <w:lvl w:ilvl="6" w:tplc="04100001" w:tentative="1">
+      <w:start w:val="1"/>
+      <w:numFmt w:val="bullet"/>
+      <w:lvlText w:val=""/>
+      <w:lvlJc w:val="left"/>
+      <w:pPr>
+        <w:ind w:left="5628" w:hanging="360"/>
+      </w:pPr>
+      <w:rPr>
+        <w:rFonts w:ascii="Symbol" w:hAnsi="Symbol" w:hint="default"/>
+      </w:rPr>
+    </w:lvl>
+    <w:lvl w:ilvl="7" w:tplc="04100003" w:tentative="1">
+      <w:start w:val="1"/>
+      <w:numFmt w:val="bullet"/>
+      <w:lvlText w:val="o"/>
+      <w:lvlJc w:val="left"/>
+      <w:pPr>
+        <w:ind w:left="6348" w:hanging="360"/>
+      </w:pPr>
+      <w:rPr>
+        <w:rFonts w:ascii="Courier New" w:hAnsi="Courier New" w:cs="Courier New" w:hint="default"/>
+      </w:rPr>
+    </w:lvl>
+    <w:lvl w:ilvl="8" w:tplc="04100005" w:tentative="1">
+      <w:start w:val="1"/>
+      <w:numFmt w:val="bullet"/>
+      <w:lvlText w:val=""/>
+      <w:lvlJc w:val="left"/>
+      <w:pPr>
+        <w:ind w:left="7068" w:hanging="360"/>
+      </w:pPr>
+      <w:rPr>
+        <w:rFonts w:ascii="Wingdings" w:hAnsi="Wingdings" w:hint="default"/>
+      </w:rPr>
+    </w:lvl>
+  </w:abstractNum>
+  <w:abstractNum w:abstractNumId="7" w15:restartNumberingAfterBreak="0">
     <w:nsid w:val="410935BA"/>
     <w:multiLevelType w:val="hybridMultilevel"/>
     <w:tmpl w:val="D01A2556"/>
@@ -5994,7 +7820,231 @@
       </w:rPr>
     </w:lvl>
   </w:abstractNum>
-  <w:abstractNum w:abstractNumId="4" w15:restartNumberingAfterBreak="0">
+  <w:abstractNum w:abstractNumId="8" w15:restartNumberingAfterBreak="0">
+    <w:nsid w:val="5BAD4FBE"/>
+    <w:multiLevelType w:val="hybridMultilevel"/>
+    <w:tmpl w:val="6E82E94C"/>
+    <w:lvl w:ilvl="0" w:tplc="E48E97DC">
+      <w:numFmt w:val="bullet"/>
+      <w:lvlText w:val="-"/>
+      <w:lvlJc w:val="left"/>
+      <w:pPr>
+        <w:ind w:left="720" w:hanging="360"/>
+      </w:pPr>
+      <w:rPr>
+        <w:rFonts w:ascii="Amasis MT Pro" w:eastAsiaTheme="minorHAnsi" w:hAnsi="Amasis MT Pro" w:cstheme="minorBidi" w:hint="default"/>
+      </w:rPr>
+    </w:lvl>
+    <w:lvl w:ilvl="1" w:tplc="04100003" w:tentative="1">
+      <w:start w:val="1"/>
+      <w:numFmt w:val="bullet"/>
+      <w:lvlText w:val="o"/>
+      <w:lvlJc w:val="left"/>
+      <w:pPr>
+        <w:ind w:left="1440" w:hanging="360"/>
+      </w:pPr>
+      <w:rPr>
+        <w:rFonts w:ascii="Courier New" w:hAnsi="Courier New" w:cs="Courier New" w:hint="default"/>
+      </w:rPr>
+    </w:lvl>
+    <w:lvl w:ilvl="2" w:tplc="04100005" w:tentative="1">
+      <w:start w:val="1"/>
+      <w:numFmt w:val="bullet"/>
+      <w:lvlText w:val=""/>
+      <w:lvlJc w:val="left"/>
+      <w:pPr>
+        <w:ind w:left="2160" w:hanging="360"/>
+      </w:pPr>
+      <w:rPr>
+        <w:rFonts w:ascii="Wingdings" w:hAnsi="Wingdings" w:hint="default"/>
+      </w:rPr>
+    </w:lvl>
+    <w:lvl w:ilvl="3" w:tplc="04100001" w:tentative="1">
+      <w:start w:val="1"/>
+      <w:numFmt w:val="bullet"/>
+      <w:lvlText w:val=""/>
+      <w:lvlJc w:val="left"/>
+      <w:pPr>
+        <w:ind w:left="2880" w:hanging="360"/>
+      </w:pPr>
+      <w:rPr>
+        <w:rFonts w:ascii="Symbol" w:hAnsi="Symbol" w:hint="default"/>
+      </w:rPr>
+    </w:lvl>
+    <w:lvl w:ilvl="4" w:tplc="04100003" w:tentative="1">
+      <w:start w:val="1"/>
+      <w:numFmt w:val="bullet"/>
+      <w:lvlText w:val="o"/>
+      <w:lvlJc w:val="left"/>
+      <w:pPr>
+        <w:ind w:left="3600" w:hanging="360"/>
+      </w:pPr>
+      <w:rPr>
+        <w:rFonts w:ascii="Courier New" w:hAnsi="Courier New" w:cs="Courier New" w:hint="default"/>
+      </w:rPr>
+    </w:lvl>
+    <w:lvl w:ilvl="5" w:tplc="04100005" w:tentative="1">
+      <w:start w:val="1"/>
+      <w:numFmt w:val="bullet"/>
+      <w:lvlText w:val=""/>
+      <w:lvlJc w:val="left"/>
+      <w:pPr>
+        <w:ind w:left="4320" w:hanging="360"/>
+      </w:pPr>
+      <w:rPr>
+        <w:rFonts w:ascii="Wingdings" w:hAnsi="Wingdings" w:hint="default"/>
+      </w:rPr>
+    </w:lvl>
+    <w:lvl w:ilvl="6" w:tplc="04100001" w:tentative="1">
+      <w:start w:val="1"/>
+      <w:numFmt w:val="bullet"/>
+      <w:lvlText w:val=""/>
+      <w:lvlJc w:val="left"/>
+      <w:pPr>
+        <w:ind w:left="5040" w:hanging="360"/>
+      </w:pPr>
+      <w:rPr>
+        <w:rFonts w:ascii="Symbol" w:hAnsi="Symbol" w:hint="default"/>
+      </w:rPr>
+    </w:lvl>
+    <w:lvl w:ilvl="7" w:tplc="04100003" w:tentative="1">
+      <w:start w:val="1"/>
+      <w:numFmt w:val="bullet"/>
+      <w:lvlText w:val="o"/>
+      <w:lvlJc w:val="left"/>
+      <w:pPr>
+        <w:ind w:left="5760" w:hanging="360"/>
+      </w:pPr>
+      <w:rPr>
+        <w:rFonts w:ascii="Courier New" w:hAnsi="Courier New" w:cs="Courier New" w:hint="default"/>
+      </w:rPr>
+    </w:lvl>
+    <w:lvl w:ilvl="8" w:tplc="04100005" w:tentative="1">
+      <w:start w:val="1"/>
+      <w:numFmt w:val="bullet"/>
+      <w:lvlText w:val=""/>
+      <w:lvlJc w:val="left"/>
+      <w:pPr>
+        <w:ind w:left="6480" w:hanging="360"/>
+      </w:pPr>
+      <w:rPr>
+        <w:rFonts w:ascii="Wingdings" w:hAnsi="Wingdings" w:hint="default"/>
+      </w:rPr>
+    </w:lvl>
+  </w:abstractNum>
+  <w:abstractNum w:abstractNumId="9" w15:restartNumberingAfterBreak="0">
+    <w:nsid w:val="5F9D4318"/>
+    <w:multiLevelType w:val="hybridMultilevel"/>
+    <w:tmpl w:val="5DF281E0"/>
+    <w:lvl w:ilvl="0" w:tplc="23B2B2E4">
+      <w:numFmt w:val="bullet"/>
+      <w:lvlText w:val="-"/>
+      <w:lvlJc w:val="left"/>
+      <w:pPr>
+        <w:ind w:left="1668" w:hanging="360"/>
+      </w:pPr>
+      <w:rPr>
+        <w:rFonts w:ascii="Amasis MT Pro" w:eastAsiaTheme="minorHAnsi" w:hAnsi="Amasis MT Pro" w:cstheme="minorBidi" w:hint="default"/>
+      </w:rPr>
+    </w:lvl>
+    <w:lvl w:ilvl="1" w:tplc="04100003" w:tentative="1">
+      <w:start w:val="1"/>
+      <w:numFmt w:val="bullet"/>
+      <w:lvlText w:val="o"/>
+      <w:lvlJc w:val="left"/>
+      <w:pPr>
+        <w:ind w:left="2388" w:hanging="360"/>
+      </w:pPr>
+      <w:rPr>
+        <w:rFonts w:ascii="Courier New" w:hAnsi="Courier New" w:cs="Courier New" w:hint="default"/>
+      </w:rPr>
+    </w:lvl>
+    <w:lvl w:ilvl="2" w:tplc="04100005" w:tentative="1">
+      <w:start w:val="1"/>
+      <w:numFmt w:val="bullet"/>
+      <w:lvlText w:val=""/>
+      <w:lvlJc w:val="left"/>
+      <w:pPr>
+        <w:ind w:left="3108" w:hanging="360"/>
+      </w:pPr>
+      <w:rPr>
+        <w:rFonts w:ascii="Wingdings" w:hAnsi="Wingdings" w:hint="default"/>
+      </w:rPr>
+    </w:lvl>
+    <w:lvl w:ilvl="3" w:tplc="04100001" w:tentative="1">
+      <w:start w:val="1"/>
+      <w:numFmt w:val="bullet"/>
+      <w:lvlText w:val=""/>
+      <w:lvlJc w:val="left"/>
+      <w:pPr>
+        <w:ind w:left="3828" w:hanging="360"/>
+      </w:pPr>
+      <w:rPr>
+        <w:rFonts w:ascii="Symbol" w:hAnsi="Symbol" w:hint="default"/>
+      </w:rPr>
+    </w:lvl>
+    <w:lvl w:ilvl="4" w:tplc="04100003" w:tentative="1">
+      <w:start w:val="1"/>
+      <w:numFmt w:val="bullet"/>
+      <w:lvlText w:val="o"/>
+      <w:lvlJc w:val="left"/>
+      <w:pPr>
+        <w:ind w:left="4548" w:hanging="360"/>
+      </w:pPr>
+      <w:rPr>
+        <w:rFonts w:ascii="Courier New" w:hAnsi="Courier New" w:cs="Courier New" w:hint="default"/>
+      </w:rPr>
+    </w:lvl>
+    <w:lvl w:ilvl="5" w:tplc="04100005" w:tentative="1">
+      <w:start w:val="1"/>
+      <w:numFmt w:val="bullet"/>
+      <w:lvlText w:val=""/>
+      <w:lvlJc w:val="left"/>
+      <w:pPr>
+        <w:ind w:left="5268" w:hanging="360"/>
+      </w:pPr>
+      <w:rPr>
+        <w:rFonts w:ascii="Wingdings" w:hAnsi="Wingdings" w:hint="default"/>
+      </w:rPr>
+    </w:lvl>
+    <w:lvl w:ilvl="6" w:tplc="04100001" w:tentative="1">
+      <w:start w:val="1"/>
+      <w:numFmt w:val="bullet"/>
+      <w:lvlText w:val=""/>
+      <w:lvlJc w:val="left"/>
+      <w:pPr>
+        <w:ind w:left="5988" w:hanging="360"/>
+      </w:pPr>
+      <w:rPr>
+        <w:rFonts w:ascii="Symbol" w:hAnsi="Symbol" w:hint="default"/>
+      </w:rPr>
+    </w:lvl>
+    <w:lvl w:ilvl="7" w:tplc="04100003" w:tentative="1">
+      <w:start w:val="1"/>
+      <w:numFmt w:val="bullet"/>
+      <w:lvlText w:val="o"/>
+      <w:lvlJc w:val="left"/>
+      <w:pPr>
+        <w:ind w:left="6708" w:hanging="360"/>
+      </w:pPr>
+      <w:rPr>
+        <w:rFonts w:ascii="Courier New" w:hAnsi="Courier New" w:cs="Courier New" w:hint="default"/>
+      </w:rPr>
+    </w:lvl>
+    <w:lvl w:ilvl="8" w:tplc="04100005" w:tentative="1">
+      <w:start w:val="1"/>
+      <w:numFmt w:val="bullet"/>
+      <w:lvlText w:val=""/>
+      <w:lvlJc w:val="left"/>
+      <w:pPr>
+        <w:ind w:left="7428" w:hanging="360"/>
+      </w:pPr>
+      <w:rPr>
+        <w:rFonts w:ascii="Wingdings" w:hAnsi="Wingdings" w:hint="default"/>
+      </w:rPr>
+    </w:lvl>
+  </w:abstractNum>
+  <w:abstractNum w:abstractNumId="10" w15:restartNumberingAfterBreak="0">
     <w:nsid w:val="6C0E1B58"/>
     <w:multiLevelType w:val="hybridMultilevel"/>
     <w:tmpl w:val="34622376"/>
@@ -6083,7 +8133,7 @@
       </w:pPr>
     </w:lvl>
   </w:abstractNum>
-  <w:abstractNum w:abstractNumId="5" w15:restartNumberingAfterBreak="0">
+  <w:abstractNum w:abstractNumId="11" w15:restartNumberingAfterBreak="0">
     <w:nsid w:val="790D2A15"/>
     <w:multiLevelType w:val="hybridMultilevel"/>
     <w:tmpl w:val="E56E38C2"/>
@@ -6196,22 +8246,40 @@
     </w:lvl>
   </w:abstractNum>
   <w:num w:numId="1" w16cid:durableId="1769503441">
+    <w:abstractNumId w:val="2"/>
+  </w:num>
+  <w:num w:numId="2" w16cid:durableId="446774039">
+    <w:abstractNumId w:val="10"/>
+  </w:num>
+  <w:num w:numId="3" w16cid:durableId="824903141">
+    <w:abstractNumId w:val="7"/>
+  </w:num>
+  <w:num w:numId="4" w16cid:durableId="1159347542">
+    <w:abstractNumId w:val="3"/>
+  </w:num>
+  <w:num w:numId="5" w16cid:durableId="459571109">
+    <w:abstractNumId w:val="11"/>
+  </w:num>
+  <w:num w:numId="6" w16cid:durableId="993798361">
     <w:abstractNumId w:val="1"/>
   </w:num>
-  <w:num w:numId="2" w16cid:durableId="446774039">
-    <w:abstractNumId w:val="4"/>
+  <w:num w:numId="7" w16cid:durableId="1782645148">
+    <w:abstractNumId w:val="8"/>
   </w:num>
-  <w:num w:numId="3" w16cid:durableId="824903141">
-    <w:abstractNumId w:val="3"/>
-  </w:num>
-  <w:num w:numId="4" w16cid:durableId="1159347542">
-    <w:abstractNumId w:val="2"/>
-  </w:num>
-  <w:num w:numId="5" w16cid:durableId="459571109">
+  <w:num w:numId="8" w16cid:durableId="548759119">
     <w:abstractNumId w:val="5"/>
   </w:num>
-  <w:num w:numId="6" w16cid:durableId="993798361">
+  <w:num w:numId="9" w16cid:durableId="1795249674">
+    <w:abstractNumId w:val="9"/>
+  </w:num>
+  <w:num w:numId="10" w16cid:durableId="791288847">
     <w:abstractNumId w:val="0"/>
+  </w:num>
+  <w:num w:numId="11" w16cid:durableId="1957445449">
+    <w:abstractNumId w:val="6"/>
+  </w:num>
+  <w:num w:numId="12" w16cid:durableId="1573736655">
+    <w:abstractNumId w:val="4"/>
   </w:num>
 </w:numbering>
 </file>

</xml_diff>